<commit_message>
docs: add Taglish scripts to DOST presentation
</commit_message>
<xml_diff>
--- a/THESIS DOCUMENTATION/DOST_Idea_Presentation_Package.docx
+++ b/THESIS DOCUMENTATION/DOST_Idea_Presentation_Package.docx
@@ -40,7 +40,7 @@
       </w:pPr>
       <w:r>
         <w:rPr/>
-        <w:t>Pitch Deck Content, Speaker Guide, Demo Script,</w:t>
+        <w:t>Pitch Deck Content, Per-Slide Taglish Scripts, Demo Guide,</w:t>
         <w:br/>
         <w:t>Budget, Timeline, Panel Q&amp;A, and Checklist</w:t>
       </w:r>
@@ -482,7 +482,128 @@
       </w:pPr>
       <w:r>
         <w:rPr/>
-        <w:t>Good day. We are the Project FALCON Research Group from Fullbright College.</w:t>
+        <w:t>Good day. We are the Project FALCON Research Group from Fullbright College. We are proposing an affordable, solar-powered smart coastal observation buoy designed to provide localized wave information through embedded sensing, edge computing, and a simple monitoring dashboard. We have completed the system concept and software demonstration. We are seeking development support to build, calibrate, and validate the physical prototype in a controlled coastal setting.</w:t>
+      </w:r>
+    </w:p>
+    <w:p>
+      <w:pPr>
+        <w:pStyle w:val="Heading1"/>
+        <w:bidi w:val="0"/>
+        <w:jc w:val="center"/>
+        <w:rPr/>
+      </w:pPr>
+      <w:r>
+        <w:rPr/>
+        <w:t>2. Ten-Slide Pitch Deck</w:t>
+      </w:r>
+    </w:p>
+    <w:p>
+      <w:pPr>
+        <w:pStyle w:val="Heading2"/>
+        <w:numPr>
+          <w:ilvl w:val="0"/>
+          <w:numId w:val="0"/>
+        </w:numPr>
+        <w:pBdr/>
+        <w:bidi w:val="0"/>
+        <w:spacing w:before="400" w:after="120"/>
+        <w:jc w:val="start"/>
+        <w:rPr/>
+      </w:pPr>
+      <w:r>
+        <w:rPr/>
+        <w:t>Slide 1 — Project Title</w:t>
+      </w:r>
+    </w:p>
+    <w:p>
+      <w:pPr>
+        <w:pStyle w:val="BodyText"/>
+        <w:bidi w:val="0"/>
+        <w:spacing w:before="0" w:after="140"/>
+        <w:jc w:val="both"/>
+        <w:rPr/>
+      </w:pPr>
+      <w:r>
+        <w:rPr>
+          <w:rStyle w:val="Strong"/>
+        </w:rPr>
+        <w:t>PROJECT FALCON</w:t>
+      </w:r>
+      <w:r>
+        <w:rPr/>
+        <w:t xml:space="preserve"> Fullbright College's AI-powered Live Coastal Observation Network</w:t>
+      </w:r>
+    </w:p>
+    <w:p>
+      <w:pPr>
+        <w:pStyle w:val="BodyText"/>
+        <w:bidi w:val="0"/>
+        <w:spacing w:before="0" w:after="140"/>
+        <w:jc w:val="both"/>
+        <w:rPr/>
+      </w:pPr>
+      <w:r>
+        <w:rPr>
+          <w:rStyle w:val="Strong"/>
+        </w:rPr>
+        <w:t>One-line description:</w:t>
+      </w:r>
+      <w:r>
+        <w:rPr/>
+        <w:t xml:space="preserve"> An affordable solar-powered coastal buoy for localized wave monitoring, edge data processing, short-horizon prediction research, and buoy health and displacement alerts.</w:t>
+      </w:r>
+    </w:p>
+    <w:p>
+      <w:pPr>
+        <w:pStyle w:val="BodyText"/>
+        <w:bidi w:val="0"/>
+        <w:spacing w:before="0" w:after="140"/>
+        <w:jc w:val="both"/>
+        <w:rPr/>
+      </w:pPr>
+      <w:r>
+        <w:rPr>
+          <w:rStyle w:val="Strong"/>
+        </w:rPr>
+        <w:t>Visuals:</w:t>
+      </w:r>
+      <w:r>
+        <w:rPr/>
+        <w:t xml:space="preserve"> Project logo, clean buoy render, and one dashboard screenshot.</w:t>
+      </w:r>
+    </w:p>
+    <w:p>
+      <w:pPr>
+        <w:pStyle w:val="BodyText"/>
+        <w:bidi w:val="0"/>
+        <w:spacing w:before="0" w:after="140"/>
+        <w:jc w:val="both"/>
+        <w:rPr/>
+      </w:pPr>
+      <w:r>
+        <w:rPr>
+          <w:rStyle w:val="Strong"/>
+        </w:rPr>
+        <w:t>Speaker note:</w:t>
+      </w:r>
+      <w:r>
+        <w:rPr/>
+        <w:t xml:space="preserve"> Introduce the team, school, project name, and the single problem the proposal addresses. Avoid starting with component specifications.</w:t>
+      </w:r>
+    </w:p>
+    <w:p>
+      <w:pPr>
+        <w:pStyle w:val="BodyText"/>
+        <w:bidi w:val="0"/>
+        <w:spacing w:before="0" w:after="140"/>
+        <w:jc w:val="both"/>
+        <w:rPr/>
+      </w:pPr>
+      <w:r>
+        <w:rPr>
+          <w:rStyle w:val="Strong"/>
+        </w:rPr>
+        <w:t>Taglish presentation script:</w:t>
       </w:r>
     </w:p>
     <w:p>
@@ -499,7 +620,173 @@
       </w:pPr>
       <w:r>
         <w:rPr/>
-        <w:t>We are proposing an affordable, solar-powered smart coastal observation buoy</w:t>
+        <w:t>Magandang araw po. Kami po ang Project FALCON Research Group mula sa Fullbright College. Ang FALCON ay nangangahulugang Fullbright College's AI-powered Live Coastal Observation Network. Ang proposal namin ay isang affordable at solar-powered smart coastal buoy na ginawa para sa localized wave monitoring. Layunin nitong mangolekta ng coastal data, ipakita ito sa isang madaling maintindihang dashboard, at magsilbing research platform para sa short-term wave prediction at system protection. Sa presentation na ito, ipapakita namin ang problemang gusto naming tugunan, paano gagana ang system, ano na ang nagawa namin, at ano ang kailangan upang mabuo at ma-validate ang physical prototype.</w:t>
+      </w:r>
+    </w:p>
+    <w:p>
+      <w:pPr>
+        <w:pStyle w:val="Heading2"/>
+        <w:numPr>
+          <w:ilvl w:val="0"/>
+          <w:numId w:val="0"/>
+        </w:numPr>
+        <w:pBdr/>
+        <w:bidi w:val="0"/>
+        <w:spacing w:before="400" w:after="120"/>
+        <w:jc w:val="start"/>
+        <w:rPr/>
+      </w:pPr>
+      <w:r>
+        <w:rPr/>
+        <w:t>Slide 2 — The Problem</w:t>
+      </w:r>
+    </w:p>
+    <w:p>
+      <w:pPr>
+        <w:pStyle w:val="BodyText"/>
+        <w:numPr>
+          <w:ilvl w:val="0"/>
+          <w:numId w:val="2"/>
+        </w:numPr>
+        <w:tabs>
+          <w:tab w:val="clear" w:pos="1134"/>
+          <w:tab w:val="left" w:pos="709" w:leader="none"/>
+        </w:tabs>
+        <w:bidi w:val="0"/>
+        <w:spacing w:before="0" w:after="0"/>
+        <w:ind w:hanging="283" w:start="709"/>
+        <w:rPr/>
+      </w:pPr>
+      <w:r>
+        <w:rPr/>
+        <w:t xml:space="preserve">Coastal decisions benefit from timely and location-specific sea-condition data. </w:t>
+      </w:r>
+    </w:p>
+    <w:p>
+      <w:pPr>
+        <w:pStyle w:val="BodyText"/>
+        <w:numPr>
+          <w:ilvl w:val="0"/>
+          <w:numId w:val="2"/>
+        </w:numPr>
+        <w:tabs>
+          <w:tab w:val="clear" w:pos="1134"/>
+          <w:tab w:val="left" w:pos="709" w:leader="none"/>
+        </w:tabs>
+        <w:bidi w:val="0"/>
+        <w:ind w:hanging="283" w:start="709"/>
+        <w:rPr/>
+      </w:pPr>
+      <w:r>
+        <w:rPr/>
+        <w:t xml:space="preserve">Professional oceanographic systems can be difficult for small institutions to </w:t>
+      </w:r>
+    </w:p>
+    <w:p>
+      <w:pPr>
+        <w:pStyle w:val="BodyText"/>
+        <w:numPr>
+          <w:ilvl w:val="0"/>
+          <w:numId w:val="0"/>
+        </w:numPr>
+        <w:bidi w:val="0"/>
+        <w:ind w:hanging="0" w:start="0"/>
+        <w:rPr/>
+      </w:pPr>
+      <w:r>
+        <w:rPr/>
+        <w:t>acquire, operate, and maintain.</w:t>
+      </w:r>
+    </w:p>
+    <w:p>
+      <w:pPr>
+        <w:pStyle w:val="BodyText"/>
+        <w:numPr>
+          <w:ilvl w:val="0"/>
+          <w:numId w:val="2"/>
+        </w:numPr>
+        <w:tabs>
+          <w:tab w:val="clear" w:pos="1134"/>
+          <w:tab w:val="left" w:pos="709" w:leader="none"/>
+        </w:tabs>
+        <w:bidi w:val="0"/>
+        <w:spacing w:before="0" w:after="0"/>
+        <w:ind w:hanging="283" w:start="709"/>
+        <w:rPr/>
+      </w:pPr>
+      <w:r>
+        <w:rPr/>
+        <w:t xml:space="preserve">Generic forecasts may not represent conditions at a specific near-shore site. </w:t>
+      </w:r>
+    </w:p>
+    <w:p>
+      <w:pPr>
+        <w:pStyle w:val="BodyText"/>
+        <w:numPr>
+          <w:ilvl w:val="0"/>
+          <w:numId w:val="2"/>
+        </w:numPr>
+        <w:tabs>
+          <w:tab w:val="clear" w:pos="1134"/>
+          <w:tab w:val="left" w:pos="709" w:leader="none"/>
+        </w:tabs>
+        <w:bidi w:val="0"/>
+        <w:ind w:hanging="283" w:start="709"/>
+        <w:rPr/>
+      </w:pPr>
+      <w:r>
+        <w:rPr/>
+        <w:t xml:space="preserve">Connectivity, energy, maintenance, and equipment security complicate continuous </w:t>
+      </w:r>
+    </w:p>
+    <w:p>
+      <w:pPr>
+        <w:pStyle w:val="BodyText"/>
+        <w:numPr>
+          <w:ilvl w:val="0"/>
+          <w:numId w:val="0"/>
+        </w:numPr>
+        <w:bidi w:val="0"/>
+        <w:ind w:hanging="0" w:start="0"/>
+        <w:rPr/>
+      </w:pPr>
+      <w:r>
+        <w:rPr/>
+        <w:t>coastal monitoring.</w:t>
+      </w:r>
+    </w:p>
+    <w:p>
+      <w:pPr>
+        <w:pStyle w:val="BodyText"/>
+        <w:bidi w:val="0"/>
+        <w:spacing w:before="0" w:after="140"/>
+        <w:jc w:val="both"/>
+        <w:rPr/>
+      </w:pPr>
+      <w:r>
+        <w:rPr>
+          <w:rStyle w:val="Strong"/>
+        </w:rPr>
+        <w:t>Speaker note:</w:t>
+      </w:r>
+      <w:r>
+        <w:rPr/>
+        <w:t xml:space="preserve"> Connect the problem to a specific intended Palawan user or pilot site once stakeholder confirmation is available. Do not claim that no monitoring exists; state that affordable localized access is limited for the intended user.</w:t>
+      </w:r>
+    </w:p>
+    <w:p>
+      <w:pPr>
+        <w:pStyle w:val="BodyText"/>
+        <w:bidi w:val="0"/>
+        <w:spacing w:before="0" w:after="140"/>
+        <w:jc w:val="both"/>
+        <w:rPr/>
+      </w:pPr>
+      <w:r>
+        <w:rPr>
+          <w:rStyle w:val="Strong"/>
+        </w:rPr>
+        <w:t>Taglish presentation script:</w:t>
       </w:r>
     </w:p>
     <w:p>
@@ -516,7 +803,218 @@
       </w:pPr>
       <w:r>
         <w:rPr/>
-        <w:t>designed to provide localized wave information through embedded sensing, edge</w:t>
+        <w:t>Ang pangunahing problemang nakita namin ay ang limitadong access sa affordable at location-specific coastal information. May mga official forecast at professional monitoring systems na po, pero maaaring maging mahal at mahirap i-deploy o i-maintain ang specialized equipment para sa maliit na institution o local coastal group. Maaari ring magkaiba ang actual near-shore condition sa isang specific location kumpara sa mas malawak na forecast area. Bukod dito, kailangan ding solusyunan ang intermittent connectivity, limited power, maintenance, at possibility ng abnormal displacement o pagkawala ng buoy. Hindi po namin sinasabing walang existing monitoring; ang target gap namin ay affordable at localized observation para sa intended pilot user.</w:t>
+      </w:r>
+    </w:p>
+    <w:p>
+      <w:pPr>
+        <w:pStyle w:val="Heading2"/>
+        <w:numPr>
+          <w:ilvl w:val="0"/>
+          <w:numId w:val="0"/>
+        </w:numPr>
+        <w:pBdr/>
+        <w:bidi w:val="0"/>
+        <w:spacing w:before="400" w:after="120"/>
+        <w:jc w:val="start"/>
+        <w:rPr/>
+      </w:pPr>
+      <w:r>
+        <w:rPr/>
+        <w:t>Slide 3 — Proposed Solution</w:t>
+      </w:r>
+    </w:p>
+    <w:p>
+      <w:pPr>
+        <w:pStyle w:val="BodyText"/>
+        <w:bidi w:val="0"/>
+        <w:spacing w:before="0" w:after="140"/>
+        <w:jc w:val="both"/>
+        <w:rPr/>
+      </w:pPr>
+      <w:r>
+        <w:rPr/>
+        <w:t>Project FALCON combines:</w:t>
+      </w:r>
+    </w:p>
+    <w:p>
+      <w:pPr>
+        <w:pStyle w:val="BodyText"/>
+        <w:numPr>
+          <w:ilvl w:val="0"/>
+          <w:numId w:val="3"/>
+        </w:numPr>
+        <w:tabs>
+          <w:tab w:val="clear" w:pos="1134"/>
+          <w:tab w:val="left" w:pos="709" w:leader="none"/>
+        </w:tabs>
+        <w:bidi w:val="0"/>
+        <w:spacing w:before="0" w:after="0"/>
+        <w:ind w:hanging="283" w:start="709"/>
+        <w:rPr/>
+      </w:pPr>
+      <w:r>
+        <w:rPr/>
+        <w:t xml:space="preserve">wave-related sensors and system-health monitors; </w:t>
+      </w:r>
+    </w:p>
+    <w:p>
+      <w:pPr>
+        <w:pStyle w:val="BodyText"/>
+        <w:numPr>
+          <w:ilvl w:val="0"/>
+          <w:numId w:val="3"/>
+        </w:numPr>
+        <w:tabs>
+          <w:tab w:val="clear" w:pos="1134"/>
+          <w:tab w:val="left" w:pos="709" w:leader="none"/>
+        </w:tabs>
+        <w:bidi w:val="0"/>
+        <w:spacing w:before="0" w:after="0"/>
+        <w:ind w:hanging="283" w:start="709"/>
+        <w:rPr/>
+      </w:pPr>
+      <w:r>
+        <w:rPr/>
+        <w:t xml:space="preserve">an ESP32 for reliable sensor acquisition and diagnostics; </w:t>
+      </w:r>
+    </w:p>
+    <w:p>
+      <w:pPr>
+        <w:pStyle w:val="BodyText"/>
+        <w:numPr>
+          <w:ilvl w:val="0"/>
+          <w:numId w:val="3"/>
+        </w:numPr>
+        <w:tabs>
+          <w:tab w:val="clear" w:pos="1134"/>
+          <w:tab w:val="left" w:pos="709" w:leader="none"/>
+        </w:tabs>
+        <w:bidi w:val="0"/>
+        <w:spacing w:before="0" w:after="0"/>
+        <w:ind w:hanging="283" w:start="709"/>
+        <w:rPr/>
+      </w:pPr>
+      <w:r>
+        <w:rPr/>
+        <w:t xml:space="preserve">an Orange Pi Zero 3 for local storage, processing, API, and model inference; </w:t>
+      </w:r>
+    </w:p>
+    <w:p>
+      <w:pPr>
+        <w:pStyle w:val="BodyText"/>
+        <w:numPr>
+          <w:ilvl w:val="0"/>
+          <w:numId w:val="3"/>
+        </w:numPr>
+        <w:tabs>
+          <w:tab w:val="clear" w:pos="1134"/>
+          <w:tab w:val="left" w:pos="709" w:leader="none"/>
+        </w:tabs>
+        <w:bidi w:val="0"/>
+        <w:spacing w:before="0" w:after="0"/>
+        <w:ind w:hanging="283" w:start="709"/>
+        <w:rPr/>
+      </w:pPr>
+      <w:r>
+        <w:rPr/>
+        <w:t xml:space="preserve">solar power with battery storage; </w:t>
+      </w:r>
+    </w:p>
+    <w:p>
+      <w:pPr>
+        <w:pStyle w:val="BodyText"/>
+        <w:numPr>
+          <w:ilvl w:val="0"/>
+          <w:numId w:val="3"/>
+        </w:numPr>
+        <w:tabs>
+          <w:tab w:val="clear" w:pos="1134"/>
+          <w:tab w:val="left" w:pos="709" w:leader="none"/>
+        </w:tabs>
+        <w:bidi w:val="0"/>
+        <w:spacing w:before="0" w:after="0"/>
+        <w:ind w:hanging="283" w:start="709"/>
+        <w:rPr/>
+      </w:pPr>
+      <w:r>
+        <w:rPr/>
+        <w:t xml:space="preserve">a responsive local dashboard; </w:t>
+      </w:r>
+    </w:p>
+    <w:p>
+      <w:pPr>
+        <w:pStyle w:val="BodyText"/>
+        <w:numPr>
+          <w:ilvl w:val="0"/>
+          <w:numId w:val="3"/>
+        </w:numPr>
+        <w:tabs>
+          <w:tab w:val="clear" w:pos="1134"/>
+          <w:tab w:val="left" w:pos="709" w:leader="none"/>
+        </w:tabs>
+        <w:bidi w:val="0"/>
+        <w:spacing w:before="0" w:after="0"/>
+        <w:ind w:hanging="283" w:start="709"/>
+        <w:rPr/>
+      </w:pPr>
+      <w:r>
+        <w:rPr/>
+        <w:t xml:space="preserve">offline buffering for intermittent connectivity; and </w:t>
+      </w:r>
+    </w:p>
+    <w:p>
+      <w:pPr>
+        <w:pStyle w:val="BodyText"/>
+        <w:numPr>
+          <w:ilvl w:val="0"/>
+          <w:numId w:val="3"/>
+        </w:numPr>
+        <w:tabs>
+          <w:tab w:val="clear" w:pos="1134"/>
+          <w:tab w:val="left" w:pos="709" w:leader="none"/>
+        </w:tabs>
+        <w:bidi w:val="0"/>
+        <w:ind w:hanging="283" w:start="709"/>
+        <w:rPr/>
+      </w:pPr>
+      <w:r>
+        <w:rPr/>
+        <w:t xml:space="preserve">GPS/IMU-assisted abnormal-displacement alerts. </w:t>
+      </w:r>
+    </w:p>
+    <w:p>
+      <w:pPr>
+        <w:pStyle w:val="BodyText"/>
+        <w:bidi w:val="0"/>
+        <w:spacing w:before="0" w:after="140"/>
+        <w:jc w:val="both"/>
+        <w:rPr/>
+      </w:pPr>
+      <w:r>
+        <w:rPr>
+          <w:rStyle w:val="Strong"/>
+        </w:rPr>
+        <w:t>Speaker note:</w:t>
+      </w:r>
+      <w:r>
+        <w:rPr/>
+        <w:t xml:space="preserve"> Explain the system in plain language: measure, validate, store, analyze, display, and alert.</w:t>
+      </w:r>
+    </w:p>
+    <w:p>
+      <w:pPr>
+        <w:pStyle w:val="BodyText"/>
+        <w:bidi w:val="0"/>
+        <w:spacing w:before="0" w:after="140"/>
+        <w:jc w:val="both"/>
+        <w:rPr/>
+      </w:pPr>
+      <w:r>
+        <w:rPr>
+          <w:rStyle w:val="Strong"/>
+        </w:rPr>
+        <w:t>Taglish presentation script:</w:t>
       </w:r>
     </w:p>
     <w:p>
@@ -533,7 +1031,288 @@
       </w:pPr>
       <w:r>
         <w:rPr/>
-        <w:t>computing, and a simple monitoring dashboard. We have completed the system</w:t>
+        <w:t>Ang proposed solution namin ay Project FALCON. May sensors ito para sa buoy motion, water pressure, wind, GPS position, power, at system health. Ang ESP32 ang regular na kumukuha at nagva-validate ng sensor readings. Pagkatapos, ipinapasa ang data sa Orange Pi Zero 3, na siyang magse-save ng records, magpapatakbo ng local services, at eventually ng validated prediction model. Makikita ng user ang information sa responsive dashboard gamit ang laptop, tablet, o phone. Solar-powered din ang design at may local data buffering para hindi agad mawala ang observations kapag mahina o walang Internet. May proposed GPS at IMU logic din para matukoy ang abnormal movement ng buoy.</w:t>
+      </w:r>
+    </w:p>
+    <w:p>
+      <w:pPr>
+        <w:pStyle w:val="Heading2"/>
+        <w:numPr>
+          <w:ilvl w:val="0"/>
+          <w:numId w:val="0"/>
+        </w:numPr>
+        <w:pBdr/>
+        <w:bidi w:val="0"/>
+        <w:spacing w:before="400" w:after="120"/>
+        <w:jc w:val="start"/>
+        <w:rPr/>
+      </w:pPr>
+      <w:r>
+        <w:rPr/>
+        <w:t>Slide 4 — How It Works</w:t>
+      </w:r>
+    </w:p>
+    <w:p>
+      <w:pPr>
+        <w:pStyle w:val="PreformattedText"/>
+        <w:pBdr/>
+        <w:bidi w:val="0"/>
+        <w:spacing w:before="0" w:after="0"/>
+        <w:jc w:val="start"/>
+        <w:rPr/>
+      </w:pPr>
+      <w:r>
+        <w:rPr/>
+        <w:t>Wave, motion, wind, GPS, power and health sensors</w:t>
+      </w:r>
+    </w:p>
+    <w:p>
+      <w:pPr>
+        <w:pStyle w:val="PreformattedText"/>
+        <w:pBdr/>
+        <w:bidi w:val="0"/>
+        <w:spacing w:before="0" w:after="0"/>
+        <w:jc w:val="start"/>
+        <w:rPr/>
+      </w:pPr>
+      <w:r>
+        <w:rPr/>
+        <w:t xml:space="preserve">                         </w:t>
+      </w:r>
+      <w:r>
+        <w:rPr/>
+        <w:t>|</w:t>
+      </w:r>
+    </w:p>
+    <w:p>
+      <w:pPr>
+        <w:pStyle w:val="PreformattedText"/>
+        <w:pBdr/>
+        <w:bidi w:val="0"/>
+        <w:spacing w:before="0" w:after="0"/>
+        <w:jc w:val="start"/>
+        <w:rPr/>
+      </w:pPr>
+      <w:r>
+        <w:rPr/>
+        <w:t xml:space="preserve">                         </w:t>
+      </w:r>
+      <w:r>
+        <w:rPr/>
+        <w:t>v</w:t>
+      </w:r>
+    </w:p>
+    <w:p>
+      <w:pPr>
+        <w:pStyle w:val="PreformattedText"/>
+        <w:pBdr/>
+        <w:bidi w:val="0"/>
+        <w:spacing w:before="0" w:after="0"/>
+        <w:jc w:val="start"/>
+        <w:rPr/>
+      </w:pPr>
+      <w:r>
+        <w:rPr/>
+        <w:t xml:space="preserve">              </w:t>
+      </w:r>
+      <w:r>
+        <w:rPr/>
+        <w:t>ESP32 acquisition layer</w:t>
+      </w:r>
+    </w:p>
+    <w:p>
+      <w:pPr>
+        <w:pStyle w:val="PreformattedText"/>
+        <w:pBdr/>
+        <w:bidi w:val="0"/>
+        <w:spacing w:before="0" w:after="0"/>
+        <w:jc w:val="start"/>
+        <w:rPr/>
+      </w:pPr>
+      <w:r>
+        <w:rPr/>
+        <w:t xml:space="preserve">                         </w:t>
+      </w:r>
+      <w:r>
+        <w:rPr/>
+        <w:t>|</w:t>
+      </w:r>
+    </w:p>
+    <w:p>
+      <w:pPr>
+        <w:pStyle w:val="PreformattedText"/>
+        <w:pBdr/>
+        <w:bidi w:val="0"/>
+        <w:spacing w:before="0" w:after="0"/>
+        <w:jc w:val="start"/>
+        <w:rPr/>
+      </w:pPr>
+      <w:r>
+        <w:rPr/>
+        <w:t xml:space="preserve">                    </w:t>
+      </w:r>
+      <w:r>
+        <w:rPr/>
+        <w:t>USB / UART</w:t>
+      </w:r>
+    </w:p>
+    <w:p>
+      <w:pPr>
+        <w:pStyle w:val="PreformattedText"/>
+        <w:pBdr/>
+        <w:bidi w:val="0"/>
+        <w:spacing w:before="0" w:after="0"/>
+        <w:jc w:val="start"/>
+        <w:rPr/>
+      </w:pPr>
+      <w:r>
+        <w:rPr/>
+        <w:t xml:space="preserve">                         </w:t>
+      </w:r>
+      <w:r>
+        <w:rPr/>
+        <w:t>v</w:t>
+      </w:r>
+    </w:p>
+    <w:p>
+      <w:pPr>
+        <w:pStyle w:val="PreformattedText"/>
+        <w:pBdr/>
+        <w:bidi w:val="0"/>
+        <w:spacing w:before="0" w:after="0"/>
+        <w:jc w:val="start"/>
+        <w:rPr/>
+      </w:pPr>
+      <w:r>
+        <w:rPr/>
+        <w:t xml:space="preserve">          </w:t>
+      </w:r>
+      <w:r>
+        <w:rPr/>
+        <w:t>Orange Pi Zero 3 edge computer</w:t>
+      </w:r>
+    </w:p>
+    <w:p>
+      <w:pPr>
+        <w:pStyle w:val="PreformattedText"/>
+        <w:pBdr/>
+        <w:bidi w:val="0"/>
+        <w:spacing w:before="0" w:after="0"/>
+        <w:jc w:val="start"/>
+        <w:rPr/>
+      </w:pPr>
+      <w:r>
+        <w:rPr/>
+        <w:t xml:space="preserve">             </w:t>
+      </w:r>
+      <w:r>
+        <w:rPr/>
+        <w:t>|          |          |</w:t>
+      </w:r>
+    </w:p>
+    <w:p>
+      <w:pPr>
+        <w:pStyle w:val="PreformattedText"/>
+        <w:pBdr/>
+        <w:bidi w:val="0"/>
+        <w:spacing w:before="0" w:after="0"/>
+        <w:jc w:val="start"/>
+        <w:rPr/>
+      </w:pPr>
+      <w:r>
+        <w:rPr/>
+        <w:t xml:space="preserve">          </w:t>
+      </w:r>
+      <w:r>
+        <w:rPr/>
+        <w:t>Storage    Processing    Local API</w:t>
+      </w:r>
+    </w:p>
+    <w:p>
+      <w:pPr>
+        <w:pStyle w:val="PreformattedText"/>
+        <w:pBdr/>
+        <w:bidi w:val="0"/>
+        <w:spacing w:before="0" w:after="0"/>
+        <w:jc w:val="start"/>
+        <w:rPr/>
+      </w:pPr>
+      <w:r>
+        <w:rPr/>
+        <w:t xml:space="preserve">             </w:t>
+      </w:r>
+      <w:r>
+        <w:rPr/>
+        <w:t>\          |          /</w:t>
+      </w:r>
+    </w:p>
+    <w:p>
+      <w:pPr>
+        <w:pStyle w:val="PreformattedText"/>
+        <w:pBdr/>
+        <w:bidi w:val="0"/>
+        <w:spacing w:before="0" w:after="0"/>
+        <w:jc w:val="start"/>
+        <w:rPr/>
+      </w:pPr>
+      <w:r>
+        <w:rPr/>
+        <w:t xml:space="preserve">                         </w:t>
+      </w:r>
+      <w:r>
+        <w:rPr/>
+        <w:t>v</w:t>
+      </w:r>
+    </w:p>
+    <w:p>
+      <w:pPr>
+        <w:pStyle w:val="PreformattedText"/>
+        <w:bidi w:val="0"/>
+        <w:spacing w:before="0" w:after="283"/>
+        <w:jc w:val="start"/>
+        <w:rPr/>
+      </w:pPr>
+      <w:r>
+        <w:rPr/>
+        <w:t xml:space="preserve">                 </w:t>
+      </w:r>
+      <w:r>
+        <w:rPr/>
+        <w:t>FALCON dashboard</w:t>
+      </w:r>
+    </w:p>
+    <w:p>
+      <w:pPr>
+        <w:pStyle w:val="BodyText"/>
+        <w:bidi w:val="0"/>
+        <w:spacing w:before="0" w:after="140"/>
+        <w:jc w:val="both"/>
+        <w:rPr/>
+      </w:pPr>
+      <w:r>
+        <w:rPr>
+          <w:rStyle w:val="Strong"/>
+        </w:rPr>
+        <w:t>Speaker note:</w:t>
+      </w:r>
+      <w:r>
+        <w:rPr/>
+        <w:t xml:space="preserve"> The ESP32 handles deterministic sensing. The Orange Pi handles heavier software. Essential data remain local, so continuous cloud access is not required for the core prototype.</w:t>
+      </w:r>
+    </w:p>
+    <w:p>
+      <w:pPr>
+        <w:pStyle w:val="BodyText"/>
+        <w:bidi w:val="0"/>
+        <w:spacing w:before="0" w:after="140"/>
+        <w:jc w:val="both"/>
+        <w:rPr/>
+      </w:pPr>
+      <w:r>
+        <w:rPr>
+          <w:rStyle w:val="Strong"/>
+        </w:rPr>
+        <w:t>Taglish presentation script:</w:t>
       </w:r>
     </w:p>
     <w:p>
@@ -550,7 +1329,318 @@
       </w:pPr>
       <w:r>
         <w:rPr/>
-        <w:t>concept and software demonstration. We are seeking development support to build,</w:t>
+        <w:t>Ganito po ang magiging flow ng system. Una, kumukuha ng measurements ang wave, motion, wind, GPS, power, at health sensors. Pangalawa, binabasa at chine-check ito ng ESP32 bago i-package bilang telemetry. Pangatlo, ipinapadala ang data sa Orange Pi sa pamamagitan ng USB o UART. Ang Orange Pi naman ang responsible sa local database, signal processing, API, dashboard, at future model inference. Sa huli, makikita ng user ang current measurements, history, alerts, at model output sa FALCON dashboard. Local-first po ang architecture, kaya hindi kailangan ng continuous cloud connection para gumana ang pangunahing monitoring workflow.</w:t>
+      </w:r>
+    </w:p>
+    <w:p>
+      <w:pPr>
+        <w:pStyle w:val="Heading2"/>
+        <w:numPr>
+          <w:ilvl w:val="0"/>
+          <w:numId w:val="0"/>
+        </w:numPr>
+        <w:pBdr/>
+        <w:bidi w:val="0"/>
+        <w:spacing w:before="400" w:after="120"/>
+        <w:jc w:val="start"/>
+        <w:rPr/>
+      </w:pPr>
+      <w:r>
+        <w:rPr/>
+        <w:t>Slide 5 — Current Progress</w:t>
+      </w:r>
+    </w:p>
+    <w:p>
+      <w:pPr>
+        <w:pStyle w:val="BodyText"/>
+        <w:bidi w:val="0"/>
+        <w:spacing w:before="0" w:after="140"/>
+        <w:jc w:val="both"/>
+        <w:rPr/>
+      </w:pPr>
+      <w:r>
+        <w:rPr>
+          <w:rStyle w:val="Strong"/>
+        </w:rPr>
+        <w:t>Already developed:</w:t>
+      </w:r>
+    </w:p>
+    <w:p>
+      <w:pPr>
+        <w:pStyle w:val="BodyText"/>
+        <w:numPr>
+          <w:ilvl w:val="0"/>
+          <w:numId w:val="4"/>
+        </w:numPr>
+        <w:tabs>
+          <w:tab w:val="clear" w:pos="1134"/>
+          <w:tab w:val="left" w:pos="709" w:leader="none"/>
+        </w:tabs>
+        <w:bidi w:val="0"/>
+        <w:spacing w:before="0" w:after="0"/>
+        <w:ind w:hanging="283" w:start="709"/>
+        <w:rPr/>
+      </w:pPr>
+      <w:r>
+        <w:rPr/>
+        <w:t xml:space="preserve">responsive multi-page dashboard; </w:t>
+      </w:r>
+    </w:p>
+    <w:p>
+      <w:pPr>
+        <w:pStyle w:val="BodyText"/>
+        <w:numPr>
+          <w:ilvl w:val="0"/>
+          <w:numId w:val="4"/>
+        </w:numPr>
+        <w:tabs>
+          <w:tab w:val="clear" w:pos="1134"/>
+          <w:tab w:val="left" w:pos="709" w:leader="none"/>
+        </w:tabs>
+        <w:bidi w:val="0"/>
+        <w:spacing w:before="0" w:after="0"/>
+        <w:ind w:hanging="283" w:start="709"/>
+        <w:rPr/>
+      </w:pPr>
+      <w:r>
+        <w:rPr/>
+        <w:t xml:space="preserve">coherent sensor and fault simulator; </w:t>
+      </w:r>
+    </w:p>
+    <w:p>
+      <w:pPr>
+        <w:pStyle w:val="BodyText"/>
+        <w:numPr>
+          <w:ilvl w:val="0"/>
+          <w:numId w:val="4"/>
+        </w:numPr>
+        <w:tabs>
+          <w:tab w:val="clear" w:pos="1134"/>
+          <w:tab w:val="left" w:pos="709" w:leader="none"/>
+        </w:tabs>
+        <w:bidi w:val="0"/>
+        <w:spacing w:before="0" w:after="0"/>
+        <w:ind w:hanging="283" w:start="709"/>
+        <w:rPr/>
+      </w:pPr>
+      <w:r>
+        <w:rPr/>
+        <w:t xml:space="preserve">ESP32 firmware foundation and captive portal; </w:t>
+      </w:r>
+    </w:p>
+    <w:p>
+      <w:pPr>
+        <w:pStyle w:val="BodyText"/>
+        <w:numPr>
+          <w:ilvl w:val="0"/>
+          <w:numId w:val="4"/>
+        </w:numPr>
+        <w:tabs>
+          <w:tab w:val="clear" w:pos="1134"/>
+          <w:tab w:val="left" w:pos="709" w:leader="none"/>
+        </w:tabs>
+        <w:bidi w:val="0"/>
+        <w:spacing w:before="0" w:after="0"/>
+        <w:ind w:hanging="283" w:start="709"/>
+        <w:rPr/>
+      </w:pPr>
+      <w:r>
+        <w:rPr/>
+        <w:t xml:space="preserve">versioned ESP32-to-edge telemetry contract; </w:t>
+      </w:r>
+    </w:p>
+    <w:p>
+      <w:pPr>
+        <w:pStyle w:val="BodyText"/>
+        <w:numPr>
+          <w:ilvl w:val="0"/>
+          <w:numId w:val="4"/>
+        </w:numPr>
+        <w:tabs>
+          <w:tab w:val="clear" w:pos="1134"/>
+          <w:tab w:val="left" w:pos="709" w:leader="none"/>
+        </w:tabs>
+        <w:bidi w:val="0"/>
+        <w:spacing w:before="0" w:after="0"/>
+        <w:ind w:hanging="283" w:start="709"/>
+        <w:rPr/>
+      </w:pPr>
+      <w:r>
+        <w:rPr/>
+        <w:t xml:space="preserve">Python edge service, local database, API, alerts, and forecast presentation; </w:t>
+      </w:r>
+    </w:p>
+    <w:p>
+      <w:pPr>
+        <w:pStyle w:val="BodyText"/>
+        <w:numPr>
+          <w:ilvl w:val="0"/>
+          <w:numId w:val="4"/>
+        </w:numPr>
+        <w:tabs>
+          <w:tab w:val="clear" w:pos="1134"/>
+          <w:tab w:val="left" w:pos="709" w:leader="none"/>
+        </w:tabs>
+        <w:bidi w:val="0"/>
+        <w:spacing w:before="0" w:after="0"/>
+        <w:ind w:hanging="283" w:start="709"/>
+        <w:rPr/>
+      </w:pPr>
+      <w:r>
+        <w:rPr/>
+        <w:t xml:space="preserve">wiring diagrams and Wokwi visual baseline; </w:t>
+      </w:r>
+    </w:p>
+    <w:p>
+      <w:pPr>
+        <w:pStyle w:val="BodyText"/>
+        <w:numPr>
+          <w:ilvl w:val="0"/>
+          <w:numId w:val="4"/>
+        </w:numPr>
+        <w:tabs>
+          <w:tab w:val="clear" w:pos="1134"/>
+          <w:tab w:val="left" w:pos="709" w:leader="none"/>
+        </w:tabs>
+        <w:bidi w:val="0"/>
+        <w:spacing w:before="0" w:after="0"/>
+        <w:ind w:hanging="283" w:start="709"/>
+        <w:rPr/>
+      </w:pPr>
+      <w:r>
+        <w:rPr/>
+        <w:t xml:space="preserve">parametric mechanical concepts and Revision 5 buoy baseline; </w:t>
+      </w:r>
+    </w:p>
+    <w:p>
+      <w:pPr>
+        <w:pStyle w:val="BodyText"/>
+        <w:numPr>
+          <w:ilvl w:val="0"/>
+          <w:numId w:val="4"/>
+        </w:numPr>
+        <w:tabs>
+          <w:tab w:val="clear" w:pos="1134"/>
+          <w:tab w:val="left" w:pos="709" w:leader="none"/>
+        </w:tabs>
+        <w:bidi w:val="0"/>
+        <w:ind w:hanging="283" w:start="709"/>
+        <w:rPr/>
+      </w:pPr>
+      <w:r>
+        <w:rPr/>
+        <w:t xml:space="preserve">hardware bill of materials, power calculations, test plan, and documentation. </w:t>
+      </w:r>
+    </w:p>
+    <w:p>
+      <w:pPr>
+        <w:pStyle w:val="BodyText"/>
+        <w:bidi w:val="0"/>
+        <w:spacing w:before="0" w:after="140"/>
+        <w:jc w:val="both"/>
+        <w:rPr/>
+      </w:pPr>
+      <w:r>
+        <w:rPr>
+          <w:rStyle w:val="Strong"/>
+        </w:rPr>
+        <w:t>Current verification:</w:t>
+      </w:r>
+    </w:p>
+    <w:p>
+      <w:pPr>
+        <w:pStyle w:val="BodyText"/>
+        <w:numPr>
+          <w:ilvl w:val="0"/>
+          <w:numId w:val="5"/>
+        </w:numPr>
+        <w:tabs>
+          <w:tab w:val="clear" w:pos="1134"/>
+          <w:tab w:val="left" w:pos="709" w:leader="none"/>
+        </w:tabs>
+        <w:bidi w:val="0"/>
+        <w:spacing w:before="0" w:after="0"/>
+        <w:ind w:hanging="283" w:start="709"/>
+        <w:rPr/>
+      </w:pPr>
+      <w:r>
+        <w:rPr/>
+        <w:t xml:space="preserve">ESP32 firmware builds successfully; </w:t>
+      </w:r>
+    </w:p>
+    <w:p>
+      <w:pPr>
+        <w:pStyle w:val="BodyText"/>
+        <w:numPr>
+          <w:ilvl w:val="0"/>
+          <w:numId w:val="5"/>
+        </w:numPr>
+        <w:tabs>
+          <w:tab w:val="clear" w:pos="1134"/>
+          <w:tab w:val="left" w:pos="709" w:leader="none"/>
+        </w:tabs>
+        <w:bidi w:val="0"/>
+        <w:spacing w:before="0" w:after="0"/>
+        <w:ind w:hanging="283" w:start="709"/>
+        <w:rPr/>
+      </w:pPr>
+      <w:r>
+        <w:rPr/>
+        <w:t xml:space="preserve">18 edge-service automated tests pass; and </w:t>
+      </w:r>
+    </w:p>
+    <w:p>
+      <w:pPr>
+        <w:pStyle w:val="BodyText"/>
+        <w:numPr>
+          <w:ilvl w:val="0"/>
+          <w:numId w:val="5"/>
+        </w:numPr>
+        <w:tabs>
+          <w:tab w:val="clear" w:pos="1134"/>
+          <w:tab w:val="left" w:pos="709" w:leader="none"/>
+        </w:tabs>
+        <w:bidi w:val="0"/>
+        <w:ind w:hanging="283" w:start="709"/>
+        <w:rPr/>
+      </w:pPr>
+      <w:r>
+        <w:rPr/>
+        <w:t xml:space="preserve">Dashboard Next production build passes. </w:t>
+      </w:r>
+    </w:p>
+    <w:p>
+      <w:pPr>
+        <w:pStyle w:val="BodyText"/>
+        <w:bidi w:val="0"/>
+        <w:spacing w:before="0" w:after="140"/>
+        <w:jc w:val="both"/>
+        <w:rPr/>
+      </w:pPr>
+      <w:r>
+        <w:rPr>
+          <w:rStyle w:val="Strong"/>
+        </w:rPr>
+        <w:t>Not yet completed:</w:t>
+      </w:r>
+      <w:r>
+        <w:rPr/>
+        <w:t xml:space="preserve"> physical sensor integration, assembled marine power system, field-trained AI, calibration, and marine deployment validation.</w:t>
+      </w:r>
+    </w:p>
+    <w:p>
+      <w:pPr>
+        <w:pStyle w:val="BodyText"/>
+        <w:bidi w:val="0"/>
+        <w:spacing w:before="0" w:after="140"/>
+        <w:jc w:val="both"/>
+        <w:rPr/>
+      </w:pPr>
+      <w:r>
+        <w:rPr>
+          <w:rStyle w:val="Strong"/>
+        </w:rPr>
+        <w:t>Taglish presentation script:</w:t>
       </w:r>
     </w:p>
     <w:p>
@@ -567,1022 +1657,7 @@
       </w:pPr>
       <w:r>
         <w:rPr/>
-        <w:t>calibrate, and validate the physical prototype in a controlled coastal setting.</w:t>
-      </w:r>
-    </w:p>
-    <w:p>
-      <w:pPr>
-        <w:pStyle w:val="Heading1"/>
-        <w:bidi w:val="0"/>
-        <w:jc w:val="center"/>
-        <w:rPr/>
-      </w:pPr>
-      <w:r>
-        <w:rPr/>
-        <w:t>2. Ten-Slide Pitch Deck</w:t>
-      </w:r>
-    </w:p>
-    <w:p>
-      <w:pPr>
-        <w:pStyle w:val="Heading2"/>
-        <w:numPr>
-          <w:ilvl w:val="0"/>
-          <w:numId w:val="0"/>
-        </w:numPr>
-        <w:pBdr/>
-        <w:bidi w:val="0"/>
-        <w:spacing w:before="400" w:after="120"/>
-        <w:jc w:val="start"/>
-        <w:rPr/>
-      </w:pPr>
-      <w:r>
-        <w:rPr/>
-        <w:t>Slide 1 — Project Title</w:t>
-      </w:r>
-    </w:p>
-    <w:p>
-      <w:pPr>
-        <w:pStyle w:val="BodyText"/>
-        <w:bidi w:val="0"/>
-        <w:spacing w:before="0" w:after="140"/>
-        <w:jc w:val="both"/>
-        <w:rPr/>
-      </w:pPr>
-      <w:r>
-        <w:rPr>
-          <w:rStyle w:val="Strong"/>
-        </w:rPr>
-        <w:t>PROJECT FALCON</w:t>
-      </w:r>
-      <w:r>
-        <w:rPr/>
-        <w:t xml:space="preserve"> Fullbright College's AI-powered Live Coastal Observation Network</w:t>
-      </w:r>
-    </w:p>
-    <w:p>
-      <w:pPr>
-        <w:pStyle w:val="BodyText"/>
-        <w:bidi w:val="0"/>
-        <w:spacing w:before="0" w:after="140"/>
-        <w:jc w:val="both"/>
-        <w:rPr/>
-      </w:pPr>
-      <w:r>
-        <w:rPr>
-          <w:rStyle w:val="Strong"/>
-        </w:rPr>
-        <w:t>One-line description:</w:t>
-      </w:r>
-      <w:r>
-        <w:rPr/>
-        <w:t xml:space="preserve"> An affordable solar-powered coastal buoy for localized wave monitoring, edge data processing, short-horizon prediction research, and buoy health and displacement alerts.</w:t>
-      </w:r>
-    </w:p>
-    <w:p>
-      <w:pPr>
-        <w:pStyle w:val="BodyText"/>
-        <w:bidi w:val="0"/>
-        <w:spacing w:before="0" w:after="140"/>
-        <w:jc w:val="both"/>
-        <w:rPr/>
-      </w:pPr>
-      <w:r>
-        <w:rPr>
-          <w:rStyle w:val="Strong"/>
-        </w:rPr>
-        <w:t>Visuals:</w:t>
-      </w:r>
-      <w:r>
-        <w:rPr/>
-        <w:t xml:space="preserve"> Project logo, clean buoy render, and one dashboard screenshot.</w:t>
-      </w:r>
-    </w:p>
-    <w:p>
-      <w:pPr>
-        <w:pStyle w:val="BodyText"/>
-        <w:bidi w:val="0"/>
-        <w:spacing w:before="0" w:after="140"/>
-        <w:jc w:val="both"/>
-        <w:rPr/>
-      </w:pPr>
-      <w:r>
-        <w:rPr>
-          <w:rStyle w:val="Strong"/>
-        </w:rPr>
-        <w:t>Speaker note:</w:t>
-      </w:r>
-      <w:r>
-        <w:rPr/>
-        <w:t xml:space="preserve"> Introduce the team, school, project name, and the single problem the proposal addresses. Avoid starting with component specifications.</w:t>
-      </w:r>
-    </w:p>
-    <w:p>
-      <w:pPr>
-        <w:pStyle w:val="Heading2"/>
-        <w:numPr>
-          <w:ilvl w:val="0"/>
-          <w:numId w:val="0"/>
-        </w:numPr>
-        <w:pBdr/>
-        <w:bidi w:val="0"/>
-        <w:spacing w:before="400" w:after="120"/>
-        <w:jc w:val="start"/>
-        <w:rPr/>
-      </w:pPr>
-      <w:r>
-        <w:rPr/>
-        <w:t>Slide 2 — The Problem</w:t>
-      </w:r>
-    </w:p>
-    <w:p>
-      <w:pPr>
-        <w:pStyle w:val="BodyText"/>
-        <w:numPr>
-          <w:ilvl w:val="0"/>
-          <w:numId w:val="2"/>
-        </w:numPr>
-        <w:tabs>
-          <w:tab w:val="clear" w:pos="1134"/>
-          <w:tab w:val="left" w:pos="709" w:leader="none"/>
-        </w:tabs>
-        <w:bidi w:val="0"/>
-        <w:spacing w:before="0" w:after="0"/>
-        <w:ind w:hanging="283" w:start="709"/>
-        <w:rPr/>
-      </w:pPr>
-      <w:r>
-        <w:rPr/>
-        <w:t xml:space="preserve">Coastal decisions benefit from timely and location-specific sea-condition data. </w:t>
-      </w:r>
-    </w:p>
-    <w:p>
-      <w:pPr>
-        <w:pStyle w:val="BodyText"/>
-        <w:numPr>
-          <w:ilvl w:val="0"/>
-          <w:numId w:val="2"/>
-        </w:numPr>
-        <w:tabs>
-          <w:tab w:val="clear" w:pos="1134"/>
-          <w:tab w:val="left" w:pos="709" w:leader="none"/>
-        </w:tabs>
-        <w:bidi w:val="0"/>
-        <w:ind w:hanging="283" w:start="709"/>
-        <w:rPr/>
-      </w:pPr>
-      <w:r>
-        <w:rPr/>
-        <w:t xml:space="preserve">Professional oceanographic systems can be difficult for small institutions to </w:t>
-      </w:r>
-    </w:p>
-    <w:p>
-      <w:pPr>
-        <w:pStyle w:val="BodyText"/>
-        <w:numPr>
-          <w:ilvl w:val="0"/>
-          <w:numId w:val="0"/>
-        </w:numPr>
-        <w:bidi w:val="0"/>
-        <w:ind w:hanging="0" w:start="0"/>
-        <w:rPr/>
-      </w:pPr>
-      <w:r>
-        <w:rPr/>
-        <w:t>acquire, operate, and maintain.</w:t>
-      </w:r>
-    </w:p>
-    <w:p>
-      <w:pPr>
-        <w:pStyle w:val="BodyText"/>
-        <w:numPr>
-          <w:ilvl w:val="0"/>
-          <w:numId w:val="2"/>
-        </w:numPr>
-        <w:tabs>
-          <w:tab w:val="clear" w:pos="1134"/>
-          <w:tab w:val="left" w:pos="709" w:leader="none"/>
-        </w:tabs>
-        <w:bidi w:val="0"/>
-        <w:spacing w:before="0" w:after="0"/>
-        <w:ind w:hanging="283" w:start="709"/>
-        <w:rPr/>
-      </w:pPr>
-      <w:r>
-        <w:rPr/>
-        <w:t xml:space="preserve">Generic forecasts may not represent conditions at a specific near-shore site. </w:t>
-      </w:r>
-    </w:p>
-    <w:p>
-      <w:pPr>
-        <w:pStyle w:val="BodyText"/>
-        <w:numPr>
-          <w:ilvl w:val="0"/>
-          <w:numId w:val="2"/>
-        </w:numPr>
-        <w:tabs>
-          <w:tab w:val="clear" w:pos="1134"/>
-          <w:tab w:val="left" w:pos="709" w:leader="none"/>
-        </w:tabs>
-        <w:bidi w:val="0"/>
-        <w:ind w:hanging="283" w:start="709"/>
-        <w:rPr/>
-      </w:pPr>
-      <w:r>
-        <w:rPr/>
-        <w:t xml:space="preserve">Connectivity, energy, maintenance, and equipment security complicate continuous </w:t>
-      </w:r>
-    </w:p>
-    <w:p>
-      <w:pPr>
-        <w:pStyle w:val="BodyText"/>
-        <w:numPr>
-          <w:ilvl w:val="0"/>
-          <w:numId w:val="0"/>
-        </w:numPr>
-        <w:bidi w:val="0"/>
-        <w:ind w:hanging="0" w:start="0"/>
-        <w:rPr/>
-      </w:pPr>
-      <w:r>
-        <w:rPr/>
-        <w:t>coastal monitoring.</w:t>
-      </w:r>
-    </w:p>
-    <w:p>
-      <w:pPr>
-        <w:pStyle w:val="BodyText"/>
-        <w:bidi w:val="0"/>
-        <w:spacing w:before="0" w:after="140"/>
-        <w:jc w:val="both"/>
-        <w:rPr/>
-      </w:pPr>
-      <w:r>
-        <w:rPr>
-          <w:rStyle w:val="Strong"/>
-        </w:rPr>
-        <w:t>Speaker note:</w:t>
-      </w:r>
-      <w:r>
-        <w:rPr/>
-        <w:t xml:space="preserve"> Connect the problem to a specific intended Palawan user or pilot site once stakeholder confirmation is available. Do not claim that no monitoring exists; state that affordable localized access is limited for the intended user.</w:t>
-      </w:r>
-    </w:p>
-    <w:p>
-      <w:pPr>
-        <w:pStyle w:val="Heading2"/>
-        <w:numPr>
-          <w:ilvl w:val="0"/>
-          <w:numId w:val="0"/>
-        </w:numPr>
-        <w:pBdr/>
-        <w:bidi w:val="0"/>
-        <w:spacing w:before="400" w:after="120"/>
-        <w:jc w:val="start"/>
-        <w:rPr/>
-      </w:pPr>
-      <w:r>
-        <w:rPr/>
-        <w:t>Slide 3 — Proposed Solution</w:t>
-      </w:r>
-    </w:p>
-    <w:p>
-      <w:pPr>
-        <w:pStyle w:val="BodyText"/>
-        <w:bidi w:val="0"/>
-        <w:spacing w:before="0" w:after="140"/>
-        <w:jc w:val="both"/>
-        <w:rPr/>
-      </w:pPr>
-      <w:r>
-        <w:rPr/>
-        <w:t>Project FALCON combines:</w:t>
-      </w:r>
-    </w:p>
-    <w:p>
-      <w:pPr>
-        <w:pStyle w:val="BodyText"/>
-        <w:numPr>
-          <w:ilvl w:val="0"/>
-          <w:numId w:val="3"/>
-        </w:numPr>
-        <w:tabs>
-          <w:tab w:val="clear" w:pos="1134"/>
-          <w:tab w:val="left" w:pos="709" w:leader="none"/>
-        </w:tabs>
-        <w:bidi w:val="0"/>
-        <w:spacing w:before="0" w:after="0"/>
-        <w:ind w:hanging="283" w:start="709"/>
-        <w:rPr/>
-      </w:pPr>
-      <w:r>
-        <w:rPr/>
-        <w:t xml:space="preserve">wave-related sensors and system-health monitors; </w:t>
-      </w:r>
-    </w:p>
-    <w:p>
-      <w:pPr>
-        <w:pStyle w:val="BodyText"/>
-        <w:numPr>
-          <w:ilvl w:val="0"/>
-          <w:numId w:val="3"/>
-        </w:numPr>
-        <w:tabs>
-          <w:tab w:val="clear" w:pos="1134"/>
-          <w:tab w:val="left" w:pos="709" w:leader="none"/>
-        </w:tabs>
-        <w:bidi w:val="0"/>
-        <w:spacing w:before="0" w:after="0"/>
-        <w:ind w:hanging="283" w:start="709"/>
-        <w:rPr/>
-      </w:pPr>
-      <w:r>
-        <w:rPr/>
-        <w:t xml:space="preserve">an ESP32 for reliable sensor acquisition and diagnostics; </w:t>
-      </w:r>
-    </w:p>
-    <w:p>
-      <w:pPr>
-        <w:pStyle w:val="BodyText"/>
-        <w:numPr>
-          <w:ilvl w:val="0"/>
-          <w:numId w:val="3"/>
-        </w:numPr>
-        <w:tabs>
-          <w:tab w:val="clear" w:pos="1134"/>
-          <w:tab w:val="left" w:pos="709" w:leader="none"/>
-        </w:tabs>
-        <w:bidi w:val="0"/>
-        <w:spacing w:before="0" w:after="0"/>
-        <w:ind w:hanging="283" w:start="709"/>
-        <w:rPr/>
-      </w:pPr>
-      <w:r>
-        <w:rPr/>
-        <w:t xml:space="preserve">an Orange Pi Zero 3 for local storage, processing, API, and model inference; </w:t>
-      </w:r>
-    </w:p>
-    <w:p>
-      <w:pPr>
-        <w:pStyle w:val="BodyText"/>
-        <w:numPr>
-          <w:ilvl w:val="0"/>
-          <w:numId w:val="3"/>
-        </w:numPr>
-        <w:tabs>
-          <w:tab w:val="clear" w:pos="1134"/>
-          <w:tab w:val="left" w:pos="709" w:leader="none"/>
-        </w:tabs>
-        <w:bidi w:val="0"/>
-        <w:spacing w:before="0" w:after="0"/>
-        <w:ind w:hanging="283" w:start="709"/>
-        <w:rPr/>
-      </w:pPr>
-      <w:r>
-        <w:rPr/>
-        <w:t xml:space="preserve">solar power with battery storage; </w:t>
-      </w:r>
-    </w:p>
-    <w:p>
-      <w:pPr>
-        <w:pStyle w:val="BodyText"/>
-        <w:numPr>
-          <w:ilvl w:val="0"/>
-          <w:numId w:val="3"/>
-        </w:numPr>
-        <w:tabs>
-          <w:tab w:val="clear" w:pos="1134"/>
-          <w:tab w:val="left" w:pos="709" w:leader="none"/>
-        </w:tabs>
-        <w:bidi w:val="0"/>
-        <w:spacing w:before="0" w:after="0"/>
-        <w:ind w:hanging="283" w:start="709"/>
-        <w:rPr/>
-      </w:pPr>
-      <w:r>
-        <w:rPr/>
-        <w:t xml:space="preserve">a responsive local dashboard; </w:t>
-      </w:r>
-    </w:p>
-    <w:p>
-      <w:pPr>
-        <w:pStyle w:val="BodyText"/>
-        <w:numPr>
-          <w:ilvl w:val="0"/>
-          <w:numId w:val="3"/>
-        </w:numPr>
-        <w:tabs>
-          <w:tab w:val="clear" w:pos="1134"/>
-          <w:tab w:val="left" w:pos="709" w:leader="none"/>
-        </w:tabs>
-        <w:bidi w:val="0"/>
-        <w:spacing w:before="0" w:after="0"/>
-        <w:ind w:hanging="283" w:start="709"/>
-        <w:rPr/>
-      </w:pPr>
-      <w:r>
-        <w:rPr/>
-        <w:t xml:space="preserve">offline buffering for intermittent connectivity; and </w:t>
-      </w:r>
-    </w:p>
-    <w:p>
-      <w:pPr>
-        <w:pStyle w:val="BodyText"/>
-        <w:numPr>
-          <w:ilvl w:val="0"/>
-          <w:numId w:val="3"/>
-        </w:numPr>
-        <w:tabs>
-          <w:tab w:val="clear" w:pos="1134"/>
-          <w:tab w:val="left" w:pos="709" w:leader="none"/>
-        </w:tabs>
-        <w:bidi w:val="0"/>
-        <w:ind w:hanging="283" w:start="709"/>
-        <w:rPr/>
-      </w:pPr>
-      <w:r>
-        <w:rPr/>
-        <w:t xml:space="preserve">GPS/IMU-assisted abnormal-displacement alerts. </w:t>
-      </w:r>
-    </w:p>
-    <w:p>
-      <w:pPr>
-        <w:pStyle w:val="BodyText"/>
-        <w:bidi w:val="0"/>
-        <w:spacing w:before="0" w:after="140"/>
-        <w:jc w:val="both"/>
-        <w:rPr/>
-      </w:pPr>
-      <w:r>
-        <w:rPr>
-          <w:rStyle w:val="Strong"/>
-        </w:rPr>
-        <w:t>Speaker note:</w:t>
-      </w:r>
-      <w:r>
-        <w:rPr/>
-        <w:t xml:space="preserve"> Explain the system in plain language: measure, validate, store, analyze, display, and alert.</w:t>
-      </w:r>
-    </w:p>
-    <w:p>
-      <w:pPr>
-        <w:pStyle w:val="Heading2"/>
-        <w:numPr>
-          <w:ilvl w:val="0"/>
-          <w:numId w:val="0"/>
-        </w:numPr>
-        <w:pBdr/>
-        <w:bidi w:val="0"/>
-        <w:spacing w:before="400" w:after="120"/>
-        <w:jc w:val="start"/>
-        <w:rPr/>
-      </w:pPr>
-      <w:r>
-        <w:rPr/>
-        <w:t>Slide 4 — How It Works</w:t>
-      </w:r>
-    </w:p>
-    <w:p>
-      <w:pPr>
-        <w:pStyle w:val="PreformattedText"/>
-        <w:pBdr/>
-        <w:bidi w:val="0"/>
-        <w:spacing w:before="0" w:after="0"/>
-        <w:jc w:val="start"/>
-        <w:rPr/>
-      </w:pPr>
-      <w:r>
-        <w:rPr/>
-        <w:t>Wave, motion, wind, GPS, power and health sensors</w:t>
-      </w:r>
-    </w:p>
-    <w:p>
-      <w:pPr>
-        <w:pStyle w:val="PreformattedText"/>
-        <w:pBdr/>
-        <w:bidi w:val="0"/>
-        <w:spacing w:before="0" w:after="0"/>
-        <w:jc w:val="start"/>
-        <w:rPr/>
-      </w:pPr>
-      <w:r>
-        <w:rPr/>
-        <w:t xml:space="preserve">                         </w:t>
-      </w:r>
-      <w:r>
-        <w:rPr/>
-        <w:t>|</w:t>
-      </w:r>
-    </w:p>
-    <w:p>
-      <w:pPr>
-        <w:pStyle w:val="PreformattedText"/>
-        <w:pBdr/>
-        <w:bidi w:val="0"/>
-        <w:spacing w:before="0" w:after="0"/>
-        <w:jc w:val="start"/>
-        <w:rPr/>
-      </w:pPr>
-      <w:r>
-        <w:rPr/>
-        <w:t xml:space="preserve">                         </w:t>
-      </w:r>
-      <w:r>
-        <w:rPr/>
-        <w:t>v</w:t>
-      </w:r>
-    </w:p>
-    <w:p>
-      <w:pPr>
-        <w:pStyle w:val="PreformattedText"/>
-        <w:pBdr/>
-        <w:bidi w:val="0"/>
-        <w:spacing w:before="0" w:after="0"/>
-        <w:jc w:val="start"/>
-        <w:rPr/>
-      </w:pPr>
-      <w:r>
-        <w:rPr/>
-        <w:t xml:space="preserve">              </w:t>
-      </w:r>
-      <w:r>
-        <w:rPr/>
-        <w:t>ESP32 acquisition layer</w:t>
-      </w:r>
-    </w:p>
-    <w:p>
-      <w:pPr>
-        <w:pStyle w:val="PreformattedText"/>
-        <w:pBdr/>
-        <w:bidi w:val="0"/>
-        <w:spacing w:before="0" w:after="0"/>
-        <w:jc w:val="start"/>
-        <w:rPr/>
-      </w:pPr>
-      <w:r>
-        <w:rPr/>
-        <w:t xml:space="preserve">                         </w:t>
-      </w:r>
-      <w:r>
-        <w:rPr/>
-        <w:t>|</w:t>
-      </w:r>
-    </w:p>
-    <w:p>
-      <w:pPr>
-        <w:pStyle w:val="PreformattedText"/>
-        <w:pBdr/>
-        <w:bidi w:val="0"/>
-        <w:spacing w:before="0" w:after="0"/>
-        <w:jc w:val="start"/>
-        <w:rPr/>
-      </w:pPr>
-      <w:r>
-        <w:rPr/>
-        <w:t xml:space="preserve">                    </w:t>
-      </w:r>
-      <w:r>
-        <w:rPr/>
-        <w:t>USB / UART</w:t>
-      </w:r>
-    </w:p>
-    <w:p>
-      <w:pPr>
-        <w:pStyle w:val="PreformattedText"/>
-        <w:pBdr/>
-        <w:bidi w:val="0"/>
-        <w:spacing w:before="0" w:after="0"/>
-        <w:jc w:val="start"/>
-        <w:rPr/>
-      </w:pPr>
-      <w:r>
-        <w:rPr/>
-        <w:t xml:space="preserve">                         </w:t>
-      </w:r>
-      <w:r>
-        <w:rPr/>
-        <w:t>v</w:t>
-      </w:r>
-    </w:p>
-    <w:p>
-      <w:pPr>
-        <w:pStyle w:val="PreformattedText"/>
-        <w:pBdr/>
-        <w:bidi w:val="0"/>
-        <w:spacing w:before="0" w:after="0"/>
-        <w:jc w:val="start"/>
-        <w:rPr/>
-      </w:pPr>
-      <w:r>
-        <w:rPr/>
-        <w:t xml:space="preserve">          </w:t>
-      </w:r>
-      <w:r>
-        <w:rPr/>
-        <w:t>Orange Pi Zero 3 edge computer</w:t>
-      </w:r>
-    </w:p>
-    <w:p>
-      <w:pPr>
-        <w:pStyle w:val="PreformattedText"/>
-        <w:pBdr/>
-        <w:bidi w:val="0"/>
-        <w:spacing w:before="0" w:after="0"/>
-        <w:jc w:val="start"/>
-        <w:rPr/>
-      </w:pPr>
-      <w:r>
-        <w:rPr/>
-        <w:t xml:space="preserve">             </w:t>
-      </w:r>
-      <w:r>
-        <w:rPr/>
-        <w:t>|          |          |</w:t>
-      </w:r>
-    </w:p>
-    <w:p>
-      <w:pPr>
-        <w:pStyle w:val="PreformattedText"/>
-        <w:pBdr/>
-        <w:bidi w:val="0"/>
-        <w:spacing w:before="0" w:after="0"/>
-        <w:jc w:val="start"/>
-        <w:rPr/>
-      </w:pPr>
-      <w:r>
-        <w:rPr/>
-        <w:t xml:space="preserve">          </w:t>
-      </w:r>
-      <w:r>
-        <w:rPr/>
-        <w:t>Storage    Processing    Local API</w:t>
-      </w:r>
-    </w:p>
-    <w:p>
-      <w:pPr>
-        <w:pStyle w:val="PreformattedText"/>
-        <w:pBdr/>
-        <w:bidi w:val="0"/>
-        <w:spacing w:before="0" w:after="0"/>
-        <w:jc w:val="start"/>
-        <w:rPr/>
-      </w:pPr>
-      <w:r>
-        <w:rPr/>
-        <w:t xml:space="preserve">             </w:t>
-      </w:r>
-      <w:r>
-        <w:rPr/>
-        <w:t>\          |          /</w:t>
-      </w:r>
-    </w:p>
-    <w:p>
-      <w:pPr>
-        <w:pStyle w:val="PreformattedText"/>
-        <w:pBdr/>
-        <w:bidi w:val="0"/>
-        <w:spacing w:before="0" w:after="0"/>
-        <w:jc w:val="start"/>
-        <w:rPr/>
-      </w:pPr>
-      <w:r>
-        <w:rPr/>
-        <w:t xml:space="preserve">                         </w:t>
-      </w:r>
-      <w:r>
-        <w:rPr/>
-        <w:t>v</w:t>
-      </w:r>
-    </w:p>
-    <w:p>
-      <w:pPr>
-        <w:pStyle w:val="PreformattedText"/>
-        <w:bidi w:val="0"/>
-        <w:spacing w:before="0" w:after="283"/>
-        <w:jc w:val="start"/>
-        <w:rPr/>
-      </w:pPr>
-      <w:r>
-        <w:rPr/>
-        <w:t xml:space="preserve">                 </w:t>
-      </w:r>
-      <w:r>
-        <w:rPr/>
-        <w:t>FALCON dashboard</w:t>
-      </w:r>
-    </w:p>
-    <w:p>
-      <w:pPr>
-        <w:pStyle w:val="BodyText"/>
-        <w:bidi w:val="0"/>
-        <w:spacing w:before="0" w:after="140"/>
-        <w:jc w:val="both"/>
-        <w:rPr/>
-      </w:pPr>
-      <w:r>
-        <w:rPr>
-          <w:rStyle w:val="Strong"/>
-        </w:rPr>
-        <w:t>Speaker note:</w:t>
-      </w:r>
-      <w:r>
-        <w:rPr/>
-        <w:t xml:space="preserve"> The ESP32 handles deterministic sensing. The Orange Pi handles heavier software. Essential data remain local, so continuous cloud access is not required for the core prototype.</w:t>
-      </w:r>
-    </w:p>
-    <w:p>
-      <w:pPr>
-        <w:pStyle w:val="Heading2"/>
-        <w:numPr>
-          <w:ilvl w:val="0"/>
-          <w:numId w:val="0"/>
-        </w:numPr>
-        <w:pBdr/>
-        <w:bidi w:val="0"/>
-        <w:spacing w:before="400" w:after="120"/>
-        <w:jc w:val="start"/>
-        <w:rPr/>
-      </w:pPr>
-      <w:r>
-        <w:rPr/>
-        <w:t>Slide 5 — Current Progress</w:t>
-      </w:r>
-    </w:p>
-    <w:p>
-      <w:pPr>
-        <w:pStyle w:val="BodyText"/>
-        <w:bidi w:val="0"/>
-        <w:spacing w:before="0" w:after="140"/>
-        <w:jc w:val="both"/>
-        <w:rPr/>
-      </w:pPr>
-      <w:r>
-        <w:rPr>
-          <w:rStyle w:val="Strong"/>
-        </w:rPr>
-        <w:t>Already developed:</w:t>
-      </w:r>
-    </w:p>
-    <w:p>
-      <w:pPr>
-        <w:pStyle w:val="BodyText"/>
-        <w:numPr>
-          <w:ilvl w:val="0"/>
-          <w:numId w:val="4"/>
-        </w:numPr>
-        <w:tabs>
-          <w:tab w:val="clear" w:pos="1134"/>
-          <w:tab w:val="left" w:pos="709" w:leader="none"/>
-        </w:tabs>
-        <w:bidi w:val="0"/>
-        <w:spacing w:before="0" w:after="0"/>
-        <w:ind w:hanging="283" w:start="709"/>
-        <w:rPr/>
-      </w:pPr>
-      <w:r>
-        <w:rPr/>
-        <w:t xml:space="preserve">responsive multi-page dashboard; </w:t>
-      </w:r>
-    </w:p>
-    <w:p>
-      <w:pPr>
-        <w:pStyle w:val="BodyText"/>
-        <w:numPr>
-          <w:ilvl w:val="0"/>
-          <w:numId w:val="4"/>
-        </w:numPr>
-        <w:tabs>
-          <w:tab w:val="clear" w:pos="1134"/>
-          <w:tab w:val="left" w:pos="709" w:leader="none"/>
-        </w:tabs>
-        <w:bidi w:val="0"/>
-        <w:spacing w:before="0" w:after="0"/>
-        <w:ind w:hanging="283" w:start="709"/>
-        <w:rPr/>
-      </w:pPr>
-      <w:r>
-        <w:rPr/>
-        <w:t xml:space="preserve">coherent sensor and fault simulator; </w:t>
-      </w:r>
-    </w:p>
-    <w:p>
-      <w:pPr>
-        <w:pStyle w:val="BodyText"/>
-        <w:numPr>
-          <w:ilvl w:val="0"/>
-          <w:numId w:val="4"/>
-        </w:numPr>
-        <w:tabs>
-          <w:tab w:val="clear" w:pos="1134"/>
-          <w:tab w:val="left" w:pos="709" w:leader="none"/>
-        </w:tabs>
-        <w:bidi w:val="0"/>
-        <w:spacing w:before="0" w:after="0"/>
-        <w:ind w:hanging="283" w:start="709"/>
-        <w:rPr/>
-      </w:pPr>
-      <w:r>
-        <w:rPr/>
-        <w:t xml:space="preserve">ESP32 firmware foundation and captive portal; </w:t>
-      </w:r>
-    </w:p>
-    <w:p>
-      <w:pPr>
-        <w:pStyle w:val="BodyText"/>
-        <w:numPr>
-          <w:ilvl w:val="0"/>
-          <w:numId w:val="4"/>
-        </w:numPr>
-        <w:tabs>
-          <w:tab w:val="clear" w:pos="1134"/>
-          <w:tab w:val="left" w:pos="709" w:leader="none"/>
-        </w:tabs>
-        <w:bidi w:val="0"/>
-        <w:spacing w:before="0" w:after="0"/>
-        <w:ind w:hanging="283" w:start="709"/>
-        <w:rPr/>
-      </w:pPr>
-      <w:r>
-        <w:rPr/>
-        <w:t xml:space="preserve">versioned ESP32-to-edge telemetry contract; </w:t>
-      </w:r>
-    </w:p>
-    <w:p>
-      <w:pPr>
-        <w:pStyle w:val="BodyText"/>
-        <w:numPr>
-          <w:ilvl w:val="0"/>
-          <w:numId w:val="4"/>
-        </w:numPr>
-        <w:tabs>
-          <w:tab w:val="clear" w:pos="1134"/>
-          <w:tab w:val="left" w:pos="709" w:leader="none"/>
-        </w:tabs>
-        <w:bidi w:val="0"/>
-        <w:spacing w:before="0" w:after="0"/>
-        <w:ind w:hanging="283" w:start="709"/>
-        <w:rPr/>
-      </w:pPr>
-      <w:r>
-        <w:rPr/>
-        <w:t xml:space="preserve">Python edge service, local database, API, alerts, and forecast presentation; </w:t>
-      </w:r>
-    </w:p>
-    <w:p>
-      <w:pPr>
-        <w:pStyle w:val="BodyText"/>
-        <w:numPr>
-          <w:ilvl w:val="0"/>
-          <w:numId w:val="4"/>
-        </w:numPr>
-        <w:tabs>
-          <w:tab w:val="clear" w:pos="1134"/>
-          <w:tab w:val="left" w:pos="709" w:leader="none"/>
-        </w:tabs>
-        <w:bidi w:val="0"/>
-        <w:spacing w:before="0" w:after="0"/>
-        <w:ind w:hanging="283" w:start="709"/>
-        <w:rPr/>
-      </w:pPr>
-      <w:r>
-        <w:rPr/>
-        <w:t xml:space="preserve">wiring diagrams and Wokwi visual baseline; </w:t>
-      </w:r>
-    </w:p>
-    <w:p>
-      <w:pPr>
-        <w:pStyle w:val="BodyText"/>
-        <w:numPr>
-          <w:ilvl w:val="0"/>
-          <w:numId w:val="4"/>
-        </w:numPr>
-        <w:tabs>
-          <w:tab w:val="clear" w:pos="1134"/>
-          <w:tab w:val="left" w:pos="709" w:leader="none"/>
-        </w:tabs>
-        <w:bidi w:val="0"/>
-        <w:spacing w:before="0" w:after="0"/>
-        <w:ind w:hanging="283" w:start="709"/>
-        <w:rPr/>
-      </w:pPr>
-      <w:r>
-        <w:rPr/>
-        <w:t xml:space="preserve">parametric mechanical concepts and Revision 5 buoy baseline; </w:t>
-      </w:r>
-    </w:p>
-    <w:p>
-      <w:pPr>
-        <w:pStyle w:val="BodyText"/>
-        <w:numPr>
-          <w:ilvl w:val="0"/>
-          <w:numId w:val="4"/>
-        </w:numPr>
-        <w:tabs>
-          <w:tab w:val="clear" w:pos="1134"/>
-          <w:tab w:val="left" w:pos="709" w:leader="none"/>
-        </w:tabs>
-        <w:bidi w:val="0"/>
-        <w:ind w:hanging="283" w:start="709"/>
-        <w:rPr/>
-      </w:pPr>
-      <w:r>
-        <w:rPr/>
-        <w:t xml:space="preserve">hardware bill of materials, power calculations, test plan, and documentation. </w:t>
-      </w:r>
-    </w:p>
-    <w:p>
-      <w:pPr>
-        <w:pStyle w:val="BodyText"/>
-        <w:bidi w:val="0"/>
-        <w:spacing w:before="0" w:after="140"/>
-        <w:jc w:val="both"/>
-        <w:rPr/>
-      </w:pPr>
-      <w:r>
-        <w:rPr>
-          <w:rStyle w:val="Strong"/>
-        </w:rPr>
-        <w:t>Current verification:</w:t>
-      </w:r>
-    </w:p>
-    <w:p>
-      <w:pPr>
-        <w:pStyle w:val="BodyText"/>
-        <w:numPr>
-          <w:ilvl w:val="0"/>
-          <w:numId w:val="5"/>
-        </w:numPr>
-        <w:tabs>
-          <w:tab w:val="clear" w:pos="1134"/>
-          <w:tab w:val="left" w:pos="709" w:leader="none"/>
-        </w:tabs>
-        <w:bidi w:val="0"/>
-        <w:spacing w:before="0" w:after="0"/>
-        <w:ind w:hanging="283" w:start="709"/>
-        <w:rPr/>
-      </w:pPr>
-      <w:r>
-        <w:rPr/>
-        <w:t xml:space="preserve">ESP32 firmware builds successfully; </w:t>
-      </w:r>
-    </w:p>
-    <w:p>
-      <w:pPr>
-        <w:pStyle w:val="BodyText"/>
-        <w:numPr>
-          <w:ilvl w:val="0"/>
-          <w:numId w:val="5"/>
-        </w:numPr>
-        <w:tabs>
-          <w:tab w:val="clear" w:pos="1134"/>
-          <w:tab w:val="left" w:pos="709" w:leader="none"/>
-        </w:tabs>
-        <w:bidi w:val="0"/>
-        <w:spacing w:before="0" w:after="0"/>
-        <w:ind w:hanging="283" w:start="709"/>
-        <w:rPr/>
-      </w:pPr>
-      <w:r>
-        <w:rPr/>
-        <w:t xml:space="preserve">18 edge-service automated tests pass; and </w:t>
-      </w:r>
-    </w:p>
-    <w:p>
-      <w:pPr>
-        <w:pStyle w:val="BodyText"/>
-        <w:numPr>
-          <w:ilvl w:val="0"/>
-          <w:numId w:val="5"/>
-        </w:numPr>
-        <w:tabs>
-          <w:tab w:val="clear" w:pos="1134"/>
-          <w:tab w:val="left" w:pos="709" w:leader="none"/>
-        </w:tabs>
-        <w:bidi w:val="0"/>
-        <w:ind w:hanging="283" w:start="709"/>
-        <w:rPr/>
-      </w:pPr>
-      <w:r>
-        <w:rPr/>
-        <w:t xml:space="preserve">Dashboard Next production build passes. </w:t>
-      </w:r>
-    </w:p>
-    <w:p>
-      <w:pPr>
-        <w:pStyle w:val="BodyText"/>
-        <w:bidi w:val="0"/>
-        <w:spacing w:before="0" w:after="140"/>
-        <w:jc w:val="both"/>
-        <w:rPr/>
-      </w:pPr>
-      <w:r>
-        <w:rPr>
-          <w:rStyle w:val="Strong"/>
-        </w:rPr>
-        <w:t>Not yet completed:</w:t>
-      </w:r>
-      <w:r>
-        <w:rPr/>
-        <w:t xml:space="preserve"> physical sensor integration, assembled marine power system, field-trained AI, calibration, and marine deployment validation.</w:t>
+        <w:t>Sa current stage, hindi na lang po ito drawing o raw idea. May working responsive dashboard, sensor at fault simulator, ESP32 firmware foundation, telemetry protocol, Python edge service, local database, API, alerts, wiring diagrams, mechanical concepts, bill of materials, at testing documentation na kami. Na-build na rin nang successful ang ESP32 firmware at dashboard, at pumapasa ang automated edge-service tests. Pero gusto naming maging transparent: simulated data pa ang ginagamit sa demonstration. Hindi pa assembled ang complete physical buoy, hindi pa integrated at calibrated ang actual sensors, at hindi pa field-trained o safety-validated ang AI. Iyon po mismo ang development stage na gusto naming pondohan at maisagawa nang tama.</w:t>
       </w:r>
     </w:p>
     <w:p>
@@ -1772,7 +1847,22 @@
       </w:pPr>
       <w:r>
         <w:rPr/>
-        <w:t>FALCON's innovation is the validated integration and local adaptation of its</w:t>
+        <w:t>FALCON's innovation is the validated integration and local adaptation of its sensing, edge-computing, energy, prediction, and protection subsystems—not the invention of an individual sensor, buoy, or machine-learning algorithm.</w:t>
+      </w:r>
+    </w:p>
+    <w:p>
+      <w:pPr>
+        <w:pStyle w:val="BodyText"/>
+        <w:bidi w:val="0"/>
+        <w:spacing w:before="0" w:after="140"/>
+        <w:jc w:val="both"/>
+        <w:rPr/>
+      </w:pPr>
+      <w:r>
+        <w:rPr>
+          <w:rStyle w:val="Strong"/>
+        </w:rPr>
+        <w:t>Taglish presentation script:</w:t>
       </w:r>
     </w:p>
     <w:p>
@@ -1789,7 +1879,168 @@
       </w:pPr>
       <w:r>
         <w:rPr/>
-        <w:t>sensing, edge-computing, energy, prediction, and protection subsystems—not the</w:t>
+        <w:t>Ang innovation ng FALCON ay hindi nakabase sa claim na kami ang nakaimbento ng buoy, sensor, o AI algorithm. Ang contribution namin ay ang validated integration at local adaptation ng mga subsystem na ito sa isang affordable at modular platform. Local ang processing kaya hindi mandatory ang cloud. Focused ang sensor scope para manageable ang calibration, cost, at energy. Intended din na malinaw sa dashboard kung simulated, measured, estimated, o predicted ang isang value. Kasama rin sa iisang platform ang wave monitoring, energy status, position, system health, at abnormal-displacement alerts. Ang magiging sukatan ng novelty namin ay hindi dami ng features, kundi kung maayos, reproducible, at validated ang pagsasama ng mga ito para sa local use case.</w:t>
+      </w:r>
+    </w:p>
+    <w:p>
+      <w:pPr>
+        <w:pStyle w:val="Heading2"/>
+        <w:numPr>
+          <w:ilvl w:val="0"/>
+          <w:numId w:val="0"/>
+        </w:numPr>
+        <w:pBdr/>
+        <w:bidi w:val="0"/>
+        <w:spacing w:before="400" w:after="120"/>
+        <w:jc w:val="start"/>
+        <w:rPr/>
+      </w:pPr>
+      <w:r>
+        <w:rPr/>
+        <w:t>Slide 7 — Intended Beneficiaries and Value</w:t>
+      </w:r>
+    </w:p>
+    <w:p>
+      <w:pPr>
+        <w:pStyle w:val="BodyText"/>
+        <w:bidi w:val="0"/>
+        <w:spacing w:before="0" w:after="140"/>
+        <w:jc w:val="both"/>
+        <w:rPr/>
+      </w:pPr>
+      <w:r>
+        <w:rPr/>
+        <w:t>Potential beneficiaries include:</w:t>
+      </w:r>
+    </w:p>
+    <w:p>
+      <w:pPr>
+        <w:pStyle w:val="BodyText"/>
+        <w:numPr>
+          <w:ilvl w:val="0"/>
+          <w:numId w:val="7"/>
+        </w:numPr>
+        <w:tabs>
+          <w:tab w:val="clear" w:pos="1134"/>
+          <w:tab w:val="left" w:pos="709" w:leader="none"/>
+        </w:tabs>
+        <w:bidi w:val="0"/>
+        <w:spacing w:before="0" w:after="0"/>
+        <w:ind w:hanging="283" w:start="709"/>
+        <w:rPr/>
+      </w:pPr>
+      <w:r>
+        <w:rPr/>
+        <w:t xml:space="preserve">coastal local government and disaster-management offices; </w:t>
+      </w:r>
+    </w:p>
+    <w:p>
+      <w:pPr>
+        <w:pStyle w:val="BodyText"/>
+        <w:numPr>
+          <w:ilvl w:val="0"/>
+          <w:numId w:val="7"/>
+        </w:numPr>
+        <w:tabs>
+          <w:tab w:val="clear" w:pos="1134"/>
+          <w:tab w:val="left" w:pos="709" w:leader="none"/>
+        </w:tabs>
+        <w:bidi w:val="0"/>
+        <w:spacing w:before="0" w:after="0"/>
+        <w:ind w:hanging="283" w:start="709"/>
+        <w:rPr/>
+      </w:pPr>
+      <w:r>
+        <w:rPr/>
+        <w:t xml:space="preserve">fisherfolk and small-craft communities; </w:t>
+      </w:r>
+    </w:p>
+    <w:p>
+      <w:pPr>
+        <w:pStyle w:val="BodyText"/>
+        <w:numPr>
+          <w:ilvl w:val="0"/>
+          <w:numId w:val="7"/>
+        </w:numPr>
+        <w:tabs>
+          <w:tab w:val="clear" w:pos="1134"/>
+          <w:tab w:val="left" w:pos="709" w:leader="none"/>
+        </w:tabs>
+        <w:bidi w:val="0"/>
+        <w:spacing w:before="0" w:after="0"/>
+        <w:ind w:hanging="283" w:start="709"/>
+        <w:rPr/>
+      </w:pPr>
+      <w:r>
+        <w:rPr/>
+        <w:t xml:space="preserve">schools and marine researchers; </w:t>
+      </w:r>
+    </w:p>
+    <w:p>
+      <w:pPr>
+        <w:pStyle w:val="BodyText"/>
+        <w:numPr>
+          <w:ilvl w:val="0"/>
+          <w:numId w:val="7"/>
+        </w:numPr>
+        <w:tabs>
+          <w:tab w:val="clear" w:pos="1134"/>
+          <w:tab w:val="left" w:pos="709" w:leader="none"/>
+        </w:tabs>
+        <w:bidi w:val="0"/>
+        <w:ind w:hanging="283" w:start="709"/>
+        <w:rPr/>
+      </w:pPr>
+      <w:r>
+        <w:rPr/>
+        <w:t xml:space="preserve">ports, coastal tourism operators, and environmental organizations. </w:t>
+      </w:r>
+    </w:p>
+    <w:p>
+      <w:pPr>
+        <w:pStyle w:val="BodyText"/>
+        <w:bidi w:val="0"/>
+        <w:spacing w:before="0" w:after="140"/>
+        <w:jc w:val="both"/>
+        <w:rPr/>
+      </w:pPr>
+      <w:r>
+        <w:rPr/>
+        <w:t>Potential value includes localized observation history, accessible visualization, research data, equipment-health awareness, and a platform that can be improved by future student teams.</w:t>
+      </w:r>
+    </w:p>
+    <w:p>
+      <w:pPr>
+        <w:pStyle w:val="BodyText"/>
+        <w:bidi w:val="0"/>
+        <w:spacing w:before="0" w:after="140"/>
+        <w:jc w:val="both"/>
+        <w:rPr/>
+      </w:pPr>
+      <w:r>
+        <w:rPr>
+          <w:rStyle w:val="Strong"/>
+        </w:rPr>
+        <w:t>Important:</w:t>
+      </w:r>
+      <w:r>
+        <w:rPr/>
+        <w:t xml:space="preserve"> Identify one primary beneficiary before the presentation whenever possible. A stakeholder interview or support letter will strengthen this slide.</w:t>
+      </w:r>
+    </w:p>
+    <w:p>
+      <w:pPr>
+        <w:pStyle w:val="BodyText"/>
+        <w:bidi w:val="0"/>
+        <w:spacing w:before="0" w:after="140"/>
+        <w:jc w:val="both"/>
+        <w:rPr/>
+      </w:pPr>
+      <w:r>
+        <w:rPr>
+          <w:rStyle w:val="Strong"/>
+        </w:rPr>
+        <w:t>Taglish presentation script:</w:t>
       </w:r>
     </w:p>
     <w:p>
@@ -1806,153 +2057,7 @@
       </w:pPr>
       <w:r>
         <w:rPr/>
-        <w:t>invention of an individual sensor, buoy, or machine-learning algorithm.</w:t>
-      </w:r>
-    </w:p>
-    <w:p>
-      <w:pPr>
-        <w:pStyle w:val="Heading2"/>
-        <w:numPr>
-          <w:ilvl w:val="0"/>
-          <w:numId w:val="0"/>
-        </w:numPr>
-        <w:pBdr/>
-        <w:bidi w:val="0"/>
-        <w:spacing w:before="400" w:after="120"/>
-        <w:jc w:val="start"/>
-        <w:rPr/>
-      </w:pPr>
-      <w:r>
-        <w:rPr/>
-        <w:t>Slide 7 — Intended Beneficiaries and Value</w:t>
-      </w:r>
-    </w:p>
-    <w:p>
-      <w:pPr>
-        <w:pStyle w:val="BodyText"/>
-        <w:bidi w:val="0"/>
-        <w:spacing w:before="0" w:after="140"/>
-        <w:jc w:val="both"/>
-        <w:rPr/>
-      </w:pPr>
-      <w:r>
-        <w:rPr/>
-        <w:t>Potential beneficiaries include:</w:t>
-      </w:r>
-    </w:p>
-    <w:p>
-      <w:pPr>
-        <w:pStyle w:val="BodyText"/>
-        <w:numPr>
-          <w:ilvl w:val="0"/>
-          <w:numId w:val="7"/>
-        </w:numPr>
-        <w:tabs>
-          <w:tab w:val="clear" w:pos="1134"/>
-          <w:tab w:val="left" w:pos="709" w:leader="none"/>
-        </w:tabs>
-        <w:bidi w:val="0"/>
-        <w:spacing w:before="0" w:after="0"/>
-        <w:ind w:hanging="283" w:start="709"/>
-        <w:rPr/>
-      </w:pPr>
-      <w:r>
-        <w:rPr/>
-        <w:t xml:space="preserve">coastal local government and disaster-management offices; </w:t>
-      </w:r>
-    </w:p>
-    <w:p>
-      <w:pPr>
-        <w:pStyle w:val="BodyText"/>
-        <w:numPr>
-          <w:ilvl w:val="0"/>
-          <w:numId w:val="7"/>
-        </w:numPr>
-        <w:tabs>
-          <w:tab w:val="clear" w:pos="1134"/>
-          <w:tab w:val="left" w:pos="709" w:leader="none"/>
-        </w:tabs>
-        <w:bidi w:val="0"/>
-        <w:spacing w:before="0" w:after="0"/>
-        <w:ind w:hanging="283" w:start="709"/>
-        <w:rPr/>
-      </w:pPr>
-      <w:r>
-        <w:rPr/>
-        <w:t xml:space="preserve">fisherfolk and small-craft communities; </w:t>
-      </w:r>
-    </w:p>
-    <w:p>
-      <w:pPr>
-        <w:pStyle w:val="BodyText"/>
-        <w:numPr>
-          <w:ilvl w:val="0"/>
-          <w:numId w:val="7"/>
-        </w:numPr>
-        <w:tabs>
-          <w:tab w:val="clear" w:pos="1134"/>
-          <w:tab w:val="left" w:pos="709" w:leader="none"/>
-        </w:tabs>
-        <w:bidi w:val="0"/>
-        <w:spacing w:before="0" w:after="0"/>
-        <w:ind w:hanging="283" w:start="709"/>
-        <w:rPr/>
-      </w:pPr>
-      <w:r>
-        <w:rPr/>
-        <w:t xml:space="preserve">schools and marine researchers; </w:t>
-      </w:r>
-    </w:p>
-    <w:p>
-      <w:pPr>
-        <w:pStyle w:val="BodyText"/>
-        <w:numPr>
-          <w:ilvl w:val="0"/>
-          <w:numId w:val="7"/>
-        </w:numPr>
-        <w:tabs>
-          <w:tab w:val="clear" w:pos="1134"/>
-          <w:tab w:val="left" w:pos="709" w:leader="none"/>
-        </w:tabs>
-        <w:bidi w:val="0"/>
-        <w:ind w:hanging="283" w:start="709"/>
-        <w:rPr/>
-      </w:pPr>
-      <w:r>
-        <w:rPr/>
-        <w:t xml:space="preserve">ports, coastal tourism operators, and environmental organizations. </w:t>
-      </w:r>
-    </w:p>
-    <w:p>
-      <w:pPr>
-        <w:pStyle w:val="BodyText"/>
-        <w:bidi w:val="0"/>
-        <w:spacing w:before="0" w:after="140"/>
-        <w:jc w:val="both"/>
-        <w:rPr/>
-      </w:pPr>
-      <w:r>
-        <w:rPr/>
-        <w:t>Potential value includes localized observation history, accessible visualization, research data, equipment-health awareness, and a platform that can be improved by future student teams.</w:t>
-      </w:r>
-    </w:p>
-    <w:p>
-      <w:pPr>
-        <w:pStyle w:val="BodyText"/>
-        <w:bidi w:val="0"/>
-        <w:spacing w:before="0" w:after="140"/>
-        <w:jc w:val="both"/>
-        <w:rPr/>
-      </w:pPr>
-      <w:r>
-        <w:rPr>
-          <w:rStyle w:val="Strong"/>
-        </w:rPr>
-        <w:t>Important:</w:t>
-      </w:r>
-      <w:r>
-        <w:rPr/>
-        <w:t xml:space="preserve"> Identify one primary beneficiary before the presentation whenever possible. A stakeholder interview or support letter will strengthen this slide.</w:t>
+        <w:t>Ang possible beneficiaries ng project ay coastal LGUs at disaster-management offices, fisherfolk at small-craft communities, schools at marine researchers, ports, tourism operators, at environmental organizations. Makakatulong ang FALCON sa pagkakaroon ng localized observation history, mas accessible na data visualization, research dataset, at awareness sa condition ng equipment. Gayunman, hindi namin gustong sabihing para agad ito sa lahat. Bago ang actual pilot, pipili kami ng isang primary beneficiary at specific site sa Palawan, aalamin ang tunay nilang information needs, at ia-adjust ang deployment at dashboard ayon sa responsible at realistic na use case.</w:t>
       </w:r>
     </w:p>
     <w:p>
@@ -2503,6 +2608,38 @@
     </w:p>
     <w:p>
       <w:pPr>
+        <w:pStyle w:val="BodyText"/>
+        <w:bidi w:val="0"/>
+        <w:spacing w:before="0" w:after="140"/>
+        <w:jc w:val="both"/>
+        <w:rPr/>
+      </w:pPr>
+      <w:r>
+        <w:rPr>
+          <w:rStyle w:val="Strong"/>
+        </w:rPr>
+        <w:t>Taglish presentation script:</w:t>
+      </w:r>
+    </w:p>
+    <w:p>
+      <w:pPr>
+        <w:pStyle w:val="BlockQuotation"/>
+        <w:pBdr>
+          <w:left w:val="single" w:sz="30" w:space="12" w:color="4F7D96"/>
+        </w:pBdr>
+        <w:bidi w:val="0"/>
+        <w:spacing w:before="200" w:after="200"/>
+        <w:ind w:hanging="0" w:start="200" w:end="200"/>
+        <w:jc w:val="start"/>
+        <w:rPr/>
+      </w:pPr>
+      <w:r>
+        <w:rPr/>
+        <w:t>Kapag nabigyan ng support, hahatiin namin ang development sa malinaw na phases. Magsisimula kami sa final design at procurement, kasunod ang electronics at sensor integration. Pagkatapos ay fabrication at sealing ng buoy, calibration, at controlled testing. Kapag pumasa sa basic safety at reliability tests, saka kami magsasagawa ng supervised coastal pilot at data collection. Ang collected at validated data ang gagamitin sa model training at baseline comparison. Magtatapos ang project sa final system evaluation, demonstration, at technical reporting. Ang realistic estimate namin ay eight to twelve months, dahil maaari itong maapektuhan ng procurement, weather, permits, site access, at sapat na data.</w:t>
+      </w:r>
+    </w:p>
+    <w:p>
+      <w:pPr>
         <w:pStyle w:val="Heading2"/>
         <w:numPr>
           <w:ilvl w:val="0"/>
@@ -2929,6 +3066,38 @@
     </w:p>
     <w:p>
       <w:pPr>
+        <w:pStyle w:val="BodyText"/>
+        <w:bidi w:val="0"/>
+        <w:spacing w:before="0" w:after="140"/>
+        <w:jc w:val="both"/>
+        <w:rPr/>
+      </w:pPr>
+      <w:r>
+        <w:rPr>
+          <w:rStyle w:val="Strong"/>
+        </w:rPr>
+        <w:t>Taglish presentation script:</w:t>
+      </w:r>
+    </w:p>
+    <w:p>
+      <w:pPr>
+        <w:pStyle w:val="BlockQuotation"/>
+        <w:pBdr>
+          <w:left w:val="single" w:sz="30" w:space="12" w:color="4F7D96"/>
+        </w:pBdr>
+        <w:bidi w:val="0"/>
+        <w:spacing w:before="200" w:after="200"/>
+        <w:ind w:hanging="0" w:start="200" w:end="200"/>
+        <w:jc w:val="start"/>
+        <w:rPr/>
+      </w:pPr>
+      <w:r>
+        <w:rPr/>
+        <w:t>Para sa preliminary funding plan, ang indicative development request ay mula seventy-two thousand hanggang one hundred twenty-seven thousand pesos. Hindi lang po ito presyo ng sensors. Kasama rito ang embedded electronics, Orange Pi, solar at battery system, marine enclosure at structure, mooring at anchor, calibration or reference tools, fabrication, field testing, transport, spare parts, at contingency. Planning range pa lamang ito at papalitan namin ng actual supplier quotations bago ang formal procurement. Hihiwalay rin namin ang reusable tools sa components na permanenteng mai-install sa prototype para transparent at madaling i-review ang budget.</w:t>
+      </w:r>
+    </w:p>
+    <w:p>
+      <w:pPr>
         <w:pStyle w:val="Heading2"/>
         <w:numPr>
           <w:ilvl w:val="0"/>
@@ -3152,7 +3321,22 @@
       </w:pPr>
       <w:r>
         <w:rPr/>
-        <w:t>We are not asking you to accept an untested prediction as an operational</w:t>
+        <w:t>We are not asking you to accept an untested prediction as an operational product. We are asking for the opportunity to turn a documented and working software concept into a calibrated physical prototype, generate local evidence, and determine its real technical and community value through responsible testing.</w:t>
+      </w:r>
+    </w:p>
+    <w:p>
+      <w:pPr>
+        <w:pStyle w:val="BodyText"/>
+        <w:bidi w:val="0"/>
+        <w:spacing w:before="0" w:after="140"/>
+        <w:jc w:val="both"/>
+        <w:rPr/>
+      </w:pPr>
+      <w:r>
+        <w:rPr>
+          <w:rStyle w:val="Strong"/>
+        </w:rPr>
+        <w:t>Taglish presentation script:</w:t>
       </w:r>
     </w:p>
     <w:p>
@@ -3169,7 +3353,277 @@
       </w:pPr>
       <w:r>
         <w:rPr/>
-        <w:t>product. We are asking for the opportunity to turn a documented and working</w:t>
+        <w:t>Kapag natapos ang funded development, target naming ma-deliver ang isang integrated at documented physical prototype, calibrated sensors at power subsystem, local dashboard at data archive, supervised coastal-test results, model-versus-baseline evaluation, at reports para sa power, communication, waterproofing, stability, at alert performance. Kasama rin ang reproducible source code, wiring, bill of materials, at operating documentation. Ang hinihingi naming support ay para sa component procurement, fabrication, calibration, supervised field testing, at technical mentorship. Hindi po namin hinihinging tanggapin agad ang untested AI bilang operational forecast. Ang hinihingi namin ay pagkakataong gawing calibrated at evidence-based physical prototype ang working concept na na-develop na namin. Maraming salamat po, at handa kaming sagutin ang inyong mga tanong.</w:t>
+      </w:r>
+    </w:p>
+    <w:p>
+      <w:pPr>
+        <w:pStyle w:val="Heading1"/>
+        <w:bidi w:val="0"/>
+        <w:jc w:val="center"/>
+        <w:rPr/>
+      </w:pPr>
+      <w:r>
+        <w:rPr/>
+        <w:t>3. Dashboard Demonstration Script</w:t>
+      </w:r>
+    </w:p>
+    <w:p>
+      <w:pPr>
+        <w:pStyle w:val="BodyText"/>
+        <w:bidi w:val="0"/>
+        <w:spacing w:before="0" w:after="140"/>
+        <w:jc w:val="both"/>
+        <w:rPr/>
+      </w:pPr>
+      <w:r>
+        <w:rPr/>
+        <w:t xml:space="preserve">Target duration: </w:t>
+      </w:r>
+      <w:r>
+        <w:rPr>
+          <w:rStyle w:val="Strong"/>
+        </w:rPr>
+        <w:t>3–5 minutes</w:t>
+      </w:r>
+      <w:r>
+        <w:rPr/>
+        <w:t>.</w:t>
+      </w:r>
+    </w:p>
+    <w:p>
+      <w:pPr>
+        <w:pStyle w:val="BodyText"/>
+        <w:numPr>
+          <w:ilvl w:val="0"/>
+          <w:numId w:val="9"/>
+        </w:numPr>
+        <w:tabs>
+          <w:tab w:val="clear" w:pos="1134"/>
+          <w:tab w:val="left" w:pos="709" w:leader="none"/>
+        </w:tabs>
+        <w:bidi w:val="0"/>
+        <w:spacing w:before="0" w:after="0"/>
+        <w:ind w:hanging="283" w:start="709"/>
+        <w:rPr/>
+      </w:pPr>
+      <w:r>
+        <w:rPr/>
+        <w:t xml:space="preserve">Open the Overview page and identify the simulator source label. </w:t>
+      </w:r>
+    </w:p>
+    <w:p>
+      <w:pPr>
+        <w:pStyle w:val="BodyText"/>
+        <w:numPr>
+          <w:ilvl w:val="0"/>
+          <w:numId w:val="9"/>
+        </w:numPr>
+        <w:tabs>
+          <w:tab w:val="clear" w:pos="1134"/>
+          <w:tab w:val="left" w:pos="709" w:leader="none"/>
+        </w:tabs>
+        <w:bidi w:val="0"/>
+        <w:spacing w:before="0" w:after="0"/>
+        <w:ind w:hanging="283" w:start="709"/>
+        <w:rPr/>
+      </w:pPr>
+      <w:r>
+        <w:rPr/>
+        <w:t xml:space="preserve">Explain that the present values demonstrate the intended telemetry pipeline. </w:t>
+      </w:r>
+    </w:p>
+    <w:p>
+      <w:pPr>
+        <w:pStyle w:val="BodyText"/>
+        <w:numPr>
+          <w:ilvl w:val="0"/>
+          <w:numId w:val="9"/>
+        </w:numPr>
+        <w:tabs>
+          <w:tab w:val="clear" w:pos="1134"/>
+          <w:tab w:val="left" w:pos="709" w:leader="none"/>
+        </w:tabs>
+        <w:bidi w:val="0"/>
+        <w:spacing w:before="0" w:after="0"/>
+        <w:ind w:hanging="283" w:start="709"/>
+        <w:rPr/>
+      </w:pPr>
+      <w:r>
+        <w:rPr/>
+        <w:t xml:space="preserve">Open Wave AI and show measured history, the present boundary, and forecast side. </w:t>
+      </w:r>
+    </w:p>
+    <w:p>
+      <w:pPr>
+        <w:pStyle w:val="BodyText"/>
+        <w:numPr>
+          <w:ilvl w:val="0"/>
+          <w:numId w:val="9"/>
+        </w:numPr>
+        <w:tabs>
+          <w:tab w:val="clear" w:pos="1134"/>
+          <w:tab w:val="left" w:pos="709" w:leader="none"/>
+        </w:tabs>
+        <w:bidi w:val="0"/>
+        <w:spacing w:before="0" w:after="0"/>
+        <w:ind w:hanging="283" w:start="709"/>
+        <w:rPr/>
+      </w:pPr>
+      <w:r>
+        <w:rPr/>
+        <w:t xml:space="preserve">State clearly that the forecast is a presentation model, not a field-trained AI. </w:t>
+      </w:r>
+    </w:p>
+    <w:p>
+      <w:pPr>
+        <w:pStyle w:val="BodyText"/>
+        <w:numPr>
+          <w:ilvl w:val="0"/>
+          <w:numId w:val="9"/>
+        </w:numPr>
+        <w:tabs>
+          <w:tab w:val="clear" w:pos="1134"/>
+          <w:tab w:val="left" w:pos="709" w:leader="none"/>
+        </w:tabs>
+        <w:bidi w:val="0"/>
+        <w:spacing w:before="0" w:after="0"/>
+        <w:ind w:hanging="283" w:start="709"/>
+        <w:rPr/>
+      </w:pPr>
+      <w:r>
+        <w:rPr/>
+        <w:t xml:space="preserve">Open Motion to demonstrate orientation and sea visualization. </w:t>
+      </w:r>
+    </w:p>
+    <w:p>
+      <w:pPr>
+        <w:pStyle w:val="BodyText"/>
+        <w:numPr>
+          <w:ilvl w:val="0"/>
+          <w:numId w:val="9"/>
+        </w:numPr>
+        <w:tabs>
+          <w:tab w:val="clear" w:pos="1134"/>
+          <w:tab w:val="left" w:pos="709" w:leader="none"/>
+        </w:tabs>
+        <w:bidi w:val="0"/>
+        <w:spacing w:before="0" w:after="0"/>
+        <w:ind w:hanging="283" w:start="709"/>
+        <w:rPr/>
+      </w:pPr>
+      <w:r>
+        <w:rPr/>
+        <w:t xml:space="preserve">Open GPS and explain the proposed reference point, geofence, and drift logic. </w:t>
+      </w:r>
+    </w:p>
+    <w:p>
+      <w:pPr>
+        <w:pStyle w:val="BodyText"/>
+        <w:numPr>
+          <w:ilvl w:val="0"/>
+          <w:numId w:val="9"/>
+        </w:numPr>
+        <w:tabs>
+          <w:tab w:val="clear" w:pos="1134"/>
+          <w:tab w:val="left" w:pos="709" w:leader="none"/>
+        </w:tabs>
+        <w:bidi w:val="0"/>
+        <w:spacing w:before="0" w:after="0"/>
+        <w:ind w:hanging="283" w:start="709"/>
+        <w:rPr/>
+      </w:pPr>
+      <w:r>
+        <w:rPr/>
+        <w:t xml:space="preserve">Open Power to show battery, solar, temperature, and energy monitoring. </w:t>
+      </w:r>
+    </w:p>
+    <w:p>
+      <w:pPr>
+        <w:pStyle w:val="BodyText"/>
+        <w:numPr>
+          <w:ilvl w:val="0"/>
+          <w:numId w:val="9"/>
+        </w:numPr>
+        <w:tabs>
+          <w:tab w:val="clear" w:pos="1134"/>
+          <w:tab w:val="left" w:pos="709" w:leader="none"/>
+        </w:tabs>
+        <w:bidi w:val="0"/>
+        <w:spacing w:before="0" w:after="0"/>
+        <w:ind w:hanging="283" w:start="709"/>
+        <w:rPr/>
+      </w:pPr>
+      <w:r>
+        <w:rPr/>
+        <w:t xml:space="preserve">Trigger one simulator fault scenario and show how the dashboard displays alerts. </w:t>
+      </w:r>
+    </w:p>
+    <w:p>
+      <w:pPr>
+        <w:pStyle w:val="BodyText"/>
+        <w:numPr>
+          <w:ilvl w:val="0"/>
+          <w:numId w:val="9"/>
+        </w:numPr>
+        <w:tabs>
+          <w:tab w:val="clear" w:pos="1134"/>
+          <w:tab w:val="left" w:pos="709" w:leader="none"/>
+        </w:tabs>
+        <w:bidi w:val="0"/>
+        <w:ind w:hanging="283" w:start="709"/>
+        <w:rPr/>
+      </w:pPr>
+      <w:r>
+        <w:rPr/>
+        <w:t xml:space="preserve">Return to Overview and explain what funding enables next: actual components, </w:t>
+      </w:r>
+    </w:p>
+    <w:p>
+      <w:pPr>
+        <w:pStyle w:val="BodyText"/>
+        <w:numPr>
+          <w:ilvl w:val="0"/>
+          <w:numId w:val="0"/>
+        </w:numPr>
+        <w:bidi w:val="0"/>
+        <w:ind w:hanging="0" w:start="0"/>
+        <w:rPr/>
+      </w:pPr>
+      <w:r>
+        <w:rPr/>
+        <w:t>calibrated inputs, field data, trained model, and validation.</w:t>
+      </w:r>
+    </w:p>
+    <w:p>
+      <w:pPr>
+        <w:pStyle w:val="Heading2"/>
+        <w:numPr>
+          <w:ilvl w:val="0"/>
+          <w:numId w:val="0"/>
+        </w:numPr>
+        <w:pBdr/>
+        <w:bidi w:val="0"/>
+        <w:spacing w:before="400" w:after="120"/>
+        <w:jc w:val="start"/>
+        <w:rPr/>
+      </w:pPr>
+      <w:r>
+        <w:rPr/>
+        <w:t>Demonstration disclosure</w:t>
+      </w:r>
+    </w:p>
+    <w:p>
+      <w:pPr>
+        <w:pStyle w:val="BodyText"/>
+        <w:bidi w:val="0"/>
+        <w:spacing w:before="0" w:after="140"/>
+        <w:jc w:val="both"/>
+        <w:rPr/>
+      </w:pPr>
+      <w:r>
+        <w:rPr/>
+        <w:t>Say this before or during the demo:</w:t>
       </w:r>
     </w:p>
     <w:p>
@@ -3186,379 +3640,7 @@
       </w:pPr>
       <w:r>
         <w:rPr/>
-        <w:t>software concept into a calibrated physical prototype, generate local evidence,</w:t>
-      </w:r>
-    </w:p>
-    <w:p>
-      <w:pPr>
-        <w:pStyle w:val="BlockQuotation"/>
-        <w:pBdr>
-          <w:left w:val="single" w:sz="30" w:space="12" w:color="4F7D96"/>
-        </w:pBdr>
-        <w:bidi w:val="0"/>
-        <w:spacing w:before="200" w:after="200"/>
-        <w:ind w:hanging="0" w:start="200" w:end="200"/>
-        <w:jc w:val="start"/>
-        <w:rPr/>
-      </w:pPr>
-      <w:r>
-        <w:rPr/>
-        <w:t>and determine its real technical and community value through responsible testing.</w:t>
-      </w:r>
-    </w:p>
-    <w:p>
-      <w:pPr>
-        <w:pStyle w:val="Heading1"/>
-        <w:bidi w:val="0"/>
-        <w:jc w:val="center"/>
-        <w:rPr/>
-      </w:pPr>
-      <w:r>
-        <w:rPr/>
-        <w:t>3. Dashboard Demonstration Script</w:t>
-      </w:r>
-    </w:p>
-    <w:p>
-      <w:pPr>
-        <w:pStyle w:val="BodyText"/>
-        <w:bidi w:val="0"/>
-        <w:spacing w:before="0" w:after="140"/>
-        <w:jc w:val="both"/>
-        <w:rPr/>
-      </w:pPr>
-      <w:r>
-        <w:rPr/>
-        <w:t xml:space="preserve">Target duration: </w:t>
-      </w:r>
-      <w:r>
-        <w:rPr>
-          <w:rStyle w:val="Strong"/>
-        </w:rPr>
-        <w:t>3–5 minutes</w:t>
-      </w:r>
-      <w:r>
-        <w:rPr/>
-        <w:t>.</w:t>
-      </w:r>
-    </w:p>
-    <w:p>
-      <w:pPr>
-        <w:pStyle w:val="BodyText"/>
-        <w:numPr>
-          <w:ilvl w:val="0"/>
-          <w:numId w:val="9"/>
-        </w:numPr>
-        <w:tabs>
-          <w:tab w:val="clear" w:pos="1134"/>
-          <w:tab w:val="left" w:pos="709" w:leader="none"/>
-        </w:tabs>
-        <w:bidi w:val="0"/>
-        <w:spacing w:before="0" w:after="0"/>
-        <w:ind w:hanging="283" w:start="709"/>
-        <w:rPr/>
-      </w:pPr>
-      <w:r>
-        <w:rPr/>
-        <w:t xml:space="preserve">Open the Overview page and identify the simulator source label. </w:t>
-      </w:r>
-    </w:p>
-    <w:p>
-      <w:pPr>
-        <w:pStyle w:val="BodyText"/>
-        <w:numPr>
-          <w:ilvl w:val="0"/>
-          <w:numId w:val="9"/>
-        </w:numPr>
-        <w:tabs>
-          <w:tab w:val="clear" w:pos="1134"/>
-          <w:tab w:val="left" w:pos="709" w:leader="none"/>
-        </w:tabs>
-        <w:bidi w:val="0"/>
-        <w:spacing w:before="0" w:after="0"/>
-        <w:ind w:hanging="283" w:start="709"/>
-        <w:rPr/>
-      </w:pPr>
-      <w:r>
-        <w:rPr/>
-        <w:t xml:space="preserve">Explain that the present values demonstrate the intended telemetry pipeline. </w:t>
-      </w:r>
-    </w:p>
-    <w:p>
-      <w:pPr>
-        <w:pStyle w:val="BodyText"/>
-        <w:numPr>
-          <w:ilvl w:val="0"/>
-          <w:numId w:val="9"/>
-        </w:numPr>
-        <w:tabs>
-          <w:tab w:val="clear" w:pos="1134"/>
-          <w:tab w:val="left" w:pos="709" w:leader="none"/>
-        </w:tabs>
-        <w:bidi w:val="0"/>
-        <w:spacing w:before="0" w:after="0"/>
-        <w:ind w:hanging="283" w:start="709"/>
-        <w:rPr/>
-      </w:pPr>
-      <w:r>
-        <w:rPr/>
-        <w:t xml:space="preserve">Open Wave AI and show measured history, the present boundary, and forecast side. </w:t>
-      </w:r>
-    </w:p>
-    <w:p>
-      <w:pPr>
-        <w:pStyle w:val="BodyText"/>
-        <w:numPr>
-          <w:ilvl w:val="0"/>
-          <w:numId w:val="9"/>
-        </w:numPr>
-        <w:tabs>
-          <w:tab w:val="clear" w:pos="1134"/>
-          <w:tab w:val="left" w:pos="709" w:leader="none"/>
-        </w:tabs>
-        <w:bidi w:val="0"/>
-        <w:spacing w:before="0" w:after="0"/>
-        <w:ind w:hanging="283" w:start="709"/>
-        <w:rPr/>
-      </w:pPr>
-      <w:r>
-        <w:rPr/>
-        <w:t xml:space="preserve">State clearly that the forecast is a presentation model, not a field-trained AI. </w:t>
-      </w:r>
-    </w:p>
-    <w:p>
-      <w:pPr>
-        <w:pStyle w:val="BodyText"/>
-        <w:numPr>
-          <w:ilvl w:val="0"/>
-          <w:numId w:val="9"/>
-        </w:numPr>
-        <w:tabs>
-          <w:tab w:val="clear" w:pos="1134"/>
-          <w:tab w:val="left" w:pos="709" w:leader="none"/>
-        </w:tabs>
-        <w:bidi w:val="0"/>
-        <w:spacing w:before="0" w:after="0"/>
-        <w:ind w:hanging="283" w:start="709"/>
-        <w:rPr/>
-      </w:pPr>
-      <w:r>
-        <w:rPr/>
-        <w:t xml:space="preserve">Open Motion to demonstrate orientation and sea visualization. </w:t>
-      </w:r>
-    </w:p>
-    <w:p>
-      <w:pPr>
-        <w:pStyle w:val="BodyText"/>
-        <w:numPr>
-          <w:ilvl w:val="0"/>
-          <w:numId w:val="9"/>
-        </w:numPr>
-        <w:tabs>
-          <w:tab w:val="clear" w:pos="1134"/>
-          <w:tab w:val="left" w:pos="709" w:leader="none"/>
-        </w:tabs>
-        <w:bidi w:val="0"/>
-        <w:spacing w:before="0" w:after="0"/>
-        <w:ind w:hanging="283" w:start="709"/>
-        <w:rPr/>
-      </w:pPr>
-      <w:r>
-        <w:rPr/>
-        <w:t xml:space="preserve">Open GPS and explain the proposed reference point, geofence, and drift logic. </w:t>
-      </w:r>
-    </w:p>
-    <w:p>
-      <w:pPr>
-        <w:pStyle w:val="BodyText"/>
-        <w:numPr>
-          <w:ilvl w:val="0"/>
-          <w:numId w:val="9"/>
-        </w:numPr>
-        <w:tabs>
-          <w:tab w:val="clear" w:pos="1134"/>
-          <w:tab w:val="left" w:pos="709" w:leader="none"/>
-        </w:tabs>
-        <w:bidi w:val="0"/>
-        <w:spacing w:before="0" w:after="0"/>
-        <w:ind w:hanging="283" w:start="709"/>
-        <w:rPr/>
-      </w:pPr>
-      <w:r>
-        <w:rPr/>
-        <w:t xml:space="preserve">Open Power to show battery, solar, temperature, and energy monitoring. </w:t>
-      </w:r>
-    </w:p>
-    <w:p>
-      <w:pPr>
-        <w:pStyle w:val="BodyText"/>
-        <w:numPr>
-          <w:ilvl w:val="0"/>
-          <w:numId w:val="9"/>
-        </w:numPr>
-        <w:tabs>
-          <w:tab w:val="clear" w:pos="1134"/>
-          <w:tab w:val="left" w:pos="709" w:leader="none"/>
-        </w:tabs>
-        <w:bidi w:val="0"/>
-        <w:spacing w:before="0" w:after="0"/>
-        <w:ind w:hanging="283" w:start="709"/>
-        <w:rPr/>
-      </w:pPr>
-      <w:r>
-        <w:rPr/>
-        <w:t xml:space="preserve">Trigger one simulator fault scenario and show how the dashboard displays alerts. </w:t>
-      </w:r>
-    </w:p>
-    <w:p>
-      <w:pPr>
-        <w:pStyle w:val="BodyText"/>
-        <w:numPr>
-          <w:ilvl w:val="0"/>
-          <w:numId w:val="9"/>
-        </w:numPr>
-        <w:tabs>
-          <w:tab w:val="clear" w:pos="1134"/>
-          <w:tab w:val="left" w:pos="709" w:leader="none"/>
-        </w:tabs>
-        <w:bidi w:val="0"/>
-        <w:ind w:hanging="283" w:start="709"/>
-        <w:rPr/>
-      </w:pPr>
-      <w:r>
-        <w:rPr/>
-        <w:t xml:space="preserve">Return to Overview and explain what funding enables next: actual components, </w:t>
-      </w:r>
-    </w:p>
-    <w:p>
-      <w:pPr>
-        <w:pStyle w:val="BodyText"/>
-        <w:numPr>
-          <w:ilvl w:val="0"/>
-          <w:numId w:val="0"/>
-        </w:numPr>
-        <w:bidi w:val="0"/>
-        <w:ind w:hanging="0" w:start="0"/>
-        <w:rPr/>
-      </w:pPr>
-      <w:r>
-        <w:rPr/>
-        <w:t>calibrated inputs, field data, trained model, and validation.</w:t>
-      </w:r>
-    </w:p>
-    <w:p>
-      <w:pPr>
-        <w:pStyle w:val="Heading2"/>
-        <w:numPr>
-          <w:ilvl w:val="0"/>
-          <w:numId w:val="0"/>
-        </w:numPr>
-        <w:pBdr/>
-        <w:bidi w:val="0"/>
-        <w:spacing w:before="400" w:after="120"/>
-        <w:jc w:val="start"/>
-        <w:rPr/>
-      </w:pPr>
-      <w:r>
-        <w:rPr/>
-        <w:t>Demonstration disclosure</w:t>
-      </w:r>
-    </w:p>
-    <w:p>
-      <w:pPr>
-        <w:pStyle w:val="BodyText"/>
-        <w:bidi w:val="0"/>
-        <w:spacing w:before="0" w:after="140"/>
-        <w:jc w:val="both"/>
-        <w:rPr/>
-      </w:pPr>
-      <w:r>
-        <w:rPr/>
-        <w:t>Say this before or during the demo:</w:t>
-      </w:r>
-    </w:p>
-    <w:p>
-      <w:pPr>
-        <w:pStyle w:val="BlockQuotation"/>
-        <w:pBdr>
-          <w:left w:val="single" w:sz="30" w:space="12" w:color="4F7D96"/>
-        </w:pBdr>
-        <w:bidi w:val="0"/>
-        <w:spacing w:before="200" w:after="200"/>
-        <w:ind w:hanging="0" w:start="200" w:end="200"/>
-        <w:jc w:val="start"/>
-        <w:rPr/>
-      </w:pPr>
-      <w:r>
-        <w:rPr/>
-        <w:t>The dashboard is connected to our operational edge-service simulator. The</w:t>
-      </w:r>
-    </w:p>
-    <w:p>
-      <w:pPr>
-        <w:pStyle w:val="BlockQuotation"/>
-        <w:pBdr>
-          <w:left w:val="single" w:sz="30" w:space="12" w:color="4F7D96"/>
-        </w:pBdr>
-        <w:bidi w:val="0"/>
-        <w:spacing w:before="200" w:after="200"/>
-        <w:ind w:hanging="0" w:start="200" w:end="200"/>
-        <w:jc w:val="start"/>
-        <w:rPr/>
-      </w:pPr>
-      <w:r>
-        <w:rPr/>
-        <w:t>simulator produces coherent test telemetry so we can validate the interface,</w:t>
-      </w:r>
-    </w:p>
-    <w:p>
-      <w:pPr>
-        <w:pStyle w:val="BlockQuotation"/>
-        <w:pBdr>
-          <w:left w:val="single" w:sz="30" w:space="12" w:color="4F7D96"/>
-        </w:pBdr>
-        <w:bidi w:val="0"/>
-        <w:spacing w:before="200" w:after="200"/>
-        <w:ind w:hanging="0" w:start="200" w:end="200"/>
-        <w:jc w:val="start"/>
-        <w:rPr/>
-      </w:pPr>
-      <w:r>
-        <w:rPr/>
-        <w:t>database, API, alerts, and workflow before risking physical hardware. These are</w:t>
-      </w:r>
-    </w:p>
-    <w:p>
-      <w:pPr>
-        <w:pStyle w:val="BlockQuotation"/>
-        <w:pBdr>
-          <w:left w:val="single" w:sz="30" w:space="12" w:color="4F7D96"/>
-        </w:pBdr>
-        <w:bidi w:val="0"/>
-        <w:spacing w:before="200" w:after="200"/>
-        <w:ind w:hanging="0" w:start="200" w:end="200"/>
-        <w:jc w:val="start"/>
-        <w:rPr/>
-      </w:pPr>
-      <w:r>
-        <w:rPr/>
-        <w:t>not live ocean measurements. Actual measurement and AI validation are part of</w:t>
-      </w:r>
-    </w:p>
-    <w:p>
-      <w:pPr>
-        <w:pStyle w:val="BlockQuotation"/>
-        <w:pBdr>
-          <w:left w:val="single" w:sz="30" w:space="12" w:color="4F7D96"/>
-        </w:pBdr>
-        <w:bidi w:val="0"/>
-        <w:spacing w:before="200" w:after="200"/>
-        <w:ind w:hanging="0" w:start="200" w:end="200"/>
-        <w:jc w:val="start"/>
-        <w:rPr/>
-      </w:pPr>
-      <w:r>
-        <w:rPr/>
-        <w:t>the proposed funded development.</w:t>
+        <w:t>The dashboard is connected to our operational edge-service simulator. The simulator produces coherent test telemetry so we can validate the interface, database, API, alerts, and workflow before risking physical hardware. These are not live ocean measurements. Actual measurement and AI validation are part of the proposed funded development.</w:t>
       </w:r>
     </w:p>
     <w:p>

</xml_diff>

<commit_message>
docs: simplify DOST scripts with English Taglish
</commit_message>
<xml_diff>
--- a/THESIS DOCUMENTATION/DOST_Idea_Presentation_Package.docx
+++ b/THESIS DOCUMENTATION/DOST_Idea_Presentation_Package.docx
@@ -40,7 +40,7 @@
       </w:pPr>
       <w:r>
         <w:rPr/>
-        <w:t>Pitch Deck Content, Per-Slide Taglish Scripts, Demo Guide,</w:t>
+        <w:t>Pitch Deck Content, English-Dominant Taglish Scripts, Demo Guide,</w:t>
         <w:br/>
         <w:t>Budget, Timeline, Panel Q&amp;A, and Checklist</w:t>
       </w:r>
@@ -66,37 +66,6 @@
         <w:t>Fullbright College</w:t>
         <w:br/>
         <w:t>August 2026</w:t>
-      </w:r>
-    </w:p>
-    <w:p>
-      <w:pPr>
-        <w:pStyle w:val="BodyText"/>
-        <w:bidi w:val="0"/>
-        <w:spacing w:before="1000" w:after="140"/>
-        <w:ind w:hanging="0" w:start="0" w:end="0"/>
-        <w:jc w:val="center"/>
-        <w:rPr/>
-      </w:pPr>
-      <w:r>
-        <w:rPr>
-          <w:rStyle w:val="Strong"/>
-        </w:rPr>
-        <w:t>Current stage:</w:t>
-      </w:r>
-      <w:r>
-        <w:rPr/>
-        <w:t xml:space="preserve"> Software and engineering concept prototype</w:t>
-        <w:br/>
-      </w:r>
-      <w:r>
-        <w:rPr>
-          <w:rStyle w:val="Strong"/>
-        </w:rPr>
-        <w:t>Purpose:</w:t>
-      </w:r>
-      <w:r>
-        <w:rPr/>
-        <w:t xml:space="preserve"> Funding for physical development and validation</w:t>
       </w:r>
       <w:r>
         <w:br w:type="page"/>
@@ -620,7 +589,7 @@
       </w:pPr>
       <w:r>
         <w:rPr/>
-        <w:t>Magandang araw po. Kami po ang Project FALCON Research Group mula sa Fullbright College. Ang FALCON ay nangangahulugang Fullbright College's AI-powered Live Coastal Observation Network. Ang proposal namin ay isang affordable at solar-powered smart coastal buoy na ginawa para sa localized wave monitoring. Layunin nitong mangolekta ng coastal data, ipakita ito sa isang madaling maintindihang dashboard, at magsilbing research platform para sa short-term wave prediction at system protection. Sa presentation na ito, ipapakita namin ang problemang gusto naming tugunan, paano gagana ang system, ano na ang nagawa namin, at ano ang kailangan upang mabuo at ma-validate ang physical prototype.</w:t>
+        <w:t>Magandang araw po. Kami po ang Project FALCON Research Group mula sa Fullbright College. FALCON stands for Fullbright College's AI-powered Live Coastal Observation Network. Our proposal is an affordable, solar-powered smart coastal buoy for localized wave monitoring. It will collect coastal data, process it locally, and present the results through an easy-to-use dashboard. It will also serve as a research platform for short-term wave prediction and system protection. Today, we will explain the problem, our proposed solution, our current progress, and the support needed to build and validate the physical prototype.</w:t>
       </w:r>
     </w:p>
     <w:p>
@@ -803,7 +772,7 @@
       </w:pPr>
       <w:r>
         <w:rPr/>
-        <w:t>Ang pangunahing problemang nakita namin ay ang limitadong access sa affordable at location-specific coastal information. May mga official forecast at professional monitoring systems na po, pero maaaring maging mahal at mahirap i-deploy o i-maintain ang specialized equipment para sa maliit na institution o local coastal group. Maaari ring magkaiba ang actual near-shore condition sa isang specific location kumpara sa mas malawak na forecast area. Bukod dito, kailangan ding solusyunan ang intermittent connectivity, limited power, maintenance, at possibility ng abnormal displacement o pagkawala ng buoy. Hindi po namin sinasabing walang existing monitoring; ang target gap namin ay affordable at localized observation para sa intended pilot user.</w:t>
+        <w:t>The main problem is limited access to affordable and location-specific coastal information. Official forecasts and professional monitoring systems already exist, but specialized equipment can be expensive and difficult for a small institution or coastal group to deploy and maintain. Actual near-shore conditions at one site may also differ from a wider forecast area. Continuous monitoring has other challenges, such as unstable connectivity, limited power, maintenance, and possible buoy displacement. So ang target gap namin is not the absence of monitoring. It is the need for a more affordable and localized observation platform for our intended pilot user.</w:t>
       </w:r>
     </w:p>
     <w:p>
@@ -1031,7 +1000,7 @@
       </w:pPr>
       <w:r>
         <w:rPr/>
-        <w:t>Ang proposed solution namin ay Project FALCON. May sensors ito para sa buoy motion, water pressure, wind, GPS position, power, at system health. Ang ESP32 ang regular na kumukuha at nagva-validate ng sensor readings. Pagkatapos, ipinapasa ang data sa Orange Pi Zero 3, na siyang magse-save ng records, magpapatakbo ng local services, at eventually ng validated prediction model. Makikita ng user ang information sa responsive dashboard gamit ang laptop, tablet, o phone. Solar-powered din ang design at may local data buffering para hindi agad mawala ang observations kapag mahina o walang Internet. May proposed GPS at IMU logic din para matukoy ang abnormal movement ng buoy.</w:t>
+        <w:t>Our proposed solution is Project FALCON. The buoy uses sensors for motion, water pressure, wind, GPS position, power, and system health. The ESP32 handles regular sensor acquisition and initial validation. It then sends the data to an Orange Pi Zero 3 for local storage, processing, API services, and eventually a validated prediction model. Users can view the information through a responsive dashboard on a laptop, tablet, or phone. Solar-powered din ang design, and local buffering protects the data during Internet interruptions. We also propose GPS and IMU-based logic for detecting abnormal buoy movement.</w:t>
       </w:r>
     </w:p>
     <w:p>
@@ -1329,7 +1298,7 @@
       </w:pPr>
       <w:r>
         <w:rPr/>
-        <w:t>Ganito po ang magiging flow ng system. Una, kumukuha ng measurements ang wave, motion, wind, GPS, power, at health sensors. Pangalawa, binabasa at chine-check ito ng ESP32 bago i-package bilang telemetry. Pangatlo, ipinapadala ang data sa Orange Pi sa pamamagitan ng USB o UART. Ang Orange Pi naman ang responsible sa local database, signal processing, API, dashboard, at future model inference. Sa huli, makikita ng user ang current measurements, history, alerts, at model output sa FALCON dashboard. Local-first po ang architecture, kaya hindi kailangan ng continuous cloud connection para gumana ang pangunahing monitoring workflow.</w:t>
+        <w:t>This diagram shows the system workflow. First, the sensors collect wave, motion, wind, GPS, power, and health measurements. The ESP32 reads and checks those values, then packages them as telemetry. The data are sent to the Orange Pi through USB or UART. The Orange Pi manages the local database, signal processing, API, dashboard, and future model inference. Finally, the user can view current measurements, historical data, alerts, and model output on the FALCON dashboard. Local-first ang architecture, so the main monitoring workflow does not require a continuous cloud connection.</w:t>
       </w:r>
     </w:p>
     <w:p>
@@ -1657,7 +1626,7 @@
       </w:pPr>
       <w:r>
         <w:rPr/>
-        <w:t>Sa current stage, hindi na lang po ito drawing o raw idea. May working responsive dashboard, sensor at fault simulator, ESP32 firmware foundation, telemetry protocol, Python edge service, local database, API, alerts, wiring diagrams, mechanical concepts, bill of materials, at testing documentation na kami. Na-build na rin nang successful ang ESP32 firmware at dashboard, at pumapasa ang automated edge-service tests. Pero gusto naming maging transparent: simulated data pa ang ginagamit sa demonstration. Hindi pa assembled ang complete physical buoy, hindi pa integrated at calibrated ang actual sensors, at hindi pa field-trained o safety-validated ang AI. Iyon po mismo ang development stage na gusto naming pondohan at maisagawa nang tama.</w:t>
+        <w:t>At the current stage, FALCON is already more than a drawing or raw idea. We have a working responsive dashboard, a sensor and fault simulator, an ESP32 firmware foundation, a telemetry protocol, a Python edge service, a local database, APIs, alerts, wiring diagrams, mechanical concepts, a bill of materials, and testing documents. The firmware and dashboard build successfully, and the automated edge tests pass. However, transparent po kami na simulated data pa ang demo. The complete physical buoy, calibrated sensors, and field-trained AI are not yet finished. Those are the main activities that the requested development support will enable.</w:t>
       </w:r>
     </w:p>
     <w:p>
@@ -1879,7 +1848,7 @@
       </w:pPr>
       <w:r>
         <w:rPr/>
-        <w:t>Ang innovation ng FALCON ay hindi nakabase sa claim na kami ang nakaimbento ng buoy, sensor, o AI algorithm. Ang contribution namin ay ang validated integration at local adaptation ng mga subsystem na ito sa isang affordable at modular platform. Local ang processing kaya hindi mandatory ang cloud. Focused ang sensor scope para manageable ang calibration, cost, at energy. Intended din na malinaw sa dashboard kung simulated, measured, estimated, o predicted ang isang value. Kasama rin sa iisang platform ang wave monitoring, energy status, position, system health, at abnormal-displacement alerts. Ang magiging sukatan ng novelty namin ay hindi dami ng features, kundi kung maayos, reproducible, at validated ang pagsasama ng mga ito para sa local use case.</w:t>
+        <w:t>FALCON does not claim to invent the buoy, the sensors, or the AI algorithm. Our contribution is the validated integration and local adaptation of these technologies in one affordable and modular platform. Processing is performed locally, so cloud access is not mandatory. The sensor scope is focused to keep calibration, cost, and energy requirements manageable. The dashboard is also designed to clearly distinguish simulated, measured, estimated, and predicted values. In short, ang innovation is not based on having the most features. It is based on creating a practical, reproducible, and properly validated system for a defined local use case.</w:t>
       </w:r>
     </w:p>
     <w:p>
@@ -2057,7 +2026,7 @@
       </w:pPr>
       <w:r>
         <w:rPr/>
-        <w:t>Ang possible beneficiaries ng project ay coastal LGUs at disaster-management offices, fisherfolk at small-craft communities, schools at marine researchers, ports, tourism operators, at environmental organizations. Makakatulong ang FALCON sa pagkakaroon ng localized observation history, mas accessible na data visualization, research dataset, at awareness sa condition ng equipment. Gayunman, hindi namin gustong sabihing para agad ito sa lahat. Bago ang actual pilot, pipili kami ng isang primary beneficiary at specific site sa Palawan, aalamin ang tunay nilang information needs, at ia-adjust ang deployment at dashboard ayon sa responsible at realistic na use case.</w:t>
+        <w:t>Potential beneficiaries include coastal LGUs and disaster-management offices, fisherfolk and small-craft communities, schools, marine researchers, ports, tourism operators, and environmental groups. FALCON can provide localized observation history, accessible visualization, research data, and better awareness of equipment condition. Pero we do not plan to claim that one prototype will immediately serve everyone. Before the pilot deployment, we will identify one primary beneficiary and one specific Palawan site, confirm their actual information needs, and adjust the system to a realistic use case.</w:t>
       </w:r>
     </w:p>
     <w:p>
@@ -2080,7 +2049,7 @@
     </w:p>
     <w:tbl>
       <w:tblPr>
-        <w:tblW w:w="8823" w:type="dxa"/>
+        <w:tblW w:w="8703" w:type="dxa"/>
         <w:jc w:val="start"/>
         <w:tblInd w:w="0" w:type="dxa"/>
         <w:tblLayout w:type="fixed"/>
@@ -2094,7 +2063,7 @@
       <w:tblGrid>
         <w:gridCol w:w="3136"/>
         <w:gridCol w:w="3706"/>
-        <w:gridCol w:w="1981"/>
+        <w:gridCol w:w="1861"/>
       </w:tblGrid>
       <w:tr>
         <w:trPr/>
@@ -2142,7 +2111,7 @@
         </w:tc>
         <w:tc>
           <w:tcPr>
-            <w:tcW w:w="1981" w:type="dxa"/>
+            <w:tcW w:w="1861" w:type="dxa"/>
             <w:tcBorders/>
             <w:vAlign w:val="center"/>
           </w:tcPr>
@@ -2204,7 +2173,7 @@
         </w:tc>
         <w:tc>
           <w:tcPr>
-            <w:tcW w:w="1981" w:type="dxa"/>
+            <w:tcW w:w="1861" w:type="dxa"/>
             <w:tcBorders/>
             <w:vAlign w:val="center"/>
           </w:tcPr>
@@ -2264,7 +2233,7 @@
         </w:tc>
         <w:tc>
           <w:tcPr>
-            <w:tcW w:w="1981" w:type="dxa"/>
+            <w:tcW w:w="1861" w:type="dxa"/>
             <w:tcBorders/>
             <w:vAlign w:val="center"/>
           </w:tcPr>
@@ -2324,7 +2293,7 @@
         </w:tc>
         <w:tc>
           <w:tcPr>
-            <w:tcW w:w="1981" w:type="dxa"/>
+            <w:tcW w:w="1861" w:type="dxa"/>
             <w:tcBorders/>
             <w:vAlign w:val="center"/>
           </w:tcPr>
@@ -2384,7 +2353,7 @@
         </w:tc>
         <w:tc>
           <w:tcPr>
-            <w:tcW w:w="1981" w:type="dxa"/>
+            <w:tcW w:w="1861" w:type="dxa"/>
             <w:tcBorders/>
             <w:vAlign w:val="center"/>
           </w:tcPr>
@@ -2444,7 +2413,7 @@
         </w:tc>
         <w:tc>
           <w:tcPr>
-            <w:tcW w:w="1981" w:type="dxa"/>
+            <w:tcW w:w="1861" w:type="dxa"/>
             <w:tcBorders/>
             <w:vAlign w:val="center"/>
           </w:tcPr>
@@ -2504,7 +2473,7 @@
         </w:tc>
         <w:tc>
           <w:tcPr>
-            <w:tcW w:w="1981" w:type="dxa"/>
+            <w:tcW w:w="1861" w:type="dxa"/>
             <w:tcBorders/>
             <w:vAlign w:val="center"/>
           </w:tcPr>
@@ -2564,7 +2533,7 @@
         </w:tc>
         <w:tc>
           <w:tcPr>
-            <w:tcW w:w="1981" w:type="dxa"/>
+            <w:tcW w:w="1861" w:type="dxa"/>
             <w:tcBorders/>
             <w:vAlign w:val="center"/>
           </w:tcPr>
@@ -2635,7 +2604,7 @@
       </w:pPr>
       <w:r>
         <w:rPr/>
-        <w:t>Kapag nabigyan ng support, hahatiin namin ang development sa malinaw na phases. Magsisimula kami sa final design at procurement, kasunod ang electronics at sensor integration. Pagkatapos ay fabrication at sealing ng buoy, calibration, at controlled testing. Kapag pumasa sa basic safety at reliability tests, saka kami magsasagawa ng supervised coastal pilot at data collection. Ang collected at validated data ang gagamitin sa model training at baseline comparison. Magtatapos ang project sa final system evaluation, demonstration, at technical reporting. Ang realistic estimate namin ay eight to twelve months, dahil maaari itong maapektuhan ng procurement, weather, permits, site access, at sapat na data.</w:t>
+        <w:t>If the project receives support, development will follow clear phases. We will begin with final design and procurement, followed by electronics and sensor integration. Next are buoy fabrication, sealing, calibration, and controlled testing. Once the prototype passes the basic safety and reliability checks, we will proceed to a supervised coastal pilot and data collection. The validated dataset will then be used for model training and baseline comparison. The final phase covers system evaluation, demonstration, and technical reporting. Our realistic estimate is eight to twelve months, depending on procurement, weather, permits, site access, and the amount of data required.</w:t>
       </w:r>
     </w:p>
     <w:p>
@@ -2658,7 +2627,7 @@
     </w:p>
     <w:tbl>
       <w:tblPr>
-        <w:tblW w:w="7127" w:type="dxa"/>
+        <w:tblW w:w="6992" w:type="dxa"/>
         <w:jc w:val="start"/>
         <w:tblInd w:w="0" w:type="dxa"/>
         <w:tblLayout w:type="fixed"/>
@@ -2671,7 +2640,7 @@
       </w:tblPr>
       <w:tblGrid>
         <w:gridCol w:w="5041"/>
-        <w:gridCol w:w="2086"/>
+        <w:gridCol w:w="1951"/>
       </w:tblGrid>
       <w:tr>
         <w:trPr/>
@@ -2698,7 +2667,7 @@
         </w:tc>
         <w:tc>
           <w:tcPr>
-            <w:tcW w:w="2086" w:type="dxa"/>
+            <w:tcW w:w="1951" w:type="dxa"/>
             <w:tcBorders/>
             <w:vAlign w:val="center"/>
           </w:tcPr>
@@ -2741,7 +2710,7 @@
         </w:tc>
         <w:tc>
           <w:tcPr>
-            <w:tcW w:w="2086" w:type="dxa"/>
+            <w:tcW w:w="1951" w:type="dxa"/>
             <w:tcBorders/>
             <w:vAlign w:val="center"/>
           </w:tcPr>
@@ -2782,7 +2751,7 @@
         </w:tc>
         <w:tc>
           <w:tcPr>
-            <w:tcW w:w="2086" w:type="dxa"/>
+            <w:tcW w:w="1951" w:type="dxa"/>
             <w:tcBorders/>
             <w:vAlign w:val="center"/>
           </w:tcPr>
@@ -2823,7 +2792,7 @@
         </w:tc>
         <w:tc>
           <w:tcPr>
-            <w:tcW w:w="2086" w:type="dxa"/>
+            <w:tcW w:w="1951" w:type="dxa"/>
             <w:tcBorders/>
             <w:vAlign w:val="center"/>
           </w:tcPr>
@@ -2864,7 +2833,7 @@
         </w:tc>
         <w:tc>
           <w:tcPr>
-            <w:tcW w:w="2086" w:type="dxa"/>
+            <w:tcW w:w="1951" w:type="dxa"/>
             <w:tcBorders/>
             <w:vAlign w:val="center"/>
           </w:tcPr>
@@ -2905,7 +2874,7 @@
         </w:tc>
         <w:tc>
           <w:tcPr>
-            <w:tcW w:w="2086" w:type="dxa"/>
+            <w:tcW w:w="1951" w:type="dxa"/>
             <w:tcBorders/>
             <w:vAlign w:val="center"/>
           </w:tcPr>
@@ -2946,7 +2915,7 @@
         </w:tc>
         <w:tc>
           <w:tcPr>
-            <w:tcW w:w="2086" w:type="dxa"/>
+            <w:tcW w:w="1951" w:type="dxa"/>
             <w:tcBorders/>
             <w:vAlign w:val="center"/>
           </w:tcPr>
@@ -2987,7 +2956,7 @@
         </w:tc>
         <w:tc>
           <w:tcPr>
-            <w:tcW w:w="2086" w:type="dxa"/>
+            <w:tcW w:w="1951" w:type="dxa"/>
             <w:tcBorders/>
             <w:vAlign w:val="center"/>
           </w:tcPr>
@@ -3030,7 +2999,7 @@
         </w:tc>
         <w:tc>
           <w:tcPr>
-            <w:tcW w:w="2086" w:type="dxa"/>
+            <w:tcW w:w="1951" w:type="dxa"/>
             <w:tcBorders/>
             <w:vAlign w:val="center"/>
           </w:tcPr>
@@ -3093,7 +3062,7 @@
       </w:pPr>
       <w:r>
         <w:rPr/>
-        <w:t>Para sa preliminary funding plan, ang indicative development request ay mula seventy-two thousand hanggang one hundred twenty-seven thousand pesos. Hindi lang po ito presyo ng sensors. Kasama rito ang embedded electronics, Orange Pi, solar at battery system, marine enclosure at structure, mooring at anchor, calibration or reference tools, fabrication, field testing, transport, spare parts, at contingency. Planning range pa lamang ito at papalitan namin ng actual supplier quotations bago ang formal procurement. Hihiwalay rin namin ang reusable tools sa components na permanenteng mai-install sa prototype para transparent at madaling i-review ang budget.</w:t>
+        <w:t>Our preliminary development request ranges from seventy-two thousand to one hundred twenty-seven thousand pesos. This is not only the cost of the sensors. It includes the embedded electronics, Orange Pi, solar and battery system, marine enclosure and structure, mooring and anchor, calibration or reference tools, fabrication, field testing, transport, spare parts, and contingency. Planning range pa lamang ito. Before formal procurement, we will replace the estimates with actual supplier quotations and separate reusable tools from the components permanently installed in the prototype.</w:t>
       </w:r>
     </w:p>
     <w:p>
@@ -3353,7 +3322,7 @@
       </w:pPr>
       <w:r>
         <w:rPr/>
-        <w:t>Kapag natapos ang funded development, target naming ma-deliver ang isang integrated at documented physical prototype, calibrated sensors at power subsystem, local dashboard at data archive, supervised coastal-test results, model-versus-baseline evaluation, at reports para sa power, communication, waterproofing, stability, at alert performance. Kasama rin ang reproducible source code, wiring, bill of materials, at operating documentation. Ang hinihingi naming support ay para sa component procurement, fabrication, calibration, supervised field testing, at technical mentorship. Hindi po namin hinihinging tanggapin agad ang untested AI bilang operational forecast. Ang hinihingi namin ay pagkakataong gawing calibrated at evidence-based physical prototype ang working concept na na-develop na namin. Maraming salamat po, at handa kaming sagutin ang inyong mga tanong.</w:t>
+        <w:t>At the end of the funded development, we aim to deliver one integrated and documented physical prototype, calibrated sensors and power subsystems, a local dashboard and data archive, supervised coastal-test results, model-versus-baseline evaluation, and reports for power, communication, waterproofing, stability, and alert performance. We will also provide the source code, wiring, bill of materials, and operating documents. We are requesting support for procurement, fabrication, calibration, supervised field testing, and technical mentorship. Hindi po namin hinihinging tanggapin agad ang untested AI as an operational forecast. We are asking for the opportunity to turn our working concept into a calibrated and evidence-based physical prototype. Thank you, and we are ready to answer your questions.</w:t>
       </w:r>
     </w:p>
     <w:p>
@@ -4777,7 +4746,7 @@
     </w:p>
     <w:tbl>
       <w:tblPr>
-        <w:tblW w:w="5763" w:type="dxa"/>
+        <w:tblW w:w="5703" w:type="dxa"/>
         <w:jc w:val="start"/>
         <w:tblInd w:w="0" w:type="dxa"/>
         <w:tblLayout w:type="fixed"/>
@@ -4791,7 +4760,7 @@
       <w:tblGrid>
         <w:gridCol w:w="1186"/>
         <w:gridCol w:w="3331"/>
-        <w:gridCol w:w="1246"/>
+        <w:gridCol w:w="1186"/>
       </w:tblGrid>
       <w:tr>
         <w:trPr/>
@@ -4839,7 +4808,7 @@
         </w:tc>
         <w:tc>
           <w:tcPr>
-            <w:tcW w:w="1246" w:type="dxa"/>
+            <w:tcW w:w="1186" w:type="dxa"/>
             <w:tcBorders/>
             <w:vAlign w:val="center"/>
           </w:tcPr>
@@ -4901,7 +4870,7 @@
         </w:tc>
         <w:tc>
           <w:tcPr>
-            <w:tcW w:w="1246" w:type="dxa"/>
+            <w:tcW w:w="1186" w:type="dxa"/>
             <w:tcBorders/>
             <w:vAlign w:val="center"/>
           </w:tcPr>
@@ -4961,7 +4930,7 @@
         </w:tc>
         <w:tc>
           <w:tcPr>
-            <w:tcW w:w="1246" w:type="dxa"/>
+            <w:tcW w:w="1186" w:type="dxa"/>
             <w:tcBorders/>
             <w:vAlign w:val="center"/>
           </w:tcPr>
@@ -5021,7 +4990,7 @@
         </w:tc>
         <w:tc>
           <w:tcPr>
-            <w:tcW w:w="1246" w:type="dxa"/>
+            <w:tcW w:w="1186" w:type="dxa"/>
             <w:tcBorders/>
             <w:vAlign w:val="center"/>
           </w:tcPr>
@@ -5081,7 +5050,7 @@
         </w:tc>
         <w:tc>
           <w:tcPr>
-            <w:tcW w:w="1246" w:type="dxa"/>
+            <w:tcW w:w="1186" w:type="dxa"/>
             <w:tcBorders/>
             <w:vAlign w:val="center"/>
           </w:tcPr>
@@ -5141,7 +5110,7 @@
         </w:tc>
         <w:tc>
           <w:tcPr>
-            <w:tcW w:w="1246" w:type="dxa"/>
+            <w:tcW w:w="1186" w:type="dxa"/>
             <w:tcBorders/>
             <w:vAlign w:val="center"/>
           </w:tcPr>
@@ -7311,7 +7280,7 @@
     </w:pPr>
     <w:rPr>
       <w:rFonts w:ascii="Liberation Serif" w:hAnsi="Liberation Serif" w:eastAsia="Liberation Serif" w:cs="Liberation Serif"/>
-      <w:color w:val="111111"/>
+      <w:color w:val="auto"/>
       <w:sz w:val="21"/>
       <w:szCs w:val="21"/>
       <w:lang w:val="en-US" w:eastAsia="zh-CN" w:bidi="hi-IN"/>
@@ -7403,8 +7372,6 @@
     <w:qFormat/>
     <w:rPr>
       <w:rFonts w:ascii="Liberation Mono" w:hAnsi="Liberation Mono" w:eastAsia="Liberation Mono" w:cs="Liberation Mono"/>
-      <w:sz w:val="18"/>
-      <w:szCs w:val="18"/>
     </w:rPr>
   </w:style>
   <w:style w:type="character" w:styleId="Strong">
@@ -7600,7 +7567,6 @@
       <w:jc w:val="center"/>
     </w:pPr>
     <w:rPr>
-      <w:rFonts w:ascii="Liberation Sans" w:hAnsi="Liberation Sans" w:eastAsia="Liberation Sans" w:cs="Liberation Sans"/>
       <w:b/>
       <w:bCs/>
     </w:rPr>

</xml_diff>

<commit_message>
docs: add presentation visuals and explanatory diagrams
</commit_message>
<xml_diff>
--- a/THESIS DOCUMENTATION/DOST_Idea_Presentation_Package.docx
+++ b/THESIS DOCUMENTATION/DOST_Idea_Presentation_Package.docx
@@ -40,9 +40,9 @@
       </w:pPr>
       <w:r>
         <w:rPr/>
-        <w:t>Pitch Deck Content, English-Dominant Taglish Scripts, Demo Guide,</w:t>
+        <w:t>Pitch Deck Content, English-Dominant Taglish Scripts,</w:t>
         <w:br/>
-        <w:t>Budget, Timeline, Panel Q&amp;A, and Checklist</w:t>
+        <w:t>Visual Diagrams, Demo Guide, Budget, Timeline, and Panel Q&amp;A</w:t>
       </w:r>
     </w:p>
     <w:p>
@@ -980,6 +980,74 @@
         <w:rPr/>
       </w:pPr>
       <w:r>
+        <w:rPr/>
+        <w:drawing>
+          <wp:inline distT="0" distB="0" distL="0" distR="0">
+            <wp:extent cx="6191250" cy="4124325"/>
+            <wp:effectExtent l="0" t="0" r="0" b="0"/>
+            <wp:docPr id="1" name="Image1" descr="" title="Illustrated Project FALCON electronics and power layout"/>
+            <wp:cNvGraphicFramePr>
+              <a:graphicFrameLocks xmlns:a="http://schemas.openxmlformats.org/drawingml/2006/main" noChangeAspect="1"/>
+            </wp:cNvGraphicFramePr>
+            <a:graphic xmlns:a="http://schemas.openxmlformats.org/drawingml/2006/main">
+              <a:graphicData uri="http://schemas.openxmlformats.org/drawingml/2006/picture">
+                <pic:pic xmlns:pic="http://schemas.openxmlformats.org/drawingml/2006/picture">
+                  <pic:nvPicPr>
+                    <pic:cNvPr id="1" name="Image1" descr="" title="Illustrated Project FALCON electronics and power layout"/>
+                    <pic:cNvPicPr>
+                      <a:picLocks noChangeAspect="1" noChangeArrowheads="1"/>
+                    </pic:cNvPicPr>
+                  </pic:nvPicPr>
+                  <pic:blipFill>
+                    <a:blip r:link="rId2"/>
+                    <a:stretch>
+                      <a:fillRect/>
+                    </a:stretch>
+                  </pic:blipFill>
+                  <pic:spPr bwMode="auto">
+                    <a:xfrm>
+                      <a:off x="0" y="0"/>
+                      <a:ext cx="6191250" cy="4124325"/>
+                    </a:xfrm>
+                    <a:prstGeom prst="rect">
+                      <a:avLst/>
+                    </a:prstGeom>
+                  </pic:spPr>
+                </pic:pic>
+              </a:graphicData>
+            </a:graphic>
+          </wp:inline>
+        </w:drawing>
+      </w:r>
+      <w:r>
+        <w:rPr/>
+        <w:t xml:space="preserve"> </w:t>
+      </w:r>
+    </w:p>
+    <w:p>
+      <w:pPr>
+        <w:pStyle w:val="BodyText"/>
+        <w:bidi w:val="0"/>
+        <w:spacing w:before="0" w:after="140"/>
+        <w:jc w:val="both"/>
+        <w:rPr/>
+      </w:pPr>
+      <w:r>
+        <w:rPr>
+          <w:rStyle w:val="Emphasis"/>
+        </w:rPr>
+        <w:t>Visual guide only. Final physical connections must follow the approved pinout, purchased-board datasheets, and electrical protection plan.</w:t>
+      </w:r>
+    </w:p>
+    <w:p>
+      <w:pPr>
+        <w:pStyle w:val="BodyText"/>
+        <w:bidi w:val="0"/>
+        <w:spacing w:before="0" w:after="140"/>
+        <w:jc w:val="both"/>
+        <w:rPr/>
+      </w:pPr>
+      <w:r>
         <w:rPr>
           <w:rStyle w:val="Strong"/>
         </w:rPr>
@@ -1278,6 +1346,59 @@
         <w:rPr/>
       </w:pPr>
       <w:r>
+        <w:rPr/>
+        <w:drawing>
+          <wp:inline distT="0" distB="0" distL="0" distR="0">
+            <wp:extent cx="6191250" cy="3190875"/>
+            <wp:effectExtent l="0" t="0" r="0" b="0"/>
+            <wp:docPr id="2" name="Image2" descr="" title="Project FALCON local-first system architecture"/>
+            <wp:cNvGraphicFramePr>
+              <a:graphicFrameLocks xmlns:a="http://schemas.openxmlformats.org/drawingml/2006/main" noChangeAspect="1"/>
+            </wp:cNvGraphicFramePr>
+            <a:graphic xmlns:a="http://schemas.openxmlformats.org/drawingml/2006/main">
+              <a:graphicData uri="http://schemas.openxmlformats.org/drawingml/2006/picture">
+                <pic:pic xmlns:pic="http://schemas.openxmlformats.org/drawingml/2006/picture">
+                  <pic:nvPicPr>
+                    <pic:cNvPr id="2" name="Image2" descr="" title="Project FALCON local-first system architecture"/>
+                    <pic:cNvPicPr>
+                      <a:picLocks noChangeAspect="1" noChangeArrowheads="1"/>
+                    </pic:cNvPicPr>
+                  </pic:nvPicPr>
+                  <pic:blipFill>
+                    <a:blip r:link="rId3"/>
+                    <a:stretch>
+                      <a:fillRect/>
+                    </a:stretch>
+                  </pic:blipFill>
+                  <pic:spPr bwMode="auto">
+                    <a:xfrm>
+                      <a:off x="0" y="0"/>
+                      <a:ext cx="6191250" cy="3190875"/>
+                    </a:xfrm>
+                    <a:prstGeom prst="rect">
+                      <a:avLst/>
+                    </a:prstGeom>
+                  </pic:spPr>
+                </pic:pic>
+              </a:graphicData>
+            </a:graphic>
+          </wp:inline>
+        </w:drawing>
+      </w:r>
+      <w:r>
+        <w:rPr/>
+        <w:t xml:space="preserve"> </w:t>
+      </w:r>
+    </w:p>
+    <w:p>
+      <w:pPr>
+        <w:pStyle w:val="BodyText"/>
+        <w:bidi w:val="0"/>
+        <w:spacing w:before="0" w:after="140"/>
+        <w:jc w:val="both"/>
+        <w:rPr/>
+      </w:pPr>
+      <w:r>
         <w:rPr>
           <w:rStyle w:val="Strong"/>
         </w:rPr>
@@ -1595,6 +1716,74 @@
       <w:r>
         <w:rPr/>
         <w:t xml:space="preserve"> physical sensor integration, assembled marine power system, field-trained AI, calibration, and marine deployment validation.</w:t>
+      </w:r>
+    </w:p>
+    <w:p>
+      <w:pPr>
+        <w:pStyle w:val="BodyText"/>
+        <w:bidi w:val="0"/>
+        <w:spacing w:before="0" w:after="140"/>
+        <w:jc w:val="both"/>
+        <w:rPr/>
+      </w:pPr>
+      <w:r>
+        <w:rPr/>
+        <w:drawing>
+          <wp:inline distT="0" distB="0" distL="0" distR="0">
+            <wp:extent cx="6191250" cy="4733925"/>
+            <wp:effectExtent l="0" t="0" r="0" b="0"/>
+            <wp:docPr id="3" name="Image3" descr="" title="Current Project FALCON dashboard overview"/>
+            <wp:cNvGraphicFramePr>
+              <a:graphicFrameLocks xmlns:a="http://schemas.openxmlformats.org/drawingml/2006/main" noChangeAspect="1"/>
+            </wp:cNvGraphicFramePr>
+            <a:graphic xmlns:a="http://schemas.openxmlformats.org/drawingml/2006/main">
+              <a:graphicData uri="http://schemas.openxmlformats.org/drawingml/2006/picture">
+                <pic:pic xmlns:pic="http://schemas.openxmlformats.org/drawingml/2006/picture">
+                  <pic:nvPicPr>
+                    <pic:cNvPr id="3" name="Image3" descr="" title="Current Project FALCON dashboard overview"/>
+                    <pic:cNvPicPr>
+                      <a:picLocks noChangeAspect="1" noChangeArrowheads="1"/>
+                    </pic:cNvPicPr>
+                  </pic:nvPicPr>
+                  <pic:blipFill>
+                    <a:blip r:link="rId4"/>
+                    <a:stretch>
+                      <a:fillRect/>
+                    </a:stretch>
+                  </pic:blipFill>
+                  <pic:spPr bwMode="auto">
+                    <a:xfrm>
+                      <a:off x="0" y="0"/>
+                      <a:ext cx="6191250" cy="4733925"/>
+                    </a:xfrm>
+                    <a:prstGeom prst="rect">
+                      <a:avLst/>
+                    </a:prstGeom>
+                  </pic:spPr>
+                </pic:pic>
+              </a:graphicData>
+            </a:graphic>
+          </wp:inline>
+        </w:drawing>
+      </w:r>
+      <w:r>
+        <w:rPr/>
+        <w:t xml:space="preserve"> </w:t>
+      </w:r>
+    </w:p>
+    <w:p>
+      <w:pPr>
+        <w:pStyle w:val="BodyText"/>
+        <w:bidi w:val="0"/>
+        <w:spacing w:before="0" w:after="140"/>
+        <w:jc w:val="both"/>
+        <w:rPr/>
+      </w:pPr>
+      <w:r>
+        <w:rPr>
+          <w:rStyle w:val="Emphasis"/>
+        </w:rPr>
+        <w:t>Dashboard values shown during the presentation are simulator-generated and are not yet live coastal measurements.</w:t>
       </w:r>
     </w:p>
     <w:p>
@@ -2584,6 +2773,59 @@
         <w:rPr/>
       </w:pPr>
       <w:r>
+        <w:rPr/>
+        <w:drawing>
+          <wp:inline distT="0" distB="0" distL="0" distR="0">
+            <wp:extent cx="6191250" cy="2876550"/>
+            <wp:effectExtent l="0" t="0" r="0" b="0"/>
+            <wp:docPr id="4" name="Image4" descr="" title="Project FALCON development roadmap"/>
+            <wp:cNvGraphicFramePr>
+              <a:graphicFrameLocks xmlns:a="http://schemas.openxmlformats.org/drawingml/2006/main" noChangeAspect="1"/>
+            </wp:cNvGraphicFramePr>
+            <a:graphic xmlns:a="http://schemas.openxmlformats.org/drawingml/2006/main">
+              <a:graphicData uri="http://schemas.openxmlformats.org/drawingml/2006/picture">
+                <pic:pic xmlns:pic="http://schemas.openxmlformats.org/drawingml/2006/picture">
+                  <pic:nvPicPr>
+                    <pic:cNvPr id="4" name="Image4" descr="" title="Project FALCON development roadmap"/>
+                    <pic:cNvPicPr>
+                      <a:picLocks noChangeAspect="1" noChangeArrowheads="1"/>
+                    </pic:cNvPicPr>
+                  </pic:nvPicPr>
+                  <pic:blipFill>
+                    <a:blip r:link="rId5"/>
+                    <a:stretch>
+                      <a:fillRect/>
+                    </a:stretch>
+                  </pic:blipFill>
+                  <pic:spPr bwMode="auto">
+                    <a:xfrm>
+                      <a:off x="0" y="0"/>
+                      <a:ext cx="6191250" cy="2876550"/>
+                    </a:xfrm>
+                    <a:prstGeom prst="rect">
+                      <a:avLst/>
+                    </a:prstGeom>
+                  </pic:spPr>
+                </pic:pic>
+              </a:graphicData>
+            </a:graphic>
+          </wp:inline>
+        </w:drawing>
+      </w:r>
+      <w:r>
+        <w:rPr/>
+        <w:t xml:space="preserve"> </w:t>
+      </w:r>
+    </w:p>
+    <w:p>
+      <w:pPr>
+        <w:pStyle w:val="BodyText"/>
+        <w:bidi w:val="0"/>
+        <w:spacing w:before="0" w:after="140"/>
+        <w:jc w:val="both"/>
+        <w:rPr/>
+      </w:pPr>
+      <w:r>
         <w:rPr>
           <w:rStyle w:val="Strong"/>
         </w:rPr>
@@ -3031,6 +3273,59 @@
       <w:r>
         <w:rPr/>
         <w:t>This is a planning range, not a supplier quotation. Before submission, replace estimates with current quotations and separate reusable tools from installed parts. The lower raw-component estimate in the technical BOM does not include all field testing, fabrication, transport, spares, and contingency costs.</w:t>
+      </w:r>
+    </w:p>
+    <w:p>
+      <w:pPr>
+        <w:pStyle w:val="BodyText"/>
+        <w:bidi w:val="0"/>
+        <w:spacing w:before="0" w:after="140"/>
+        <w:jc w:val="both"/>
+        <w:rPr/>
+      </w:pPr>
+      <w:r>
+        <w:rPr/>
+        <w:drawing>
+          <wp:inline distT="0" distB="0" distL="0" distR="0">
+            <wp:extent cx="6191250" cy="3190875"/>
+            <wp:effectExtent l="0" t="0" r="0" b="0"/>
+            <wp:docPr id="5" name="Image5" descr="" title="Project FALCON preliminary funding breakdown"/>
+            <wp:cNvGraphicFramePr>
+              <a:graphicFrameLocks xmlns:a="http://schemas.openxmlformats.org/drawingml/2006/main" noChangeAspect="1"/>
+            </wp:cNvGraphicFramePr>
+            <a:graphic xmlns:a="http://schemas.openxmlformats.org/drawingml/2006/main">
+              <a:graphicData uri="http://schemas.openxmlformats.org/drawingml/2006/picture">
+                <pic:pic xmlns:pic="http://schemas.openxmlformats.org/drawingml/2006/picture">
+                  <pic:nvPicPr>
+                    <pic:cNvPr id="5" name="Image5" descr="" title="Project FALCON preliminary funding breakdown"/>
+                    <pic:cNvPicPr>
+                      <a:picLocks noChangeAspect="1" noChangeArrowheads="1"/>
+                    </pic:cNvPicPr>
+                  </pic:nvPicPr>
+                  <pic:blipFill>
+                    <a:blip r:link="rId6"/>
+                    <a:stretch>
+                      <a:fillRect/>
+                    </a:stretch>
+                  </pic:blipFill>
+                  <pic:spPr bwMode="auto">
+                    <a:xfrm>
+                      <a:off x="0" y="0"/>
+                      <a:ext cx="6191250" cy="3190875"/>
+                    </a:xfrm>
+                    <a:prstGeom prst="rect">
+                      <a:avLst/>
+                    </a:prstGeom>
+                  </pic:spPr>
+                </pic:pic>
+              </a:graphicData>
+            </a:graphic>
+          </wp:inline>
+        </w:drawing>
+      </w:r>
+      <w:r>
+        <w:rPr/>
+        <w:t xml:space="preserve"> </w:t>
       </w:r>
     </w:p>
     <w:p>
@@ -5333,7 +5628,7 @@
       <w:pgNumType w:fmt="decimal"/>
       <w:formProt w:val="false"/>
       <w:textDirection w:val="lrTb"/>
-      <w:docGrid w:type="default" w:linePitch="600" w:charSpace="38911"/>
+      <w:docGrid w:type="default" w:linePitch="600" w:charSpace="39730"/>
     </w:sectPr>
   </w:body>
 </w:document>
@@ -7276,7 +7571,7 @@
       <w:overflowPunct w:val="true"/>
       <w:autoSpaceDE w:val="true"/>
       <w:bidi w:val="0"/>
-      <w:spacing w:lineRule="auto" w:line="336"/>
+      <w:spacing w:lineRule="auto" w:line="331"/>
     </w:pPr>
     <w:rPr>
       <w:rFonts w:ascii="Liberation Serif" w:hAnsi="Liberation Serif" w:eastAsia="Liberation Serif" w:cs="Liberation Serif"/>
@@ -7387,6 +7682,14 @@
     <w:qFormat/>
     <w:rPr>
       <w:rFonts w:ascii="OpenSymbol" w:hAnsi="OpenSymbol" w:eastAsia="OpenSymbol" w:cs="OpenSymbol"/>
+    </w:rPr>
+  </w:style>
+  <w:style w:type="character" w:styleId="Emphasis">
+    <w:name w:val="Emphasis"/>
+    <w:qFormat/>
+    <w:rPr>
+      <w:i/>
+      <w:iCs/>
     </w:rPr>
   </w:style>
   <w:style w:type="character" w:styleId="NumberingSymbols">

</xml_diff>

<commit_message>
docs: make DOST pitch easier for general listeners
</commit_message>
<xml_diff>
--- a/THESIS DOCUMENTATION/DOST_Idea_Presentation_Package.docx
+++ b/THESIS DOCUMENTATION/DOST_Idea_Presentation_Package.docx
@@ -40,7 +40,7 @@
       </w:pPr>
       <w:r>
         <w:rPr/>
-        <w:t>Pitch Deck Content, English-Dominant Taglish Scripts,</w:t>
+        <w:t>Listener-Friendly Pitch Content, English-Dominant Taglish Scripts,</w:t>
         <w:br/>
         <w:t>Visual Diagrams, Demo Guide, Budget, Timeline, and Panel Q&amp;A</w:t>
       </w:r>
@@ -481,7 +481,530 @@
       </w:pPr>
       <w:r>
         <w:rPr/>
+        <w:t>Simple terms to use during the presentation</w:t>
+      </w:r>
+    </w:p>
+    <w:tbl>
+      <w:tblPr>
+        <w:tblW w:w="7607" w:type="dxa"/>
+        <w:jc w:val="start"/>
+        <w:tblInd w:w="0" w:type="dxa"/>
+        <w:tblLayout w:type="fixed"/>
+        <w:tblCellMar>
+          <w:top w:w="28" w:type="dxa"/>
+          <w:start w:w="28" w:type="dxa"/>
+          <w:bottom w:w="28" w:type="dxa"/>
+          <w:end w:w="28" w:type="dxa"/>
+        </w:tblCellMar>
+      </w:tblPr>
+      <w:tblGrid>
+        <w:gridCol w:w="1471"/>
+        <w:gridCol w:w="6136"/>
+      </w:tblGrid>
+      <w:tr>
+        <w:trPr/>
+        <w:tc>
+          <w:tcPr>
+            <w:tcW w:w="1471" w:type="dxa"/>
+            <w:tcBorders/>
+            <w:vAlign w:val="center"/>
+          </w:tcPr>
+          <w:p>
+            <w:pPr>
+              <w:pStyle w:val="TableHeading"/>
+              <w:suppressLineNumbers/>
+              <w:bidi w:val="0"/>
+              <w:spacing w:before="0" w:after="140"/>
+              <w:jc w:val="center"/>
+              <w:rPr/>
+            </w:pPr>
+            <w:r>
+              <w:rPr/>
+              <w:t>Technical term</w:t>
+            </w:r>
+          </w:p>
+        </w:tc>
+        <w:tc>
+          <w:tcPr>
+            <w:tcW w:w="6136" w:type="dxa"/>
+            <w:tcBorders/>
+            <w:vAlign w:val="center"/>
+          </w:tcPr>
+          <w:p>
+            <w:pPr>
+              <w:pStyle w:val="TableHeading"/>
+              <w:suppressLineNumbers/>
+              <w:bidi w:val="0"/>
+              <w:spacing w:before="0" w:after="140"/>
+              <w:jc w:val="center"/>
+              <w:rPr/>
+            </w:pPr>
+            <w:r>
+              <w:rPr/>
+              <w:t>Listener-friendly explanation</w:t>
+            </w:r>
+          </w:p>
+        </w:tc>
+      </w:tr>
+      <w:tr>
+        <w:trPr/>
+        <w:tc>
+          <w:tcPr>
+            <w:tcW w:w="1471" w:type="dxa"/>
+            <w:tcBorders/>
+            <w:vAlign w:val="center"/>
+          </w:tcPr>
+          <w:p>
+            <w:pPr>
+              <w:pStyle w:val="TableContents"/>
+              <w:bidi w:val="0"/>
+              <w:spacing w:before="0" w:after="140"/>
+              <w:rPr/>
+            </w:pPr>
+            <w:r>
+              <w:rPr/>
+              <w:t>Buoy</w:t>
+            </w:r>
+          </w:p>
+        </w:tc>
+        <w:tc>
+          <w:tcPr>
+            <w:tcW w:w="6136" w:type="dxa"/>
+            <w:tcBorders/>
+            <w:vAlign w:val="center"/>
+          </w:tcPr>
+          <w:p>
+            <w:pPr>
+              <w:pStyle w:val="TableContents"/>
+              <w:bidi w:val="0"/>
+              <w:spacing w:before="0" w:after="140"/>
+              <w:rPr/>
+            </w:pPr>
+            <w:r>
+              <w:rPr/>
+              <w:t>A floating device placed on the water to collect information</w:t>
+            </w:r>
+          </w:p>
+        </w:tc>
+      </w:tr>
+      <w:tr>
+        <w:trPr/>
+        <w:tc>
+          <w:tcPr>
+            <w:tcW w:w="1471" w:type="dxa"/>
+            <w:tcBorders/>
+            <w:vAlign w:val="center"/>
+          </w:tcPr>
+          <w:p>
+            <w:pPr>
+              <w:pStyle w:val="TableContents"/>
+              <w:bidi w:val="0"/>
+              <w:spacing w:before="0" w:after="140"/>
+              <w:rPr/>
+            </w:pPr>
+            <w:r>
+              <w:rPr/>
+              <w:t>Sensor</w:t>
+            </w:r>
+          </w:p>
+        </w:tc>
+        <w:tc>
+          <w:tcPr>
+            <w:tcW w:w="6136" w:type="dxa"/>
+            <w:tcBorders/>
+            <w:vAlign w:val="center"/>
+          </w:tcPr>
+          <w:p>
+            <w:pPr>
+              <w:pStyle w:val="TableContents"/>
+              <w:bidi w:val="0"/>
+              <w:spacing w:before="0" w:after="140"/>
+              <w:rPr/>
+            </w:pPr>
+            <w:r>
+              <w:rPr/>
+              <w:t>A small electronic instrument that measures one condition</w:t>
+            </w:r>
+          </w:p>
+        </w:tc>
+      </w:tr>
+      <w:tr>
+        <w:trPr/>
+        <w:tc>
+          <w:tcPr>
+            <w:tcW w:w="1471" w:type="dxa"/>
+            <w:tcBorders/>
+            <w:vAlign w:val="center"/>
+          </w:tcPr>
+          <w:p>
+            <w:pPr>
+              <w:pStyle w:val="TableContents"/>
+              <w:bidi w:val="0"/>
+              <w:spacing w:before="0" w:after="140"/>
+              <w:rPr/>
+            </w:pPr>
+            <w:r>
+              <w:rPr/>
+              <w:t>ESP32</w:t>
+            </w:r>
+          </w:p>
+        </w:tc>
+        <w:tc>
+          <w:tcPr>
+            <w:tcW w:w="6136" w:type="dxa"/>
+            <w:tcBorders/>
+            <w:vAlign w:val="center"/>
+          </w:tcPr>
+          <w:p>
+            <w:pPr>
+              <w:pStyle w:val="TableContents"/>
+              <w:bidi w:val="0"/>
+              <w:spacing w:before="0" w:after="140"/>
+              <w:rPr/>
+            </w:pPr>
+            <w:r>
+              <w:rPr/>
+              <w:t>The small controller that reads the sensors repeatedly</w:t>
+            </w:r>
+          </w:p>
+        </w:tc>
+      </w:tr>
+      <w:tr>
+        <w:trPr/>
+        <w:tc>
+          <w:tcPr>
+            <w:tcW w:w="1471" w:type="dxa"/>
+            <w:tcBorders/>
+            <w:vAlign w:val="center"/>
+          </w:tcPr>
+          <w:p>
+            <w:pPr>
+              <w:pStyle w:val="TableContents"/>
+              <w:bidi w:val="0"/>
+              <w:spacing w:before="0" w:after="140"/>
+              <w:rPr/>
+            </w:pPr>
+            <w:r>
+              <w:rPr/>
+              <w:t>Orange Pi</w:t>
+            </w:r>
+          </w:p>
+        </w:tc>
+        <w:tc>
+          <w:tcPr>
+            <w:tcW w:w="6136" w:type="dxa"/>
+            <w:tcBorders/>
+            <w:vAlign w:val="center"/>
+          </w:tcPr>
+          <w:p>
+            <w:pPr>
+              <w:pStyle w:val="TableContents"/>
+              <w:bidi w:val="0"/>
+              <w:spacing w:before="0" w:after="140"/>
+              <w:rPr/>
+            </w:pPr>
+            <w:r>
+              <w:rPr/>
+              <w:t>The small onboard computer that saves and processes the data</w:t>
+            </w:r>
+          </w:p>
+        </w:tc>
+      </w:tr>
+      <w:tr>
+        <w:trPr/>
+        <w:tc>
+          <w:tcPr>
+            <w:tcW w:w="1471" w:type="dxa"/>
+            <w:tcBorders/>
+            <w:vAlign w:val="center"/>
+          </w:tcPr>
+          <w:p>
+            <w:pPr>
+              <w:pStyle w:val="TableContents"/>
+              <w:bidi w:val="0"/>
+              <w:spacing w:before="0" w:after="140"/>
+              <w:rPr/>
+            </w:pPr>
+            <w:r>
+              <w:rPr/>
+              <w:t>Edge processing</w:t>
+            </w:r>
+          </w:p>
+        </w:tc>
+        <w:tc>
+          <w:tcPr>
+            <w:tcW w:w="6136" w:type="dxa"/>
+            <w:tcBorders/>
+            <w:vAlign w:val="center"/>
+          </w:tcPr>
+          <w:p>
+            <w:pPr>
+              <w:pStyle w:val="TableContents"/>
+              <w:bidi w:val="0"/>
+              <w:spacing w:before="0" w:after="140"/>
+              <w:rPr/>
+            </w:pPr>
+            <w:r>
+              <w:rPr/>
+              <w:t>Processing done inside or near the buoy instead of relying on the Internet</w:t>
+            </w:r>
+          </w:p>
+        </w:tc>
+      </w:tr>
+      <w:tr>
+        <w:trPr/>
+        <w:tc>
+          <w:tcPr>
+            <w:tcW w:w="1471" w:type="dxa"/>
+            <w:tcBorders/>
+            <w:vAlign w:val="center"/>
+          </w:tcPr>
+          <w:p>
+            <w:pPr>
+              <w:pStyle w:val="TableContents"/>
+              <w:bidi w:val="0"/>
+              <w:spacing w:before="0" w:after="140"/>
+              <w:rPr/>
+            </w:pPr>
+            <w:r>
+              <w:rPr/>
+              <w:t>Telemetry</w:t>
+            </w:r>
+          </w:p>
+        </w:tc>
+        <w:tc>
+          <w:tcPr>
+            <w:tcW w:w="6136" w:type="dxa"/>
+            <w:tcBorders/>
+            <w:vAlign w:val="center"/>
+          </w:tcPr>
+          <w:p>
+            <w:pPr>
+              <w:pStyle w:val="TableContents"/>
+              <w:bidi w:val="0"/>
+              <w:spacing w:before="0" w:after="140"/>
+              <w:rPr/>
+            </w:pPr>
+            <w:r>
+              <w:rPr/>
+              <w:t>The measurements sent from the sensors to the computer</w:t>
+            </w:r>
+          </w:p>
+        </w:tc>
+      </w:tr>
+      <w:tr>
+        <w:trPr/>
+        <w:tc>
+          <w:tcPr>
+            <w:tcW w:w="1471" w:type="dxa"/>
+            <w:tcBorders/>
+            <w:vAlign w:val="center"/>
+          </w:tcPr>
+          <w:p>
+            <w:pPr>
+              <w:pStyle w:val="TableContents"/>
+              <w:bidi w:val="0"/>
+              <w:spacing w:before="0" w:after="140"/>
+              <w:rPr/>
+            </w:pPr>
+            <w:r>
+              <w:rPr/>
+              <w:t>Simulator</w:t>
+            </w:r>
+          </w:p>
+        </w:tc>
+        <w:tc>
+          <w:tcPr>
+            <w:tcW w:w="6136" w:type="dxa"/>
+            <w:tcBorders/>
+            <w:vAlign w:val="center"/>
+          </w:tcPr>
+          <w:p>
+            <w:pPr>
+              <w:pStyle w:val="TableContents"/>
+              <w:bidi w:val="0"/>
+              <w:spacing w:before="0" w:after="140"/>
+              <w:rPr/>
+            </w:pPr>
+            <w:r>
+              <w:rPr/>
+              <w:t>Software-generated test data used before actual hardware is ready</w:t>
+            </w:r>
+          </w:p>
+        </w:tc>
+      </w:tr>
+      <w:tr>
+        <w:trPr/>
+        <w:tc>
+          <w:tcPr>
+            <w:tcW w:w="1471" w:type="dxa"/>
+            <w:tcBorders/>
+            <w:vAlign w:val="center"/>
+          </w:tcPr>
+          <w:p>
+            <w:pPr>
+              <w:pStyle w:val="TableContents"/>
+              <w:bidi w:val="0"/>
+              <w:spacing w:before="0" w:after="140"/>
+              <w:rPr/>
+            </w:pPr>
+            <w:r>
+              <w:rPr/>
+              <w:t>AI model</w:t>
+            </w:r>
+          </w:p>
+        </w:tc>
+        <w:tc>
+          <w:tcPr>
+            <w:tcW w:w="6136" w:type="dxa"/>
+            <w:tcBorders/>
+            <w:vAlign w:val="center"/>
+          </w:tcPr>
+          <w:p>
+            <w:pPr>
+              <w:pStyle w:val="TableContents"/>
+              <w:bidi w:val="0"/>
+              <w:spacing w:before="0" w:after="140"/>
+              <w:rPr/>
+            </w:pPr>
+            <w:r>
+              <w:rPr/>
+              <w:t>A program trained using past data to estimate a future value</w:t>
+            </w:r>
+          </w:p>
+        </w:tc>
+      </w:tr>
+      <w:tr>
+        <w:trPr/>
+        <w:tc>
+          <w:tcPr>
+            <w:tcW w:w="1471" w:type="dxa"/>
+            <w:tcBorders/>
+            <w:vAlign w:val="center"/>
+          </w:tcPr>
+          <w:p>
+            <w:pPr>
+              <w:pStyle w:val="TableContents"/>
+              <w:bidi w:val="0"/>
+              <w:spacing w:before="0" w:after="140"/>
+              <w:rPr/>
+            </w:pPr>
+            <w:r>
+              <w:rPr/>
+              <w:t>Calibration</w:t>
+            </w:r>
+          </w:p>
+        </w:tc>
+        <w:tc>
+          <w:tcPr>
+            <w:tcW w:w="6136" w:type="dxa"/>
+            <w:tcBorders/>
+            <w:vAlign w:val="center"/>
+          </w:tcPr>
+          <w:p>
+            <w:pPr>
+              <w:pStyle w:val="TableContents"/>
+              <w:bidi w:val="0"/>
+              <w:spacing w:before="0" w:after="140"/>
+              <w:rPr/>
+            </w:pPr>
+            <w:r>
+              <w:rPr/>
+              <w:t>Comparing a sensor with a trusted reference and correcting its readings</w:t>
+            </w:r>
+          </w:p>
+        </w:tc>
+      </w:tr>
+      <w:tr>
+        <w:trPr/>
+        <w:tc>
+          <w:tcPr>
+            <w:tcW w:w="1471" w:type="dxa"/>
+            <w:tcBorders/>
+            <w:vAlign w:val="center"/>
+          </w:tcPr>
+          <w:p>
+            <w:pPr>
+              <w:pStyle w:val="TableContents"/>
+              <w:bidi w:val="0"/>
+              <w:spacing w:before="0" w:after="140"/>
+              <w:rPr/>
+            </w:pPr>
+            <w:r>
+              <w:rPr/>
+              <w:t>Validation</w:t>
+            </w:r>
+          </w:p>
+        </w:tc>
+        <w:tc>
+          <w:tcPr>
+            <w:tcW w:w="6136" w:type="dxa"/>
+            <w:tcBorders/>
+            <w:vAlign w:val="center"/>
+          </w:tcPr>
+          <w:p>
+            <w:pPr>
+              <w:pStyle w:val="TableContents"/>
+              <w:bidi w:val="0"/>
+              <w:spacing w:before="0" w:after="140"/>
+              <w:rPr/>
+            </w:pPr>
+            <w:r>
+              <w:rPr/>
+              <w:t>Testing whether the complete system performs accurately and reliably</w:t>
+            </w:r>
+          </w:p>
+        </w:tc>
+      </w:tr>
+    </w:tbl>
+    <w:p>
+      <w:pPr>
+        <w:pStyle w:val="BodyText"/>
+        <w:bidi w:val="0"/>
+        <w:spacing w:before="0" w:after="140"/>
+        <w:jc w:val="both"/>
+        <w:rPr/>
+      </w:pPr>
+      <w:r>
+        <w:rPr/>
+        <w:t>Use the simple explanation first. Mention the technical term afterward only when needed. Do not explain every component unless the panel asks for more detail.</w:t>
+      </w:r>
+    </w:p>
+    <w:p>
+      <w:pPr>
+        <w:pStyle w:val="Heading2"/>
+        <w:numPr>
+          <w:ilvl w:val="0"/>
+          <w:numId w:val="0"/>
+        </w:numPr>
+        <w:pBdr/>
+        <w:bidi w:val="0"/>
+        <w:spacing w:before="400" w:after="120"/>
+        <w:jc w:val="start"/>
+        <w:rPr/>
+      </w:pPr>
+      <w:r>
+        <w:rPr/>
         <w:t>Slide 1 — Project Title</w:t>
+      </w:r>
+    </w:p>
+    <w:p>
+      <w:pPr>
+        <w:pStyle w:val="BodyText"/>
+        <w:bidi w:val="0"/>
+        <w:spacing w:before="0" w:after="140"/>
+        <w:jc w:val="both"/>
+        <w:rPr/>
+      </w:pPr>
+      <w:r>
+        <w:rPr>
+          <w:rStyle w:val="Strong"/>
+        </w:rPr>
+        <w:t>What listeners should remember:</w:t>
+      </w:r>
+      <w:r>
+        <w:rPr/>
+        <w:t xml:space="preserve"> FALCON is an affordable smart buoy concept that will collect and explain localized coastal information.</w:t>
       </w:r>
     </w:p>
     <w:p>
@@ -613,6 +1136,25 @@
     <w:p>
       <w:pPr>
         <w:pStyle w:val="BodyText"/>
+        <w:bidi w:val="0"/>
+        <w:spacing w:before="0" w:after="140"/>
+        <w:jc w:val="both"/>
+        <w:rPr/>
+      </w:pPr>
+      <w:r>
+        <w:rPr>
+          <w:rStyle w:val="Strong"/>
+        </w:rPr>
+        <w:t>What listeners should remember:</w:t>
+      </w:r>
+      <w:r>
+        <w:rPr/>
+        <w:t xml:space="preserve"> Coastal users may receive a general forecast, but they can still lack an affordable instrument for observing their exact site.</w:t>
+      </w:r>
+    </w:p>
+    <w:p>
+      <w:pPr>
+        <w:pStyle w:val="BodyText"/>
         <w:numPr>
           <w:ilvl w:val="0"/>
           <w:numId w:val="2"/>
@@ -772,7 +1314,7 @@
       </w:pPr>
       <w:r>
         <w:rPr/>
-        <w:t>The main problem is limited access to affordable and location-specific coastal information. Official forecasts and professional monitoring systems already exist, but specialized equipment can be expensive and difficult for a small institution or coastal group to deploy and maintain. Actual near-shore conditions at one site may also differ from a wider forecast area. Continuous monitoring has other challenges, such as unstable connectivity, limited power, maintenance, and possible buoy displacement. So ang target gap namin is not the absence of monitoring. It is the need for a more affordable and localized observation platform for our intended pilot user.</w:t>
+        <w:t>The main problem is limited access to affordable and location-specific coastal information. Official forecasts and professional monitoring systems already exist, but specialized equipment can be expensive and difficult for a small institution or coastal group to deploy and maintain. Actual near-shore conditions at one site may also differ from a wider forecast area. Continuous monitoring has other challenges, such as unstable connectivity, limited power, maintenance, and possible buoy displacement. For example, a coastal user may know the general forecast for Palawan but still need to observe the conditions near a specific launch point or research site. So ang target gap namin is not the absence of monitoring. It is the need for a more affordable instrument that can collect local observations at one clearly identified pilot site.</w:t>
       </w:r>
     </w:p>
     <w:p>
@@ -791,6 +1333,25 @@
       <w:r>
         <w:rPr/>
         <w:t>Slide 3 — Proposed Solution</w:t>
+      </w:r>
+    </w:p>
+    <w:p>
+      <w:pPr>
+        <w:pStyle w:val="BodyText"/>
+        <w:bidi w:val="0"/>
+        <w:spacing w:before="0" w:after="140"/>
+        <w:jc w:val="both"/>
+        <w:rPr/>
+      </w:pPr>
+      <w:r>
+        <w:rPr>
+          <w:rStyle w:val="Strong"/>
+        </w:rPr>
+        <w:t>What listeners should remember:</w:t>
+      </w:r>
+      <w:r>
+        <w:rPr/>
+        <w:t xml:space="preserve"> FALCON measures the water environment, saves the information locally, and shows it on a simple dashboard.</w:t>
       </w:r>
     </w:p>
     <w:p>
@@ -985,7 +1546,7 @@
           <wp:inline distT="0" distB="0" distL="0" distR="0">
             <wp:extent cx="6191250" cy="4124325"/>
             <wp:effectExtent l="0" t="0" r="0" b="0"/>
-            <wp:docPr id="1" name="Image1" descr="" title="Illustrated Project FALCON electronics and power layout"/>
+            <wp:docPr id="1" name="Image1" descr="" title=""/>
             <wp:cNvGraphicFramePr>
               <a:graphicFrameLocks xmlns:a="http://schemas.openxmlformats.org/drawingml/2006/main" noChangeAspect="1"/>
             </wp:cNvGraphicFramePr>
@@ -993,7 +1554,7 @@
               <a:graphicData uri="http://schemas.openxmlformats.org/drawingml/2006/picture">
                 <pic:pic xmlns:pic="http://schemas.openxmlformats.org/drawingml/2006/picture">
                   <pic:nvPicPr>
-                    <pic:cNvPr id="1" name="Image1" descr="" title="Illustrated Project FALCON electronics and power layout"/>
+                    <pic:cNvPr id="1" name="Image1" descr="" title=""/>
                     <pic:cNvPicPr>
                       <a:picLocks noChangeAspect="1" noChangeArrowheads="1"/>
                     </pic:cNvPicPr>
@@ -1068,7 +1629,7 @@
       </w:pPr>
       <w:r>
         <w:rPr/>
-        <w:t>Our proposed solution is Project FALCON. The buoy uses sensors for motion, water pressure, wind, GPS position, power, and system health. The ESP32 handles regular sensor acquisition and initial validation. It then sends the data to an Orange Pi Zero 3 for local storage, processing, API services, and eventually a validated prediction model. Users can view the information through a responsive dashboard on a laptop, tablet, or phone. Solar-powered din ang design, and local buffering protects the data during Internet interruptions. We also propose GPS and IMU-based logic for detecting abnormal buoy movement.</w:t>
+        <w:t>Our proposed solution is Project FALCON. The buoy uses sensors for motion, water pressure, wind, GPS position, power, and system health. The ESP32 handles regular sensor acquisition and initial validation. It then sends the data to an Orange Pi Zero 3 for local storage, processing, API services, and eventually a validated prediction model. Users can view the information through a responsive dashboard on a laptop, tablet, or phone. Solar-powered din ang design, and local buffering protects the data during Internet interruptions. In simple terms, the ESP32 is the sensor reader, while the Orange Pi is the small onboard computer. We also propose GPS and motion-based checks for detecting when the buoy moves beyond its expected area.</w:t>
       </w:r>
     </w:p>
     <w:p>
@@ -1087,6 +1648,25 @@
       <w:r>
         <w:rPr/>
         <w:t>Slide 4 — How It Works</w:t>
+      </w:r>
+    </w:p>
+    <w:p>
+      <w:pPr>
+        <w:pStyle w:val="BodyText"/>
+        <w:bidi w:val="0"/>
+        <w:spacing w:before="0" w:after="140"/>
+        <w:jc w:val="both"/>
+        <w:rPr/>
+      </w:pPr>
+      <w:r>
+        <w:rPr>
+          <w:rStyle w:val="Strong"/>
+        </w:rPr>
+        <w:t>What listeners should remember:</w:t>
+      </w:r>
+      <w:r>
+        <w:rPr/>
+        <w:t xml:space="preserve"> Sensors measure, the ESP32 collects, the Orange Pi processes, and the dashboard explains.</w:t>
       </w:r>
     </w:p>
     <w:p>
@@ -1351,7 +1931,7 @@
           <wp:inline distT="0" distB="0" distL="0" distR="0">
             <wp:extent cx="6191250" cy="3190875"/>
             <wp:effectExtent l="0" t="0" r="0" b="0"/>
-            <wp:docPr id="2" name="Image2" descr="" title="Project FALCON local-first system architecture"/>
+            <wp:docPr id="2" name="Image2" descr="" title=""/>
             <wp:cNvGraphicFramePr>
               <a:graphicFrameLocks xmlns:a="http://schemas.openxmlformats.org/drawingml/2006/main" noChangeAspect="1"/>
             </wp:cNvGraphicFramePr>
@@ -1359,7 +1939,7 @@
               <a:graphicData uri="http://schemas.openxmlformats.org/drawingml/2006/picture">
                 <pic:pic xmlns:pic="http://schemas.openxmlformats.org/drawingml/2006/picture">
                   <pic:nvPicPr>
-                    <pic:cNvPr id="2" name="Image2" descr="" title="Project FALCON local-first system architecture"/>
+                    <pic:cNvPr id="2" name="Image2" descr="" title=""/>
                     <pic:cNvPicPr>
                       <a:picLocks noChangeAspect="1" noChangeArrowheads="1"/>
                     </pic:cNvPicPr>
@@ -1452,6 +2032,25 @@
         <w:rPr>
           <w:rStyle w:val="Strong"/>
         </w:rPr>
+        <w:t>What listeners should remember:</w:t>
+      </w:r>
+      <w:r>
+        <w:rPr/>
+        <w:t xml:space="preserve"> The software concept works, but funding is still required to build, calibrate, and test the physical buoy.</w:t>
+      </w:r>
+    </w:p>
+    <w:p>
+      <w:pPr>
+        <w:pStyle w:val="BodyText"/>
+        <w:bidi w:val="0"/>
+        <w:spacing w:before="0" w:after="140"/>
+        <w:jc w:val="both"/>
+        <w:rPr/>
+      </w:pPr>
+      <w:r>
+        <w:rPr>
+          <w:rStyle w:val="Strong"/>
+        </w:rPr>
         <w:t>Already developed:</w:t>
       </w:r>
     </w:p>
@@ -1732,7 +2331,7 @@
           <wp:inline distT="0" distB="0" distL="0" distR="0">
             <wp:extent cx="6191250" cy="4733925"/>
             <wp:effectExtent l="0" t="0" r="0" b="0"/>
-            <wp:docPr id="3" name="Image3" descr="" title="Current Project FALCON dashboard overview"/>
+            <wp:docPr id="3" name="Image3" descr="" title=""/>
             <wp:cNvGraphicFramePr>
               <a:graphicFrameLocks xmlns:a="http://schemas.openxmlformats.org/drawingml/2006/main" noChangeAspect="1"/>
             </wp:cNvGraphicFramePr>
@@ -1740,7 +2339,7 @@
               <a:graphicData uri="http://schemas.openxmlformats.org/drawingml/2006/picture">
                 <pic:pic xmlns:pic="http://schemas.openxmlformats.org/drawingml/2006/picture">
                   <pic:nvPicPr>
-                    <pic:cNvPr id="3" name="Image3" descr="" title="Current Project FALCON dashboard overview"/>
+                    <pic:cNvPr id="3" name="Image3" descr="" title=""/>
                     <pic:cNvPicPr>
                       <a:picLocks noChangeAspect="1" noChangeArrowheads="1"/>
                     </pic:cNvPicPr>
@@ -1815,7 +2414,7 @@
       </w:pPr>
       <w:r>
         <w:rPr/>
-        <w:t>At the current stage, FALCON is already more than a drawing or raw idea. We have a working responsive dashboard, a sensor and fault simulator, an ESP32 firmware foundation, a telemetry protocol, a Python edge service, a local database, APIs, alerts, wiring diagrams, mechanical concepts, a bill of materials, and testing documents. The firmware and dashboard build successfully, and the automated edge tests pass. However, transparent po kami na simulated data pa ang demo. The complete physical buoy, calibrated sensors, and field-trained AI are not yet finished. Those are the main activities that the requested development support will enable.</w:t>
+        <w:t>At the current stage, FALCON is already more than a drawing or raw idea. We have a working responsive dashboard, a sensor and fault simulator, an ESP32 firmware foundation, a telemetry protocol, a Python edge service, a local database, APIs, alerts, wiring diagrams, mechanical concepts, a bill of materials, and testing documents. The firmware and dashboard build successfully, and the automated edge tests pass. However, transparent po kami na simulated data pa ang demo. The complete physical buoy, calibrated sensors, and field-trained AI are not yet finished. Those are the main activities that the requested development support will enable. The simulator is similar to a flight simulator: it lets us test the software workflow and possible fault conditions, but it does not replace actual hardware and field testing.</w:t>
       </w:r>
     </w:p>
     <w:p>
@@ -1834,6 +2433,25 @@
       <w:r>
         <w:rPr/>
         <w:t>Slide 6 — Innovation and Differentiation</w:t>
+      </w:r>
+    </w:p>
+    <w:p>
+      <w:pPr>
+        <w:pStyle w:val="BodyText"/>
+        <w:bidi w:val="0"/>
+        <w:spacing w:before="0" w:after="140"/>
+        <w:jc w:val="both"/>
+        <w:rPr/>
+      </w:pPr>
+      <w:r>
+        <w:rPr>
+          <w:rStyle w:val="Strong"/>
+        </w:rPr>
+        <w:t>What listeners should remember:</w:t>
+      </w:r>
+      <w:r>
+        <w:rPr/>
+        <w:t xml:space="preserve"> The innovation is the affordable and locally adapted combination of the system—not the invention of a new sensor or AI method.</w:t>
       </w:r>
     </w:p>
     <w:p>
@@ -2037,7 +2655,7 @@
       </w:pPr>
       <w:r>
         <w:rPr/>
-        <w:t>FALCON does not claim to invent the buoy, the sensors, or the AI algorithm. Our contribution is the validated integration and local adaptation of these technologies in one affordable and modular platform. Processing is performed locally, so cloud access is not mandatory. The sensor scope is focused to keep calibration, cost, and energy requirements manageable. The dashboard is also designed to clearly distinguish simulated, measured, estimated, and predicted values. In short, ang innovation is not based on having the most features. It is based on creating a practical, reproducible, and properly validated system for a defined local use case.</w:t>
+        <w:t>FALCON does not claim to invent the buoy, the sensors, or the AI algorithm. Our contribution is the validated integration and local adaptation of these technologies in one affordable and modular platform. Processing is performed locally, so cloud access is not mandatory. The sensor scope is focused to keep calibration, cost, and energy requirements manageable. The dashboard is also designed to clearly distinguish simulated, measured, estimated, and predicted values. In short, ang innovation is not based on having the most features. It is based on creating a practical, reproducible, and properly validated system for a defined local use case. Individual parts already exist; our research is about whether they can work together reliably, affordably, and transparently under the requirements of the selected coastal pilot.</w:t>
       </w:r>
     </w:p>
     <w:p>
@@ -2056,6 +2674,25 @@
       <w:r>
         <w:rPr/>
         <w:t>Slide 7 — Intended Beneficiaries and Value</w:t>
+      </w:r>
+    </w:p>
+    <w:p>
+      <w:pPr>
+        <w:pStyle w:val="BodyText"/>
+        <w:bidi w:val="0"/>
+        <w:spacing w:before="0" w:after="140"/>
+        <w:jc w:val="both"/>
+        <w:rPr/>
+      </w:pPr>
+      <w:r>
+        <w:rPr>
+          <w:rStyle w:val="Strong"/>
+        </w:rPr>
+        <w:t>What listeners should remember:</w:t>
+      </w:r>
+      <w:r>
+        <w:rPr/>
+        <w:t xml:space="preserve"> The first pilot should solve one verified problem for one identified coastal user before the project expands.</w:t>
       </w:r>
     </w:p>
     <w:p>
@@ -2234,6 +2871,25 @@
       <w:r>
         <w:rPr/>
         <w:t>Slide 8 — Development Plan</w:t>
+      </w:r>
+    </w:p>
+    <w:p>
+      <w:pPr>
+        <w:pStyle w:val="BodyText"/>
+        <w:bidi w:val="0"/>
+        <w:spacing w:before="0" w:after="140"/>
+        <w:jc w:val="both"/>
+        <w:rPr/>
+      </w:pPr>
+      <w:r>
+        <w:rPr>
+          <w:rStyle w:val="Strong"/>
+        </w:rPr>
+        <w:t>What listeners should remember:</w:t>
+      </w:r>
+      <w:r>
+        <w:rPr/>
+        <w:t xml:space="preserve"> The project moves in a safe order: build, calibrate, controlled test, coastal pilot, then evaluate.</w:t>
       </w:r>
     </w:p>
     <w:tbl>
@@ -2778,7 +3434,7 @@
           <wp:inline distT="0" distB="0" distL="0" distR="0">
             <wp:extent cx="6191250" cy="2876550"/>
             <wp:effectExtent l="0" t="0" r="0" b="0"/>
-            <wp:docPr id="4" name="Image4" descr="" title="Project FALCON development roadmap"/>
+            <wp:docPr id="4" name="Image4" descr="" title=""/>
             <wp:cNvGraphicFramePr>
               <a:graphicFrameLocks xmlns:a="http://schemas.openxmlformats.org/drawingml/2006/main" noChangeAspect="1"/>
             </wp:cNvGraphicFramePr>
@@ -2786,7 +3442,7 @@
               <a:graphicData uri="http://schemas.openxmlformats.org/drawingml/2006/picture">
                 <pic:pic xmlns:pic="http://schemas.openxmlformats.org/drawingml/2006/picture">
                   <pic:nvPicPr>
-                    <pic:cNvPr id="4" name="Image4" descr="" title="Project FALCON development roadmap"/>
+                    <pic:cNvPr id="4" name="Image4" descr="" title=""/>
                     <pic:cNvPicPr>
                       <a:picLocks noChangeAspect="1" noChangeArrowheads="1"/>
                     </pic:cNvPicPr>
@@ -2867,6 +3523,25 @@
         <w:t>Slide 9 — Preliminary Funding Plan</w:t>
       </w:r>
     </w:p>
+    <w:p>
+      <w:pPr>
+        <w:pStyle w:val="BodyText"/>
+        <w:bidi w:val="0"/>
+        <w:spacing w:before="0" w:after="140"/>
+        <w:jc w:val="both"/>
+        <w:rPr/>
+      </w:pPr>
+      <w:r>
+        <w:rPr>
+          <w:rStyle w:val="Strong"/>
+        </w:rPr>
+        <w:t>What listeners should remember:</w:t>
+      </w:r>
+      <w:r>
+        <w:rPr/>
+        <w:t xml:space="preserve"> The request pays for a complete development and testing process, not only for electronic sensors.</w:t>
+      </w:r>
+    </w:p>
     <w:tbl>
       <w:tblPr>
         <w:tblW w:w="6992" w:type="dxa"/>
@@ -3289,7 +3964,7 @@
           <wp:inline distT="0" distB="0" distL="0" distR="0">
             <wp:extent cx="6191250" cy="3190875"/>
             <wp:effectExtent l="0" t="0" r="0" b="0"/>
-            <wp:docPr id="5" name="Image5" descr="" title="Project FALCON preliminary funding breakdown"/>
+            <wp:docPr id="5" name="Image5" descr="" title=""/>
             <wp:cNvGraphicFramePr>
               <a:graphicFrameLocks xmlns:a="http://schemas.openxmlformats.org/drawingml/2006/main" noChangeAspect="1"/>
             </wp:cNvGraphicFramePr>
@@ -3297,7 +3972,7 @@
               <a:graphicData uri="http://schemas.openxmlformats.org/drawingml/2006/picture">
                 <pic:pic xmlns:pic="http://schemas.openxmlformats.org/drawingml/2006/picture">
                   <pic:nvPicPr>
-                    <pic:cNvPr id="5" name="Image5" descr="" title="Project FALCON preliminary funding breakdown"/>
+                    <pic:cNvPr id="5" name="Image5" descr="" title=""/>
                     <pic:cNvPicPr>
                       <a:picLocks noChangeAspect="1" noChangeArrowheads="1"/>
                     </pic:cNvPicPr>
@@ -3357,7 +4032,7 @@
       </w:pPr>
       <w:r>
         <w:rPr/>
-        <w:t>Our preliminary development request ranges from seventy-two thousand to one hundred twenty-seven thousand pesos. This is not only the cost of the sensors. It includes the embedded electronics, Orange Pi, solar and battery system, marine enclosure and structure, mooring and anchor, calibration or reference tools, fabrication, field testing, transport, spare parts, and contingency. Planning range pa lamang ito. Before formal procurement, we will replace the estimates with actual supplier quotations and separate reusable tools from the components permanently installed in the prototype.</w:t>
+        <w:t>Our preliminary development request ranges from seventy-two thousand to one hundred twenty-seven thousand pesos. This is not only the cost of the sensors. It includes the embedded electronics, Orange Pi, solar and battery system, marine enclosure and structure, mooring and anchor, calibration or reference tools, fabrication, field testing, transport, spare parts, and contingency. Planning range pa lamang ito. Before formal procurement, we will replace the estimates with actual supplier quotations and separate reusable tools from the components permanently installed in the prototype. For example, the battery and sensors remain inside the buoy, while a reference instrument used for calibration may be reused in future tests. This separation makes the final budget easier to check and justify.</w:t>
       </w:r>
     </w:p>
     <w:p>
@@ -3376,6 +4051,25 @@
       <w:r>
         <w:rPr/>
         <w:t>Slide 10 — Expected Result and Request</w:t>
+      </w:r>
+    </w:p>
+    <w:p>
+      <w:pPr>
+        <w:pStyle w:val="BodyText"/>
+        <w:bidi w:val="0"/>
+        <w:spacing w:before="0" w:after="140"/>
+        <w:jc w:val="both"/>
+        <w:rPr/>
+      </w:pPr>
+      <w:r>
+        <w:rPr>
+          <w:rStyle w:val="Strong"/>
+        </w:rPr>
+        <w:t>What listeners should remember:</w:t>
+      </w:r>
+      <w:r>
+        <w:rPr/>
+        <w:t xml:space="preserve"> The requested support will convert an existing working software concept into a tested and documented physical prototype.</w:t>
       </w:r>
     </w:p>
     <w:p>

</xml_diff>

<commit_message>
Improve thesis visuals with accurate hardware imagery
</commit_message>
<xml_diff>
--- a/THESIS DOCUMENTATION/DOST_Idea_Presentation_Package.docx
+++ b/THESIS DOCUMENTATION/DOST_Idea_Presentation_Package.docx
@@ -1560,7 +1560,7 @@
                     </pic:cNvPicPr>
                   </pic:nvPicPr>
                   <pic:blipFill>
-                    <a:blip r:link="rId2"/>
+                    <a:blip r:embed="rId2"/>
                     <a:stretch>
                       <a:fillRect/>
                     </a:stretch>
@@ -1945,7 +1945,7 @@
                     </pic:cNvPicPr>
                   </pic:nvPicPr>
                   <pic:blipFill>
-                    <a:blip r:link="rId3"/>
+                    <a:blip r:embed="rId3"/>
                     <a:stretch>
                       <a:fillRect/>
                     </a:stretch>
@@ -2345,7 +2345,7 @@
                     </pic:cNvPicPr>
                   </pic:nvPicPr>
                   <pic:blipFill>
-                    <a:blip r:link="rId4"/>
+                    <a:blip r:embed="rId4"/>
                     <a:stretch>
                       <a:fillRect/>
                     </a:stretch>
@@ -3448,7 +3448,7 @@
                     </pic:cNvPicPr>
                   </pic:nvPicPr>
                   <pic:blipFill>
-                    <a:blip r:link="rId5"/>
+                    <a:blip r:embed="rId5"/>
                     <a:stretch>
                       <a:fillRect/>
                     </a:stretch>
@@ -3978,7 +3978,7 @@
                     </pic:cNvPicPr>
                   </pic:nvPicPr>
                   <pic:blipFill>
-                    <a:blip r:link="rId6"/>
+                    <a:blip r:embed="rId6"/>
                     <a:stretch>
                       <a:fillRect/>
                     </a:stretch>

</xml_diff>